<commit_message>
Added sound and monitor pattern section
</commit_message>
<xml_diff>
--- a/Donkey Kong/Manual/TKGTestROMManual.docx
+++ b/Donkey Kong/Manual/TKGTestROMManual.docx
@@ -35,14 +35,14 @@
           <w:i/>
           <w:iCs/>
         </w:rPr>
-        <w:t>30</w:t>
+        <w:t>05 September</w:t>
       </w:r>
       <w:r>
         <w:rPr>
           <w:i/>
           <w:iCs/>
         </w:rPr>
-        <w:t xml:space="preserve"> August 2026</w:t>
+        <w:t xml:space="preserve"> 2026</w:t>
       </w:r>
     </w:p>
     <w:p>
@@ -720,6 +720,86 @@
         </w:p>
         <w:p>
           <w:pPr>
+            <w:pStyle w:val="TOC3"/>
+            <w:tabs>
+              <w:tab w:val="clear" w:pos="9972"/>
+              <w:tab w:val="right" w:pos="9971" w:leader="dot"/>
+            </w:tabs>
+            <w:rPr/>
+          </w:pPr>
+          <w:hyperlink w:anchor="__RefHeading___Toc1244_4272816106" w:tooltip="Pattern 0 – Checker Board">
+            <w:r>
+              <w:rPr>
+                <w:rStyle w:val="IndexLink"/>
+              </w:rPr>
+              <w:t>Pattern 0 – Checker Board</w:t>
+              <w:tab/>
+              <w:t>12</w:t>
+            </w:r>
+          </w:hyperlink>
+        </w:p>
+        <w:p>
+          <w:pPr>
+            <w:pStyle w:val="TOC3"/>
+            <w:tabs>
+              <w:tab w:val="clear" w:pos="9972"/>
+              <w:tab w:val="right" w:pos="9971" w:leader="dot"/>
+            </w:tabs>
+            <w:rPr/>
+          </w:pPr>
+          <w:hyperlink w:anchor="__RefHeading___Toc1246_4272816106" w:tooltip="Pattern 1 – Grid">
+            <w:r>
+              <w:rPr>
+                <w:rStyle w:val="IndexLink"/>
+              </w:rPr>
+              <w:t>Pattern 1 – Grid</w:t>
+              <w:tab/>
+              <w:t>12</w:t>
+            </w:r>
+          </w:hyperlink>
+        </w:p>
+        <w:p>
+          <w:pPr>
+            <w:pStyle w:val="TOC3"/>
+            <w:tabs>
+              <w:tab w:val="clear" w:pos="9972"/>
+              <w:tab w:val="right" w:pos="9971" w:leader="dot"/>
+            </w:tabs>
+            <w:rPr/>
+          </w:pPr>
+          <w:hyperlink w:anchor="__RefHeading___Toc1248_4272816106" w:tooltip="Pattern 2 – Block">
+            <w:r>
+              <w:rPr>
+                <w:rStyle w:val="IndexLink"/>
+              </w:rPr>
+              <w:t>Pattern 2 – Block</w:t>
+              <w:tab/>
+              <w:t>13</w:t>
+            </w:r>
+          </w:hyperlink>
+        </w:p>
+        <w:p>
+          <w:pPr>
+            <w:pStyle w:val="TOC3"/>
+            <w:tabs>
+              <w:tab w:val="clear" w:pos="9972"/>
+              <w:tab w:val="right" w:pos="9971" w:leader="dot"/>
+            </w:tabs>
+            <w:rPr/>
+          </w:pPr>
+          <w:hyperlink w:anchor="__RefHeading___Toc1250_4272816106" w:tooltip="Pattern 2 - Block">
+            <w:r>
+              <w:rPr>
+                <w:rStyle w:val="IndexLink"/>
+              </w:rPr>
+              <w:t>Pattern 2 - Block</w:t>
+              <w:tab/>
+              <w:t>13</w:t>
+            </w:r>
+          </w:hyperlink>
+        </w:p>
+        <w:p>
+          <w:pPr>
             <w:pStyle w:val="TOC2"/>
             <w:tabs>
               <w:tab w:val="clear" w:pos="9972"/>
@@ -734,7 +814,7 @@
               </w:rPr>
               <w:t>Sound Test</w:t>
               <w:tab/>
-              <w:t>12</w:t>
+              <w:t>13</w:t>
             </w:r>
           </w:hyperlink>
         </w:p>
@@ -754,7 +834,7 @@
               </w:rPr>
               <w:t>Music Test</w:t>
               <w:tab/>
-              <w:t>12</w:t>
+              <w:t>14</w:t>
             </w:r>
           </w:hyperlink>
         </w:p>
@@ -774,7 +854,7 @@
               </w:rPr>
               <w:t>Background Test</w:t>
               <w:tab/>
-              <w:t>12</w:t>
+              <w:t>14</w:t>
             </w:r>
           </w:hyperlink>
         </w:p>
@@ -794,7 +874,7 @@
               </w:rPr>
               <w:t>Sprite Test</w:t>
               <w:tab/>
-              <w:t>12</w:t>
+              <w:t>14</w:t>
             </w:r>
           </w:hyperlink>
         </w:p>
@@ -814,7 +894,7 @@
               </w:rPr>
               <w:t>Reset</w:t>
               <w:tab/>
-              <w:t>12</w:t>
+              <w:t>14</w:t>
             </w:r>
           </w:hyperlink>
         </w:p>
@@ -834,7 +914,7 @@
               </w:rPr>
               <w:t>Chapter 4: Test Architectures</w:t>
               <w:tab/>
-              <w:t>13</w:t>
+              <w:t>15</w:t>
             </w:r>
           </w:hyperlink>
         </w:p>
@@ -854,7 +934,7 @@
               </w:rPr>
               <w:t>Appendix A: Abbreviations</w:t>
               <w:tab/>
-              <w:t>14</w:t>
+              <w:t>16</w:t>
             </w:r>
           </w:hyperlink>
         </w:p>
@@ -874,7 +954,7 @@
               </w:rPr>
               <w:t>Appendix B: ICs mentioned</w:t>
               <w:tab/>
-              <w:t>15</w:t>
+              <w:t>17</w:t>
             </w:r>
           </w:hyperlink>
           <w:r>
@@ -928,7 +1008,7 @@
         <w:pStyle w:val="Heading1"/>
         <w:numPr>
           <w:ilvl w:val="0"/>
-          <w:numId w:val="2"/>
+          <w:numId w:val="1"/>
         </w:numPr>
         <w:bidi w:val="0"/>
         <w:spacing w:before="0" w:after="120"/>
@@ -948,7 +1028,7 @@
         <w:pStyle w:val="Heading2"/>
         <w:numPr>
           <w:ilvl w:val="1"/>
-          <w:numId w:val="2"/>
+          <w:numId w:val="1"/>
         </w:numPr>
         <w:bidi w:val="0"/>
         <w:ind w:hanging="0" w:start="0"/>
@@ -973,150 +1053,6 @@
       <w:r>
         <w:rPr/>
         <w:t>This test ROM will not work under every condition. Some things need to be taken into consideration:</w:t>
-      </w:r>
-    </w:p>
-    <w:p>
-      <w:pPr>
-        <w:pStyle w:val="BodyText"/>
-        <w:numPr>
-          <w:ilvl w:val="0"/>
-          <w:numId w:val="4"/>
-        </w:numPr>
-        <w:bidi w:val="0"/>
-        <w:jc w:val="start"/>
-        <w:rPr/>
-      </w:pPr>
-      <w:r>
-        <w:rPr/>
-        <w:t>All boards involved must have power, in this case +5V, +12V, and -5V must all be present and within appropriate tolerance, usually within +/- 5%.</w:t>
-      </w:r>
-    </w:p>
-    <w:p>
-      <w:pPr>
-        <w:pStyle w:val="BodyText"/>
-        <w:numPr>
-          <w:ilvl w:val="0"/>
-          <w:numId w:val="4"/>
-        </w:numPr>
-        <w:bidi w:val="0"/>
-        <w:jc w:val="start"/>
-        <w:rPr/>
-      </w:pPr>
-      <w:r>
-        <w:rPr/>
-        <w:t>Clocks must be present enough to run. The CPU runs at approximately 3MHz.</w:t>
-      </w:r>
-    </w:p>
-    <w:p>
-      <w:pPr>
-        <w:pStyle w:val="BodyText"/>
-        <w:numPr>
-          <w:ilvl w:val="0"/>
-          <w:numId w:val="4"/>
-        </w:numPr>
-        <w:bidi w:val="0"/>
-        <w:jc w:val="start"/>
-        <w:rPr/>
-      </w:pPr>
-      <w:r>
-        <w:rPr/>
-        <w:t>The reset pin and NMI pins must not be held in active. If both are always active, then the ROM will not boot.</w:t>
-      </w:r>
-    </w:p>
-    <w:p>
-      <w:pPr>
-        <w:pStyle w:val="BodyText"/>
-        <w:numPr>
-          <w:ilvl w:val="0"/>
-          <w:numId w:val="4"/>
-        </w:numPr>
-        <w:bidi w:val="0"/>
-        <w:jc w:val="start"/>
-        <w:rPr/>
-      </w:pPr>
-      <w:r>
-        <w:rPr/>
-        <w:t>The CPU must be able to access address 0x0000 to 0x0FFF. If the game does not boot it cannot access these ROMs.</w:t>
-      </w:r>
-    </w:p>
-    <w:p>
-      <w:pPr>
-        <w:pStyle w:val="BodyText"/>
-        <w:numPr>
-          <w:ilvl w:val="0"/>
-          <w:numId w:val="4"/>
-        </w:numPr>
-        <w:bidi w:val="0"/>
-        <w:jc w:val="start"/>
-        <w:rPr/>
-      </w:pPr>
-      <w:r>
-        <w:rPr/>
-        <w:t>Address and data buffers must be working, if they are not it will not be possible for the program to run.</w:t>
-      </w:r>
-    </w:p>
-    <w:p>
-      <w:pPr>
-        <w:pStyle w:val="BodyText"/>
-        <w:numPr>
-          <w:ilvl w:val="0"/>
-          <w:numId w:val="4"/>
-        </w:numPr>
-        <w:bidi w:val="0"/>
-        <w:jc w:val="start"/>
-        <w:rPr/>
-      </w:pPr>
-      <w:r>
-        <w:rPr/>
-        <w:t>Audio OR video must be working. If neither are working, the test ROM will have no way to report failures</w:t>
-      </w:r>
-    </w:p>
-    <w:p>
-      <w:pPr>
-        <w:pStyle w:val="BodyText"/>
-        <w:numPr>
-          <w:ilvl w:val="0"/>
-          <w:numId w:val="4"/>
-        </w:numPr>
-        <w:bidi w:val="0"/>
-        <w:jc w:val="start"/>
-        <w:rPr/>
-      </w:pPr>
-      <w:r>
-        <w:rPr/>
-        <w:t>The ROM socket for 5F or 5E (depending on which hardware being tested) must be in good enough condition to make proper contact.</w:t>
-      </w:r>
-    </w:p>
-    <w:p>
-      <w:pPr>
-        <w:pStyle w:val="Heading2"/>
-        <w:numPr>
-          <w:ilvl w:val="1"/>
-          <w:numId w:val="2"/>
-        </w:numPr>
-        <w:bidi w:val="0"/>
-        <w:ind w:hanging="0" w:start="0"/>
-        <w:jc w:val="start"/>
-        <w:rPr/>
-      </w:pPr>
-      <w:bookmarkStart w:id="2" w:name="__RefHeading___Toc806_1351480008"/>
-      <w:bookmarkEnd w:id="2"/>
-      <w:r>
-        <w:rPr/>
-        <w:t>Compatible Hardware</w:t>
-      </w:r>
-    </w:p>
-    <w:p>
-      <w:pPr>
-        <w:pStyle w:val="BodyText"/>
-        <w:bidi w:val="0"/>
-        <w:ind w:hanging="0" w:start="0"/>
-        <w:jc w:val="start"/>
-        <w:rPr/>
-      </w:pPr>
-      <w:r>
-        <w:rPr/>
-        <w:t>This test ROM is intended for original TKG hardware. It is compatible with the following hardware:</w:t>
       </w:r>
     </w:p>
     <w:p>
@@ -1132,55 +1068,7 @@
       </w:pPr>
       <w:r>
         <w:rPr/>
-        <w:t>Fully compatible</w:t>
-      </w:r>
-    </w:p>
-    <w:p>
-      <w:pPr>
-        <w:pStyle w:val="BodyText"/>
-        <w:numPr>
-          <w:ilvl w:val="1"/>
-          <w:numId w:val="3"/>
-        </w:numPr>
-        <w:bidi w:val="0"/>
-        <w:jc w:val="start"/>
-        <w:rPr/>
-      </w:pPr>
-      <w:r>
-        <w:rPr/>
-        <w:t>TKG2</w:t>
-      </w:r>
-    </w:p>
-    <w:p>
-      <w:pPr>
-        <w:pStyle w:val="BodyText"/>
-        <w:numPr>
-          <w:ilvl w:val="1"/>
-          <w:numId w:val="3"/>
-        </w:numPr>
-        <w:bidi w:val="0"/>
-        <w:jc w:val="start"/>
-        <w:rPr/>
-      </w:pPr>
-      <w:r>
-        <w:rPr/>
-        <w:t>TKG3</w:t>
-      </w:r>
-    </w:p>
-    <w:p>
-      <w:pPr>
-        <w:pStyle w:val="BodyText"/>
-        <w:numPr>
-          <w:ilvl w:val="1"/>
-          <w:numId w:val="3"/>
-        </w:numPr>
-        <w:bidi w:val="0"/>
-        <w:jc w:val="start"/>
-        <w:rPr/>
-      </w:pPr>
-      <w:r>
-        <w:rPr/>
-        <w:t>TKG4</w:t>
+        <w:t>All boards involved must have power, in this case +5V, +12V, and -5V must all be present and within appropriate tolerance, usually within +/- 5%.</w:t>
       </w:r>
     </w:p>
     <w:p>
@@ -1196,7 +1084,135 @@
       </w:pPr>
       <w:r>
         <w:rPr/>
-        <w:t>Partially compatible</w:t>
+        <w:t>Clocks must be present enough to run. The CPU runs at approximately 3MHz.</w:t>
+      </w:r>
+    </w:p>
+    <w:p>
+      <w:pPr>
+        <w:pStyle w:val="BodyText"/>
+        <w:numPr>
+          <w:ilvl w:val="0"/>
+          <w:numId w:val="3"/>
+        </w:numPr>
+        <w:bidi w:val="0"/>
+        <w:jc w:val="start"/>
+        <w:rPr/>
+      </w:pPr>
+      <w:r>
+        <w:rPr/>
+        <w:t>The reset pin and NMI pins must not be held in active. If both are always active, then the ROM will not boot.</w:t>
+      </w:r>
+    </w:p>
+    <w:p>
+      <w:pPr>
+        <w:pStyle w:val="BodyText"/>
+        <w:numPr>
+          <w:ilvl w:val="0"/>
+          <w:numId w:val="3"/>
+        </w:numPr>
+        <w:bidi w:val="0"/>
+        <w:jc w:val="start"/>
+        <w:rPr/>
+      </w:pPr>
+      <w:r>
+        <w:rPr/>
+        <w:t>The CPU must be able to access address 0x0000 to 0x0FFF. If the game does not boot it cannot access these ROMs.</w:t>
+      </w:r>
+    </w:p>
+    <w:p>
+      <w:pPr>
+        <w:pStyle w:val="BodyText"/>
+        <w:numPr>
+          <w:ilvl w:val="0"/>
+          <w:numId w:val="3"/>
+        </w:numPr>
+        <w:bidi w:val="0"/>
+        <w:jc w:val="start"/>
+        <w:rPr/>
+      </w:pPr>
+      <w:r>
+        <w:rPr/>
+        <w:t>Address and data buffers must be working, if they are not it will not be possible for the program to run.</w:t>
+      </w:r>
+    </w:p>
+    <w:p>
+      <w:pPr>
+        <w:pStyle w:val="BodyText"/>
+        <w:numPr>
+          <w:ilvl w:val="0"/>
+          <w:numId w:val="3"/>
+        </w:numPr>
+        <w:bidi w:val="0"/>
+        <w:jc w:val="start"/>
+        <w:rPr/>
+      </w:pPr>
+      <w:r>
+        <w:rPr/>
+        <w:t>Audio OR video must be working. If neither are working, the test ROM will have no way to report failures</w:t>
+      </w:r>
+    </w:p>
+    <w:p>
+      <w:pPr>
+        <w:pStyle w:val="BodyText"/>
+        <w:numPr>
+          <w:ilvl w:val="0"/>
+          <w:numId w:val="3"/>
+        </w:numPr>
+        <w:bidi w:val="0"/>
+        <w:jc w:val="start"/>
+        <w:rPr/>
+      </w:pPr>
+      <w:r>
+        <w:rPr/>
+        <w:t>The ROM socket for 5F or 5E (depending on which hardware being tested) must be in good enough condition to make proper contact.</w:t>
+      </w:r>
+    </w:p>
+    <w:p>
+      <w:pPr>
+        <w:pStyle w:val="Heading2"/>
+        <w:numPr>
+          <w:ilvl w:val="1"/>
+          <w:numId w:val="1"/>
+        </w:numPr>
+        <w:bidi w:val="0"/>
+        <w:ind w:hanging="0" w:start="0"/>
+        <w:jc w:val="start"/>
+        <w:rPr/>
+      </w:pPr>
+      <w:bookmarkStart w:id="2" w:name="__RefHeading___Toc806_1351480008"/>
+      <w:bookmarkEnd w:id="2"/>
+      <w:r>
+        <w:rPr/>
+        <w:t>Compatible Hardware</w:t>
+      </w:r>
+    </w:p>
+    <w:p>
+      <w:pPr>
+        <w:pStyle w:val="BodyText"/>
+        <w:bidi w:val="0"/>
+        <w:ind w:hanging="0" w:start="0"/>
+        <w:jc w:val="start"/>
+        <w:rPr/>
+      </w:pPr>
+      <w:r>
+        <w:rPr/>
+        <w:t>This test ROM is intended for original TKG hardware. It is compatible with the following hardware:</w:t>
+      </w:r>
+    </w:p>
+    <w:p>
+      <w:pPr>
+        <w:pStyle w:val="BodyText"/>
+        <w:numPr>
+          <w:ilvl w:val="0"/>
+          <w:numId w:val="2"/>
+        </w:numPr>
+        <w:bidi w:val="0"/>
+        <w:jc w:val="start"/>
+        <w:rPr/>
+      </w:pPr>
+      <w:r>
+        <w:rPr/>
+        <w:t>Fully compatible</w:t>
       </w:r>
     </w:p>
     <w:p>
@@ -1204,7 +1220,71 @@
         <w:pStyle w:val="BodyText"/>
         <w:numPr>
           <w:ilvl w:val="1"/>
-          <w:numId w:val="3"/>
+          <w:numId w:val="2"/>
+        </w:numPr>
+        <w:bidi w:val="0"/>
+        <w:jc w:val="start"/>
+        <w:rPr/>
+      </w:pPr>
+      <w:r>
+        <w:rPr/>
+        <w:t>TKG2</w:t>
+      </w:r>
+    </w:p>
+    <w:p>
+      <w:pPr>
+        <w:pStyle w:val="BodyText"/>
+        <w:numPr>
+          <w:ilvl w:val="1"/>
+          <w:numId w:val="2"/>
+        </w:numPr>
+        <w:bidi w:val="0"/>
+        <w:jc w:val="start"/>
+        <w:rPr/>
+      </w:pPr>
+      <w:r>
+        <w:rPr/>
+        <w:t>TKG3</w:t>
+      </w:r>
+    </w:p>
+    <w:p>
+      <w:pPr>
+        <w:pStyle w:val="BodyText"/>
+        <w:numPr>
+          <w:ilvl w:val="1"/>
+          <w:numId w:val="2"/>
+        </w:numPr>
+        <w:bidi w:val="0"/>
+        <w:jc w:val="start"/>
+        <w:rPr/>
+      </w:pPr>
+      <w:r>
+        <w:rPr/>
+        <w:t>TKG4</w:t>
+      </w:r>
+    </w:p>
+    <w:p>
+      <w:pPr>
+        <w:pStyle w:val="BodyText"/>
+        <w:numPr>
+          <w:ilvl w:val="0"/>
+          <w:numId w:val="2"/>
+        </w:numPr>
+        <w:bidi w:val="0"/>
+        <w:jc w:val="start"/>
+        <w:rPr/>
+      </w:pPr>
+      <w:r>
+        <w:rPr/>
+        <w:t>Partially compatible</w:t>
+      </w:r>
+    </w:p>
+    <w:p>
+      <w:pPr>
+        <w:pStyle w:val="BodyText"/>
+        <w:numPr>
+          <w:ilvl w:val="1"/>
+          <w:numId w:val="2"/>
         </w:numPr>
         <w:bidi w:val="0"/>
         <w:jc w:val="start"/>
@@ -1268,7 +1348,7 @@
         <w:pStyle w:val="BodyText"/>
         <w:numPr>
           <w:ilvl w:val="1"/>
-          <w:numId w:val="2"/>
+          <w:numId w:val="1"/>
         </w:numPr>
         <w:rPr/>
       </w:pPr>
@@ -1282,7 +1362,7 @@
         <w:pStyle w:val="BodyText"/>
         <w:numPr>
           <w:ilvl w:val="1"/>
-          <w:numId w:val="2"/>
+          <w:numId w:val="1"/>
         </w:numPr>
         <w:rPr/>
       </w:pPr>
@@ -1408,7 +1488,7 @@
         <w:pStyle w:val="Heading1"/>
         <w:numPr>
           <w:ilvl w:val="0"/>
-          <w:numId w:val="2"/>
+          <w:numId w:val="1"/>
         </w:numPr>
         <w:bidi w:val="0"/>
         <w:spacing w:before="0" w:after="120"/>
@@ -1428,7 +1508,7 @@
         <w:pStyle w:val="Heading2"/>
         <w:numPr>
           <w:ilvl w:val="1"/>
-          <w:numId w:val="2"/>
+          <w:numId w:val="1"/>
         </w:numPr>
         <w:bidi w:val="0"/>
         <w:ind w:hanging="0" w:start="0"/>
@@ -1471,21 +1551,7 @@
           <w:i/>
           <w:iCs/>
         </w:rPr>
-        <w:t xml:space="preserve">Please note: When the RAM test is running you may say “garbage” on the screen. The reason for this is that </w:t>
-      </w:r>
-      <w:r>
-        <w:rPr>
-          <w:i/>
-          <w:iCs/>
-        </w:rPr>
-        <w:t xml:space="preserve">video and sprite RAM is tested. Whenever data is written to those areas it will </w:t>
-      </w:r>
-      <w:r>
-        <w:rPr>
-          <w:i/>
-          <w:iCs/>
-        </w:rPr>
-        <w:t>appear on the screen automatically. There is no video blanking/supression that can be controlled via software.</w:t>
+        <w:t>Please note: When the RAM test is running you may say “garbage” on the screen. The reason for this is that video and sprite RAM is tested. Whenever data is written to those areas it will appear on the screen automatically. There is no video blanking/supression that can be controlled via software.</w:t>
       </w:r>
     </w:p>
     <w:p>
@@ -1504,11 +1570,7 @@
       <w:bookmarkEnd w:id="7"/>
       <w:r>
         <w:rPr/>
-        <w:t xml:space="preserve">RAM </w:t>
-      </w:r>
-      <w:r>
-        <w:rPr/>
-        <w:t>IC Tests</w:t>
+        <w:t>RAM IC Tests</w:t>
       </w:r>
     </w:p>
     <w:p>
@@ -1525,15 +1587,7 @@
       </w:pPr>
       <w:r>
         <w:rPr/>
-        <w:t xml:space="preserve">There are two RAM tests that tests the ICs themselves. The first test fills all of RAM with a multiple of $11. It increments the RAM each pass by $11 until it does $FF. It works by filling the RAM first and then checking it after. By that time, it has had enough time for the RAM to become flakey in theory and then test each individual bit. If an error is detected, it sets a corresponding bit to the test results register. </w:t>
-      </w:r>
-      <w:r>
-        <w:rPr/>
-        <w:t xml:space="preserve">In the event there is a RAM failure, eleven tones will play. Refere to the “RAM Failure Tones” section to identify which RAM failed. </w:t>
-      </w:r>
-      <w:r>
-        <w:rPr/>
-        <w:t>Also refer to sections following it to see to which RAM IC it corresponds to.</w:t>
+        <w:t>There are two RAM tests that tests the ICs themselves. The first test fills all of RAM with a multiple of $11. It increments the RAM each pass by $11 until it does $FF. It works by filling the RAM first and then checking it after. By that time, it has had enough time for the RAM to become flakey in theory and then test each individual bit. If an error is detected, it sets a corresponding bit to the test results register. In the event there is a RAM failure, eleven tones will play. Refere to the “RAM Failure Tones” section to identify which RAM failed. Also refer to sections following it to see to which RAM IC it corresponds to.</w:t>
       </w:r>
     </w:p>
     <w:p>
@@ -1541,7 +1595,7 @@
         <w:pStyle w:val="Heading3"/>
         <w:numPr>
           <w:ilvl w:val="2"/>
-          <w:numId w:val="2"/>
+          <w:numId w:val="1"/>
         </w:numPr>
         <w:bidi w:val="0"/>
         <w:ind w:hanging="0" w:start="0"/>
@@ -1552,11 +1606,7 @@
       <w:bookmarkEnd w:id="8"/>
       <w:r>
         <w:rPr/>
-        <w:t>RAM Bank Tes</w:t>
-      </w:r>
-      <w:r>
-        <w:rPr/>
-        <w:t>t</w:t>
+        <w:t>RAM Bank Test</w:t>
       </w:r>
     </w:p>
     <w:p>
@@ -1569,11 +1619,7 @@
       </w:pPr>
       <w:r>
         <w:rPr/>
-        <w:t xml:space="preserve">The RAM bank test has to be handled differently. It is possible for all of the RAM tests to pass but still have a failure in addressing. One scenario is only the RAM0 bank is able to be selected. It could still report pass as only one bank is tested at a time. The solution for this is to write a different value to each bank and read it back. If the values are overwritten then there is an addressing/bank issue. The bank test will only process results if all RAM tests are reported as “good”. If there is a RAM failure before, it will print a result of “N.A.” as it would be impossible for it to pass this way. In the event that a bank failure is reported, </w:t>
-      </w:r>
-      <w:r>
-        <w:rPr/>
-        <w:t>the 11</w:t>
+        <w:t>The RAM bank test has to be handled differently. It is possible for all of the RAM tests to pass but still have a failure in addressing. One scenario is only the RAM0 bank is able to be selected. It could still report pass as only one bank is tested at a time. The solution for this is to write a different value to each bank and read it back. If the values are overwritten then there is an addressing/bank issue. The bank test will only process results if all RAM tests are reported as “good”. If there is a RAM failure before, it will print a result of “N.A.” as it would be impossible for it to pass this way. In the event that a bank failure is reported, the 11</w:t>
       </w:r>
       <w:r>
         <w:rPr>
@@ -1591,7 +1637,7 @@
         <w:pStyle w:val="Heading3"/>
         <w:numPr>
           <w:ilvl w:val="2"/>
-          <w:numId w:val="2"/>
+          <w:numId w:val="1"/>
         </w:numPr>
         <w:rPr/>
       </w:pPr>
@@ -1633,51 +1679,7 @@
       </w:pPr>
       <w:r>
         <w:rPr/>
-        <w:t xml:space="preserve">Sprite </w:t>
-      </w:r>
-      <w:r>
-        <w:rPr/>
-        <w:t xml:space="preserve">and video </w:t>
-      </w:r>
-      <w:r>
-        <w:rPr/>
-        <w:t xml:space="preserve">RAM is a bit different. In the schematics </w:t>
-      </w:r>
-      <w:r>
-        <w:rPr/>
-        <w:t>sprite RAM</w:t>
-      </w:r>
-      <w:r>
-        <w:rPr/>
-        <w:t xml:space="preserve"> is labeled “Obj RAM” or “Object RAM”. </w:t>
-      </w:r>
-      <w:r>
-        <w:rPr/>
-        <w:t xml:space="preserve">Video RAM is just labeled as VRAM. The write signals for both of these RAMs are generated by the 74LS138 at 2C. The read signals for these RAMs are generated by the 74LS138 at 2B. Part of the selection is done by the 74LS138 at 4D. The 74LS139 at 2A and 74LS32 at 1A </w:t>
-      </w:r>
-      <w:r>
-        <w:rPr/>
-        <w:t>is involved with the DMA side of the sprite RAM, making the “ObjRq” or “Object Request” signal. TKG hardware is capable of transfering data</w:t>
-      </w:r>
-      <w:r>
-        <w:rPr/>
-        <w:t xml:space="preserve">. </w:t>
-      </w:r>
-      <w:r>
-        <w:rPr/>
-        <w:t>This ObjRq is in part responsible for that.</w:t>
-      </w:r>
-      <w:r>
-        <w:rPr/>
-        <w:t xml:space="preserve"> </w:t>
-      </w:r>
-      <w:r>
-        <w:rPr/>
-        <w:t xml:space="preserve">These are for the most part all of </w:t>
-      </w:r>
-      <w:r>
-        <w:rPr/>
-        <w:t>what is involved with the sprite and video RAM on the CPU side.</w:t>
+        <w:t>Sprite and video RAM is a bit different. In the schematics sprite RAM is labeled “Obj RAM” or “Object RAM”. Video RAM is just labeled as VRAM. The write signals for both of these RAMs are generated by the 74LS138 at 2C. The read signals for these RAMs are generated by the 74LS138 at 2B. Part of the selection is done by the 74LS138 at 4D. The 74LS139 at 2A and 74LS32 at 1A is involved with the DMA side of the sprite RAM, making the “ObjRq” or “Object Request” signal. TKG hardware is capable of transfering data. This ObjRq is in part responsible for that. These are for the most part all of what is involved with the sprite and video RAM on the CPU side.</w:t>
       </w:r>
     </w:p>
     <w:p>
@@ -1694,15 +1696,7 @@
       </w:pPr>
       <w:r>
         <w:rPr/>
-        <w:t xml:space="preserve">The video PCB side is adds an extra layer of complexity as the sprite and video RAM data has to be utilized by the rest of the video board. It does this by switching between video counter signals and CPU address lines depending on the situation. Whenever the CPU needs to access sprite or video RAM, the appropriate 74LS157s switch the address lines from the video counters to the address lines. After that switch the appropriate 74LS245 buffer turns on and gives access to the </w:t>
-      </w:r>
-      <w:r>
-        <w:rPr/>
-        <w:t>sprite or video</w:t>
-      </w:r>
-      <w:r>
-        <w:rPr/>
-        <w:t xml:space="preserve"> RAM data lines.</w:t>
+        <w:t>The video PCB side is adds an extra layer of complexity as the sprite and video RAM data has to be utilized by the rest of the video board. It does this by switching between video counter signals and CPU address lines depending on the situation. Whenever the CPU needs to access sprite or video RAM, the appropriate 74LS157s switch the address lines from the video counters to the address lines. After that switch the appropriate 74LS245 buffer turns on and gives access to the sprite or video RAM data lines.</w:t>
       </w:r>
     </w:p>
     <w:p>
@@ -1727,7 +1721,7 @@
         <w:pStyle w:val="Heading3"/>
         <w:numPr>
           <w:ilvl w:val="2"/>
-          <w:numId w:val="2"/>
+          <w:numId w:val="1"/>
         </w:numPr>
         <w:ind w:hanging="0" w:start="0"/>
         <w:rPr/>
@@ -1753,11 +1747,7 @@
       </w:pPr>
       <w:r>
         <w:rPr/>
-        <w:t xml:space="preserve">In the event there is a RAM error, it will play eleven tones: </w:t>
-      </w:r>
-      <w:r>
-        <w:rPr/>
-        <w:t>jump sound indicates a pass, crash indicates a failure. This is reliant on the discretely generated sounds jump and crash being functional. If they are not working it may not sound correct.</w:t>
+        <w:t>In the event there is a RAM error, it will play eleven tones: jump sound indicates a pass, crash indicates a failure. This is reliant on the discretely generated sounds jump and crash being functional. If they are not working it may not sound correct.</w:t>
       </w:r>
     </w:p>
     <w:tbl>
@@ -2301,7 +2291,7 @@
         <w:pStyle w:val="Heading3"/>
         <w:numPr>
           <w:ilvl w:val="2"/>
-          <w:numId w:val="2"/>
+          <w:numId w:val="1"/>
         </w:numPr>
         <w:bidi w:val="0"/>
         <w:ind w:hanging="0" w:start="0"/>
@@ -2333,9 +2323,9 @@
         <w:gridCol w:w="1915"/>
         <w:gridCol w:w="610"/>
         <w:gridCol w:w="1520"/>
-        <w:gridCol w:w="703"/>
+        <w:gridCol w:w="702"/>
         <w:gridCol w:w="1944"/>
-        <w:gridCol w:w="1939"/>
+        <w:gridCol w:w="1940"/>
       </w:tblGrid>
       <w:tr>
         <w:trPr>
@@ -2455,7 +2445,7 @@
         </w:tc>
         <w:tc>
           <w:tcPr>
-            <w:tcW w:w="703" w:type="dxa"/>
+            <w:tcW w:w="702" w:type="dxa"/>
             <w:tcBorders>
               <w:top w:val="single" w:sz="18" w:space="0" w:color="000000"/>
               <w:start w:val="single" w:sz="2" w:space="0" w:color="000000"/>
@@ -2511,7 +2501,7 @@
         </w:tc>
         <w:tc>
           <w:tcPr>
-            <w:tcW w:w="1939" w:type="dxa"/>
+            <w:tcW w:w="1940" w:type="dxa"/>
             <w:tcBorders>
               <w:top w:val="single" w:sz="18" w:space="0" w:color="000000"/>
               <w:start w:val="single" w:sz="2" w:space="0" w:color="000000"/>
@@ -2635,7 +2625,7 @@
         </w:tc>
         <w:tc>
           <w:tcPr>
-            <w:tcW w:w="703" w:type="dxa"/>
+            <w:tcW w:w="702" w:type="dxa"/>
             <w:tcBorders>
               <w:start w:val="single" w:sz="2" w:space="0" w:color="000000"/>
               <w:bottom w:val="single" w:sz="2" w:space="0" w:color="000000"/>
@@ -2681,7 +2671,7 @@
         </w:tc>
         <w:tc>
           <w:tcPr>
-            <w:tcW w:w="1939" w:type="dxa"/>
+            <w:tcW w:w="1940" w:type="dxa"/>
             <w:tcBorders>
               <w:start w:val="single" w:sz="2" w:space="0" w:color="000000"/>
               <w:bottom w:val="single" w:sz="2" w:space="0" w:color="000000"/>
@@ -2800,7 +2790,7 @@
         </w:tc>
         <w:tc>
           <w:tcPr>
-            <w:tcW w:w="703" w:type="dxa"/>
+            <w:tcW w:w="702" w:type="dxa"/>
             <w:tcBorders>
               <w:start w:val="single" w:sz="2" w:space="0" w:color="000000"/>
               <w:bottom w:val="single" w:sz="2" w:space="0" w:color="000000"/>
@@ -2846,7 +2836,7 @@
         </w:tc>
         <w:tc>
           <w:tcPr>
-            <w:tcW w:w="1939" w:type="dxa"/>
+            <w:tcW w:w="1940" w:type="dxa"/>
             <w:tcBorders>
               <w:start w:val="single" w:sz="2" w:space="0" w:color="000000"/>
               <w:bottom w:val="single" w:sz="2" w:space="0" w:color="000000"/>
@@ -2965,7 +2955,7 @@
         </w:tc>
         <w:tc>
           <w:tcPr>
-            <w:tcW w:w="703" w:type="dxa"/>
+            <w:tcW w:w="702" w:type="dxa"/>
             <w:tcBorders>
               <w:start w:val="single" w:sz="2" w:space="0" w:color="000000"/>
               <w:bottom w:val="single" w:sz="2" w:space="0" w:color="000000"/>
@@ -3011,7 +3001,7 @@
         </w:tc>
         <w:tc>
           <w:tcPr>
-            <w:tcW w:w="1939" w:type="dxa"/>
+            <w:tcW w:w="1940" w:type="dxa"/>
             <w:tcBorders>
               <w:start w:val="single" w:sz="2" w:space="0" w:color="000000"/>
               <w:bottom w:val="single" w:sz="2" w:space="0" w:color="000000"/>
@@ -3130,7 +3120,7 @@
         </w:tc>
         <w:tc>
           <w:tcPr>
-            <w:tcW w:w="703" w:type="dxa"/>
+            <w:tcW w:w="702" w:type="dxa"/>
             <w:tcBorders>
               <w:start w:val="single" w:sz="2" w:space="0" w:color="000000"/>
               <w:bottom w:val="single" w:sz="2" w:space="0" w:color="000000"/>
@@ -3176,7 +3166,7 @@
         </w:tc>
         <w:tc>
           <w:tcPr>
-            <w:tcW w:w="1939" w:type="dxa"/>
+            <w:tcW w:w="1940" w:type="dxa"/>
             <w:tcBorders>
               <w:start w:val="single" w:sz="2" w:space="0" w:color="000000"/>
               <w:bottom w:val="single" w:sz="2" w:space="0" w:color="000000"/>
@@ -3295,7 +3285,7 @@
         </w:tc>
         <w:tc>
           <w:tcPr>
-            <w:tcW w:w="703" w:type="dxa"/>
+            <w:tcW w:w="702" w:type="dxa"/>
             <w:tcBorders>
               <w:start w:val="single" w:sz="2" w:space="0" w:color="000000"/>
               <w:bottom w:val="single" w:sz="18" w:space="0" w:color="000000"/>
@@ -3341,7 +3331,7 @@
         </w:tc>
         <w:tc>
           <w:tcPr>
-            <w:tcW w:w="1939" w:type="dxa"/>
+            <w:tcW w:w="1940" w:type="dxa"/>
             <w:tcBorders>
               <w:start w:val="single" w:sz="2" w:space="0" w:color="000000"/>
               <w:bottom w:val="single" w:sz="18" w:space="0" w:color="000000"/>
@@ -3380,7 +3370,7 @@
         <w:pStyle w:val="Heading3"/>
         <w:numPr>
           <w:ilvl w:val="2"/>
-          <w:numId w:val="2"/>
+          <w:numId w:val="1"/>
         </w:numPr>
         <w:bidi w:val="0"/>
         <w:ind w:hanging="0" w:start="0"/>
@@ -3412,9 +3402,9 @@
         <w:gridCol w:w="1915"/>
         <w:gridCol w:w="610"/>
         <w:gridCol w:w="1520"/>
-        <w:gridCol w:w="703"/>
+        <w:gridCol w:w="702"/>
         <w:gridCol w:w="1944"/>
-        <w:gridCol w:w="1939"/>
+        <w:gridCol w:w="1940"/>
       </w:tblGrid>
       <w:tr>
         <w:trPr>
@@ -3534,7 +3524,7 @@
         </w:tc>
         <w:tc>
           <w:tcPr>
-            <w:tcW w:w="703" w:type="dxa"/>
+            <w:tcW w:w="702" w:type="dxa"/>
             <w:tcBorders>
               <w:top w:val="single" w:sz="18" w:space="0" w:color="000000"/>
               <w:start w:val="single" w:sz="2" w:space="0" w:color="000000"/>
@@ -3590,7 +3580,7 @@
         </w:tc>
         <w:tc>
           <w:tcPr>
-            <w:tcW w:w="1939" w:type="dxa"/>
+            <w:tcW w:w="1940" w:type="dxa"/>
             <w:tcBorders>
               <w:top w:val="single" w:sz="18" w:space="0" w:color="000000"/>
               <w:start w:val="single" w:sz="2" w:space="0" w:color="000000"/>
@@ -3714,7 +3704,7 @@
         </w:tc>
         <w:tc>
           <w:tcPr>
-            <w:tcW w:w="703" w:type="dxa"/>
+            <w:tcW w:w="702" w:type="dxa"/>
             <w:tcBorders>
               <w:start w:val="single" w:sz="2" w:space="0" w:color="000000"/>
               <w:bottom w:val="single" w:sz="2" w:space="0" w:color="000000"/>
@@ -3760,7 +3750,7 @@
         </w:tc>
         <w:tc>
           <w:tcPr>
-            <w:tcW w:w="1939" w:type="dxa"/>
+            <w:tcW w:w="1940" w:type="dxa"/>
             <w:tcBorders>
               <w:start w:val="single" w:sz="2" w:space="0" w:color="000000"/>
               <w:bottom w:val="single" w:sz="2" w:space="0" w:color="000000"/>
@@ -3879,7 +3869,7 @@
         </w:tc>
         <w:tc>
           <w:tcPr>
-            <w:tcW w:w="703" w:type="dxa"/>
+            <w:tcW w:w="702" w:type="dxa"/>
             <w:tcBorders>
               <w:start w:val="single" w:sz="2" w:space="0" w:color="000000"/>
               <w:bottom w:val="single" w:sz="2" w:space="0" w:color="000000"/>
@@ -3925,7 +3915,7 @@
         </w:tc>
         <w:tc>
           <w:tcPr>
-            <w:tcW w:w="1939" w:type="dxa"/>
+            <w:tcW w:w="1940" w:type="dxa"/>
             <w:tcBorders>
               <w:start w:val="single" w:sz="2" w:space="0" w:color="000000"/>
               <w:bottom w:val="single" w:sz="2" w:space="0" w:color="000000"/>
@@ -4044,7 +4034,7 @@
         </w:tc>
         <w:tc>
           <w:tcPr>
-            <w:tcW w:w="703" w:type="dxa"/>
+            <w:tcW w:w="702" w:type="dxa"/>
             <w:tcBorders>
               <w:start w:val="single" w:sz="2" w:space="0" w:color="000000"/>
               <w:bottom w:val="single" w:sz="2" w:space="0" w:color="000000"/>
@@ -4090,7 +4080,7 @@
         </w:tc>
         <w:tc>
           <w:tcPr>
-            <w:tcW w:w="1939" w:type="dxa"/>
+            <w:tcW w:w="1940" w:type="dxa"/>
             <w:tcBorders>
               <w:start w:val="single" w:sz="2" w:space="0" w:color="000000"/>
               <w:bottom w:val="single" w:sz="2" w:space="0" w:color="000000"/>
@@ -4209,7 +4199,7 @@
         </w:tc>
         <w:tc>
           <w:tcPr>
-            <w:tcW w:w="703" w:type="dxa"/>
+            <w:tcW w:w="702" w:type="dxa"/>
             <w:tcBorders>
               <w:start w:val="single" w:sz="2" w:space="0" w:color="000000"/>
               <w:bottom w:val="single" w:sz="2" w:space="0" w:color="000000"/>
@@ -4255,7 +4245,7 @@
         </w:tc>
         <w:tc>
           <w:tcPr>
-            <w:tcW w:w="1939" w:type="dxa"/>
+            <w:tcW w:w="1940" w:type="dxa"/>
             <w:tcBorders>
               <w:start w:val="single" w:sz="2" w:space="0" w:color="000000"/>
               <w:bottom w:val="single" w:sz="2" w:space="0" w:color="000000"/>
@@ -4374,7 +4364,7 @@
         </w:tc>
         <w:tc>
           <w:tcPr>
-            <w:tcW w:w="703" w:type="dxa"/>
+            <w:tcW w:w="702" w:type="dxa"/>
             <w:tcBorders>
               <w:start w:val="single" w:sz="2" w:space="0" w:color="000000"/>
               <w:bottom w:val="single" w:sz="18" w:space="0" w:color="000000"/>
@@ -4420,7 +4410,7 @@
         </w:tc>
         <w:tc>
           <w:tcPr>
-            <w:tcW w:w="1939" w:type="dxa"/>
+            <w:tcW w:w="1940" w:type="dxa"/>
             <w:tcBorders>
               <w:start w:val="single" w:sz="2" w:space="0" w:color="000000"/>
               <w:bottom w:val="single" w:sz="18" w:space="0" w:color="000000"/>
@@ -4496,9 +4486,9 @@
         <w:gridCol w:w="1915"/>
         <w:gridCol w:w="610"/>
         <w:gridCol w:w="1520"/>
-        <w:gridCol w:w="703"/>
+        <w:gridCol w:w="702"/>
         <w:gridCol w:w="1944"/>
-        <w:gridCol w:w="1939"/>
+        <w:gridCol w:w="1940"/>
       </w:tblGrid>
       <w:tr>
         <w:trPr>
@@ -4618,7 +4608,7 @@
         </w:tc>
         <w:tc>
           <w:tcPr>
-            <w:tcW w:w="703" w:type="dxa"/>
+            <w:tcW w:w="702" w:type="dxa"/>
             <w:tcBorders>
               <w:top w:val="single" w:sz="18" w:space="0" w:color="000000"/>
               <w:start w:val="single" w:sz="2" w:space="0" w:color="000000"/>
@@ -4674,7 +4664,7 @@
         </w:tc>
         <w:tc>
           <w:tcPr>
-            <w:tcW w:w="1939" w:type="dxa"/>
+            <w:tcW w:w="1940" w:type="dxa"/>
             <w:tcBorders>
               <w:top w:val="single" w:sz="18" w:space="0" w:color="000000"/>
               <w:start w:val="single" w:sz="2" w:space="0" w:color="000000"/>
@@ -4798,7 +4788,7 @@
         </w:tc>
         <w:tc>
           <w:tcPr>
-            <w:tcW w:w="703" w:type="dxa"/>
+            <w:tcW w:w="702" w:type="dxa"/>
             <w:tcBorders>
               <w:start w:val="single" w:sz="2" w:space="0" w:color="000000"/>
               <w:bottom w:val="single" w:sz="2" w:space="0" w:color="000000"/>
@@ -4844,7 +4834,7 @@
         </w:tc>
         <w:tc>
           <w:tcPr>
-            <w:tcW w:w="1939" w:type="dxa"/>
+            <w:tcW w:w="1940" w:type="dxa"/>
             <w:tcBorders>
               <w:start w:val="single" w:sz="2" w:space="0" w:color="000000"/>
               <w:bottom w:val="single" w:sz="2" w:space="0" w:color="000000"/>
@@ -4963,7 +4953,7 @@
         </w:tc>
         <w:tc>
           <w:tcPr>
-            <w:tcW w:w="703" w:type="dxa"/>
+            <w:tcW w:w="702" w:type="dxa"/>
             <w:tcBorders>
               <w:start w:val="single" w:sz="2" w:space="0" w:color="000000"/>
               <w:bottom w:val="single" w:sz="2" w:space="0" w:color="000000"/>
@@ -5009,7 +4999,7 @@
         </w:tc>
         <w:tc>
           <w:tcPr>
-            <w:tcW w:w="1939" w:type="dxa"/>
+            <w:tcW w:w="1940" w:type="dxa"/>
             <w:tcBorders>
               <w:start w:val="single" w:sz="2" w:space="0" w:color="000000"/>
               <w:bottom w:val="single" w:sz="2" w:space="0" w:color="000000"/>
@@ -5128,7 +5118,7 @@
         </w:tc>
         <w:tc>
           <w:tcPr>
-            <w:tcW w:w="703" w:type="dxa"/>
+            <w:tcW w:w="702" w:type="dxa"/>
             <w:tcBorders>
               <w:start w:val="single" w:sz="2" w:space="0" w:color="000000"/>
               <w:bottom w:val="single" w:sz="2" w:space="0" w:color="000000"/>
@@ -5174,7 +5164,7 @@
         </w:tc>
         <w:tc>
           <w:tcPr>
-            <w:tcW w:w="1939" w:type="dxa"/>
+            <w:tcW w:w="1940" w:type="dxa"/>
             <w:tcBorders>
               <w:start w:val="single" w:sz="2" w:space="0" w:color="000000"/>
               <w:bottom w:val="single" w:sz="2" w:space="0" w:color="000000"/>
@@ -5293,7 +5283,7 @@
         </w:tc>
         <w:tc>
           <w:tcPr>
-            <w:tcW w:w="703" w:type="dxa"/>
+            <w:tcW w:w="702" w:type="dxa"/>
             <w:tcBorders>
               <w:start w:val="single" w:sz="2" w:space="0" w:color="000000"/>
               <w:bottom w:val="single" w:sz="2" w:space="0" w:color="000000"/>
@@ -5339,7 +5329,7 @@
         </w:tc>
         <w:tc>
           <w:tcPr>
-            <w:tcW w:w="1939" w:type="dxa"/>
+            <w:tcW w:w="1940" w:type="dxa"/>
             <w:tcBorders>
               <w:start w:val="single" w:sz="2" w:space="0" w:color="000000"/>
               <w:bottom w:val="single" w:sz="2" w:space="0" w:color="000000"/>
@@ -5458,7 +5448,7 @@
         </w:tc>
         <w:tc>
           <w:tcPr>
-            <w:tcW w:w="703" w:type="dxa"/>
+            <w:tcW w:w="702" w:type="dxa"/>
             <w:tcBorders>
               <w:start w:val="single" w:sz="2" w:space="0" w:color="000000"/>
               <w:bottom w:val="single" w:sz="18" w:space="0" w:color="000000"/>
@@ -5504,7 +5494,7 @@
         </w:tc>
         <w:tc>
           <w:tcPr>
-            <w:tcW w:w="1939" w:type="dxa"/>
+            <w:tcW w:w="1940" w:type="dxa"/>
             <w:tcBorders>
               <w:start w:val="single" w:sz="2" w:space="0" w:color="000000"/>
               <w:bottom w:val="single" w:sz="18" w:space="0" w:color="000000"/>
@@ -5563,7 +5553,7 @@
         <w:pStyle w:val="Heading3"/>
         <w:numPr>
           <w:ilvl w:val="2"/>
-          <w:numId w:val="2"/>
+          <w:numId w:val="1"/>
         </w:numPr>
         <w:bidi w:val="0"/>
         <w:ind w:hanging="0" w:start="0"/>
@@ -5646,7 +5636,7 @@
         <w:pStyle w:val="Heading3"/>
         <w:numPr>
           <w:ilvl w:val="2"/>
-          <w:numId w:val="2"/>
+          <w:numId w:val="1"/>
         </w:numPr>
         <w:bidi w:val="0"/>
         <w:ind w:hanging="0" w:start="0"/>
@@ -5662,7 +5652,7 @@
         <w:pStyle w:val="Heading3"/>
         <w:numPr>
           <w:ilvl w:val="2"/>
-          <w:numId w:val="2"/>
+          <w:numId w:val="1"/>
         </w:numPr>
         <w:ind w:hanging="0" w:start="0"/>
         <w:rPr/>
@@ -5676,7 +5666,7 @@
         <w:pStyle w:val="Heading3"/>
         <w:numPr>
           <w:ilvl w:val="2"/>
-          <w:numId w:val="2"/>
+          <w:numId w:val="1"/>
         </w:numPr>
         <w:ind w:hanging="0" w:start="0"/>
         <w:rPr/>
@@ -5702,18 +5692,18 @@
         </w:tblCellMar>
       </w:tblPr>
       <w:tblGrid>
+        <w:gridCol w:w="1420"/>
+        <w:gridCol w:w="1429"/>
+        <w:gridCol w:w="1424"/>
         <w:gridCol w:w="1421"/>
-        <w:gridCol w:w="1428"/>
-        <w:gridCol w:w="1424"/>
-        <w:gridCol w:w="1422"/>
-        <w:gridCol w:w="2253"/>
+        <w:gridCol w:w="2254"/>
         <w:gridCol w:w="1987"/>
       </w:tblGrid>
       <w:tr>
         <w:trPr/>
         <w:tc>
           <w:tcPr>
-            <w:tcW w:w="1421" w:type="dxa"/>
+            <w:tcW w:w="1420" w:type="dxa"/>
             <w:tcBorders>
               <w:top w:val="single" w:sz="18" w:space="0" w:color="000000"/>
               <w:start w:val="single" w:sz="18" w:space="0" w:color="000000"/>
@@ -5735,7 +5725,7 @@
         </w:tc>
         <w:tc>
           <w:tcPr>
-            <w:tcW w:w="1428" w:type="dxa"/>
+            <w:tcW w:w="1429" w:type="dxa"/>
             <w:tcBorders>
               <w:top w:val="single" w:sz="18" w:space="0" w:color="000000"/>
               <w:start w:val="single" w:sz="2" w:space="0" w:color="000000"/>
@@ -5779,7 +5769,7 @@
         </w:tc>
         <w:tc>
           <w:tcPr>
-            <w:tcW w:w="1422" w:type="dxa"/>
+            <w:tcW w:w="1421" w:type="dxa"/>
             <w:tcBorders>
               <w:top w:val="single" w:sz="18" w:space="0" w:color="000000"/>
               <w:start w:val="single" w:sz="2" w:space="0" w:color="000000"/>
@@ -5801,7 +5791,7 @@
         </w:tc>
         <w:tc>
           <w:tcPr>
-            <w:tcW w:w="2253" w:type="dxa"/>
+            <w:tcW w:w="2254" w:type="dxa"/>
             <w:tcBorders>
               <w:top w:val="single" w:sz="18" w:space="0" w:color="000000"/>
               <w:start w:val="single" w:sz="2" w:space="0" w:color="000000"/>
@@ -5849,9 +5839,72 @@
         <w:trPr/>
         <w:tc>
           <w:tcPr>
+            <w:tcW w:w="1420" w:type="dxa"/>
+            <w:tcBorders>
+              <w:start w:val="single" w:sz="18" w:space="0" w:color="000000"/>
+              <w:bottom w:val="single" w:sz="2" w:space="0" w:color="000000"/>
+            </w:tcBorders>
+          </w:tcPr>
+          <w:p>
+            <w:pPr>
+              <w:pStyle w:val="TableContents"/>
+              <w:bidi w:val="0"/>
+              <w:jc w:val="start"/>
+              <w:rPr/>
+            </w:pPr>
+            <w:r>
+              <w:rPr/>
+              <w:t>ROM 0</w:t>
+            </w:r>
+          </w:p>
+        </w:tc>
+        <w:tc>
+          <w:tcPr>
+            <w:tcW w:w="1429" w:type="dxa"/>
+            <w:tcBorders>
+              <w:start w:val="single" w:sz="2" w:space="0" w:color="000000"/>
+              <w:bottom w:val="single" w:sz="2" w:space="0" w:color="000000"/>
+            </w:tcBorders>
+          </w:tcPr>
+          <w:p>
+            <w:pPr>
+              <w:pStyle w:val="TableContents"/>
+              <w:bidi w:val="0"/>
+              <w:jc w:val="start"/>
+              <w:rPr/>
+            </w:pPr>
+            <w:r>
+              <w:rPr/>
+              <w:t>2532</w:t>
+            </w:r>
+          </w:p>
+        </w:tc>
+        <w:tc>
+          <w:tcPr>
+            <w:tcW w:w="1424" w:type="dxa"/>
+            <w:tcBorders>
+              <w:start w:val="single" w:sz="2" w:space="0" w:color="000000"/>
+              <w:bottom w:val="single" w:sz="2" w:space="0" w:color="000000"/>
+            </w:tcBorders>
+          </w:tcPr>
+          <w:p>
+            <w:pPr>
+              <w:pStyle w:val="TableContents"/>
+              <w:bidi w:val="0"/>
+              <w:jc w:val="start"/>
+              <w:rPr/>
+            </w:pPr>
+            <w:r>
+              <w:rPr/>
+              <w:t>4k</w:t>
+            </w:r>
+          </w:p>
+        </w:tc>
+        <w:tc>
+          <w:tcPr>
             <w:tcW w:w="1421" w:type="dxa"/>
             <w:tcBorders>
-              <w:start w:val="single" w:sz="18" w:space="0" w:color="000000"/>
+              <w:start w:val="single" w:sz="2" w:space="0" w:color="000000"/>
               <w:bottom w:val="single" w:sz="2" w:space="0" w:color="000000"/>
             </w:tcBorders>
           </w:tcPr>
@@ -5864,76 +5917,13 @@
             </w:pPr>
             <w:r>
               <w:rPr/>
-              <w:t>ROM 0</w:t>
-            </w:r>
-          </w:p>
-        </w:tc>
-        <w:tc>
-          <w:tcPr>
-            <w:tcW w:w="1428" w:type="dxa"/>
-            <w:tcBorders>
-              <w:start w:val="single" w:sz="2" w:space="0" w:color="000000"/>
-              <w:bottom w:val="single" w:sz="2" w:space="0" w:color="000000"/>
-            </w:tcBorders>
-          </w:tcPr>
-          <w:p>
-            <w:pPr>
-              <w:pStyle w:val="TableContents"/>
-              <w:bidi w:val="0"/>
-              <w:jc w:val="start"/>
-              <w:rPr/>
-            </w:pPr>
-            <w:r>
-              <w:rPr/>
-              <w:t>2532</w:t>
-            </w:r>
-          </w:p>
-        </w:tc>
-        <w:tc>
-          <w:tcPr>
-            <w:tcW w:w="1424" w:type="dxa"/>
-            <w:tcBorders>
-              <w:start w:val="single" w:sz="2" w:space="0" w:color="000000"/>
-              <w:bottom w:val="single" w:sz="2" w:space="0" w:color="000000"/>
-            </w:tcBorders>
-          </w:tcPr>
-          <w:p>
-            <w:pPr>
-              <w:pStyle w:val="TableContents"/>
-              <w:bidi w:val="0"/>
-              <w:jc w:val="start"/>
-              <w:rPr/>
-            </w:pPr>
-            <w:r>
-              <w:rPr/>
-              <w:t>4k</w:t>
-            </w:r>
-          </w:p>
-        </w:tc>
-        <w:tc>
-          <w:tcPr>
-            <w:tcW w:w="1422" w:type="dxa"/>
-            <w:tcBorders>
-              <w:start w:val="single" w:sz="2" w:space="0" w:color="000000"/>
-              <w:bottom w:val="single" w:sz="2" w:space="0" w:color="000000"/>
-            </w:tcBorders>
-          </w:tcPr>
-          <w:p>
-            <w:pPr>
-              <w:pStyle w:val="TableContents"/>
-              <w:bidi w:val="0"/>
-              <w:jc w:val="start"/>
-              <w:rPr/>
-            </w:pPr>
-            <w:r>
-              <w:rPr/>
               <w:t>0x0000</w:t>
             </w:r>
           </w:p>
         </w:tc>
         <w:tc>
           <w:tcPr>
-            <w:tcW w:w="2253" w:type="dxa"/>
+            <w:tcW w:w="2254" w:type="dxa"/>
             <w:tcBorders>
               <w:start w:val="single" w:sz="2" w:space="0" w:color="000000"/>
               <w:bottom w:val="single" w:sz="2" w:space="0" w:color="000000"/>
@@ -5979,9 +5969,72 @@
         <w:trPr/>
         <w:tc>
           <w:tcPr>
+            <w:tcW w:w="1420" w:type="dxa"/>
+            <w:tcBorders>
+              <w:start w:val="single" w:sz="18" w:space="0" w:color="000000"/>
+              <w:bottom w:val="single" w:sz="2" w:space="0" w:color="000000"/>
+            </w:tcBorders>
+          </w:tcPr>
+          <w:p>
+            <w:pPr>
+              <w:pStyle w:val="TableContents"/>
+              <w:bidi w:val="0"/>
+              <w:jc w:val="start"/>
+              <w:rPr/>
+            </w:pPr>
+            <w:r>
+              <w:rPr/>
+              <w:t>ROM 1</w:t>
+            </w:r>
+          </w:p>
+        </w:tc>
+        <w:tc>
+          <w:tcPr>
+            <w:tcW w:w="1429" w:type="dxa"/>
+            <w:tcBorders>
+              <w:start w:val="single" w:sz="2" w:space="0" w:color="000000"/>
+              <w:bottom w:val="single" w:sz="2" w:space="0" w:color="000000"/>
+            </w:tcBorders>
+          </w:tcPr>
+          <w:p>
+            <w:pPr>
+              <w:pStyle w:val="TableContents"/>
+              <w:bidi w:val="0"/>
+              <w:jc w:val="start"/>
+              <w:rPr/>
+            </w:pPr>
+            <w:r>
+              <w:rPr/>
+              <w:t>2532</w:t>
+            </w:r>
+          </w:p>
+        </w:tc>
+        <w:tc>
+          <w:tcPr>
+            <w:tcW w:w="1424" w:type="dxa"/>
+            <w:tcBorders>
+              <w:start w:val="single" w:sz="2" w:space="0" w:color="000000"/>
+              <w:bottom w:val="single" w:sz="2" w:space="0" w:color="000000"/>
+            </w:tcBorders>
+          </w:tcPr>
+          <w:p>
+            <w:pPr>
+              <w:pStyle w:val="TableContents"/>
+              <w:bidi w:val="0"/>
+              <w:jc w:val="start"/>
+              <w:rPr/>
+            </w:pPr>
+            <w:r>
+              <w:rPr/>
+              <w:t>4k</w:t>
+            </w:r>
+          </w:p>
+        </w:tc>
+        <w:tc>
+          <w:tcPr>
             <w:tcW w:w="1421" w:type="dxa"/>
             <w:tcBorders>
-              <w:start w:val="single" w:sz="18" w:space="0" w:color="000000"/>
+              <w:start w:val="single" w:sz="2" w:space="0" w:color="000000"/>
               <w:bottom w:val="single" w:sz="2" w:space="0" w:color="000000"/>
             </w:tcBorders>
           </w:tcPr>
@@ -5994,76 +6047,13 @@
             </w:pPr>
             <w:r>
               <w:rPr/>
-              <w:t>ROM 1</w:t>
-            </w:r>
-          </w:p>
-        </w:tc>
-        <w:tc>
-          <w:tcPr>
-            <w:tcW w:w="1428" w:type="dxa"/>
-            <w:tcBorders>
-              <w:start w:val="single" w:sz="2" w:space="0" w:color="000000"/>
-              <w:bottom w:val="single" w:sz="2" w:space="0" w:color="000000"/>
-            </w:tcBorders>
-          </w:tcPr>
-          <w:p>
-            <w:pPr>
-              <w:pStyle w:val="TableContents"/>
-              <w:bidi w:val="0"/>
-              <w:jc w:val="start"/>
-              <w:rPr/>
-            </w:pPr>
-            <w:r>
-              <w:rPr/>
-              <w:t>2532</w:t>
-            </w:r>
-          </w:p>
-        </w:tc>
-        <w:tc>
-          <w:tcPr>
-            <w:tcW w:w="1424" w:type="dxa"/>
-            <w:tcBorders>
-              <w:start w:val="single" w:sz="2" w:space="0" w:color="000000"/>
-              <w:bottom w:val="single" w:sz="2" w:space="0" w:color="000000"/>
-            </w:tcBorders>
-          </w:tcPr>
-          <w:p>
-            <w:pPr>
-              <w:pStyle w:val="TableContents"/>
-              <w:bidi w:val="0"/>
-              <w:jc w:val="start"/>
-              <w:rPr/>
-            </w:pPr>
-            <w:r>
-              <w:rPr/>
-              <w:t>4k</w:t>
-            </w:r>
-          </w:p>
-        </w:tc>
-        <w:tc>
-          <w:tcPr>
-            <w:tcW w:w="1422" w:type="dxa"/>
-            <w:tcBorders>
-              <w:start w:val="single" w:sz="2" w:space="0" w:color="000000"/>
-              <w:bottom w:val="single" w:sz="2" w:space="0" w:color="000000"/>
-            </w:tcBorders>
-          </w:tcPr>
-          <w:p>
-            <w:pPr>
-              <w:pStyle w:val="TableContents"/>
-              <w:bidi w:val="0"/>
-              <w:jc w:val="start"/>
-              <w:rPr/>
-            </w:pPr>
-            <w:r>
-              <w:rPr/>
               <w:t>0x1000</w:t>
             </w:r>
           </w:p>
         </w:tc>
         <w:tc>
           <w:tcPr>
-            <w:tcW w:w="2253" w:type="dxa"/>
+            <w:tcW w:w="2254" w:type="dxa"/>
             <w:tcBorders>
               <w:start w:val="single" w:sz="2" w:space="0" w:color="000000"/>
               <w:bottom w:val="single" w:sz="2" w:space="0" w:color="000000"/>
@@ -6109,9 +6099,72 @@
         <w:trPr/>
         <w:tc>
           <w:tcPr>
+            <w:tcW w:w="1420" w:type="dxa"/>
+            <w:tcBorders>
+              <w:start w:val="single" w:sz="18" w:space="0" w:color="000000"/>
+              <w:bottom w:val="single" w:sz="2" w:space="0" w:color="000000"/>
+            </w:tcBorders>
+          </w:tcPr>
+          <w:p>
+            <w:pPr>
+              <w:pStyle w:val="TableContents"/>
+              <w:bidi w:val="0"/>
+              <w:jc w:val="start"/>
+              <w:rPr/>
+            </w:pPr>
+            <w:r>
+              <w:rPr/>
+              <w:t>ROM 2</w:t>
+            </w:r>
+          </w:p>
+        </w:tc>
+        <w:tc>
+          <w:tcPr>
+            <w:tcW w:w="1429" w:type="dxa"/>
+            <w:tcBorders>
+              <w:start w:val="single" w:sz="2" w:space="0" w:color="000000"/>
+              <w:bottom w:val="single" w:sz="2" w:space="0" w:color="000000"/>
+            </w:tcBorders>
+          </w:tcPr>
+          <w:p>
+            <w:pPr>
+              <w:pStyle w:val="TableContents"/>
+              <w:bidi w:val="0"/>
+              <w:jc w:val="start"/>
+              <w:rPr/>
+            </w:pPr>
+            <w:r>
+              <w:rPr/>
+              <w:t>2532</w:t>
+            </w:r>
+          </w:p>
+        </w:tc>
+        <w:tc>
+          <w:tcPr>
+            <w:tcW w:w="1424" w:type="dxa"/>
+            <w:tcBorders>
+              <w:start w:val="single" w:sz="2" w:space="0" w:color="000000"/>
+              <w:bottom w:val="single" w:sz="2" w:space="0" w:color="000000"/>
+            </w:tcBorders>
+          </w:tcPr>
+          <w:p>
+            <w:pPr>
+              <w:pStyle w:val="TableContents"/>
+              <w:bidi w:val="0"/>
+              <w:jc w:val="start"/>
+              <w:rPr/>
+            </w:pPr>
+            <w:r>
+              <w:rPr/>
+              <w:t>4k</w:t>
+            </w:r>
+          </w:p>
+        </w:tc>
+        <w:tc>
+          <w:tcPr>
             <w:tcW w:w="1421" w:type="dxa"/>
             <w:tcBorders>
-              <w:start w:val="single" w:sz="18" w:space="0" w:color="000000"/>
+              <w:start w:val="single" w:sz="2" w:space="0" w:color="000000"/>
               <w:bottom w:val="single" w:sz="2" w:space="0" w:color="000000"/>
             </w:tcBorders>
           </w:tcPr>
@@ -6124,76 +6177,13 @@
             </w:pPr>
             <w:r>
               <w:rPr/>
-              <w:t>ROM 2</w:t>
-            </w:r>
-          </w:p>
-        </w:tc>
-        <w:tc>
-          <w:tcPr>
-            <w:tcW w:w="1428" w:type="dxa"/>
-            <w:tcBorders>
-              <w:start w:val="single" w:sz="2" w:space="0" w:color="000000"/>
-              <w:bottom w:val="single" w:sz="2" w:space="0" w:color="000000"/>
-            </w:tcBorders>
-          </w:tcPr>
-          <w:p>
-            <w:pPr>
-              <w:pStyle w:val="TableContents"/>
-              <w:bidi w:val="0"/>
-              <w:jc w:val="start"/>
-              <w:rPr/>
-            </w:pPr>
-            <w:r>
-              <w:rPr/>
-              <w:t>2532</w:t>
-            </w:r>
-          </w:p>
-        </w:tc>
-        <w:tc>
-          <w:tcPr>
-            <w:tcW w:w="1424" w:type="dxa"/>
-            <w:tcBorders>
-              <w:start w:val="single" w:sz="2" w:space="0" w:color="000000"/>
-              <w:bottom w:val="single" w:sz="2" w:space="0" w:color="000000"/>
-            </w:tcBorders>
-          </w:tcPr>
-          <w:p>
-            <w:pPr>
-              <w:pStyle w:val="TableContents"/>
-              <w:bidi w:val="0"/>
-              <w:jc w:val="start"/>
-              <w:rPr/>
-            </w:pPr>
-            <w:r>
-              <w:rPr/>
-              <w:t>4k</w:t>
-            </w:r>
-          </w:p>
-        </w:tc>
-        <w:tc>
-          <w:tcPr>
-            <w:tcW w:w="1422" w:type="dxa"/>
-            <w:tcBorders>
-              <w:start w:val="single" w:sz="2" w:space="0" w:color="000000"/>
-              <w:bottom w:val="single" w:sz="2" w:space="0" w:color="000000"/>
-            </w:tcBorders>
-          </w:tcPr>
-          <w:p>
-            <w:pPr>
-              <w:pStyle w:val="TableContents"/>
-              <w:bidi w:val="0"/>
-              <w:jc w:val="start"/>
-              <w:rPr/>
-            </w:pPr>
-            <w:r>
-              <w:rPr/>
               <w:t>0x2000</w:t>
             </w:r>
           </w:p>
         </w:tc>
         <w:tc>
           <w:tcPr>
-            <w:tcW w:w="2253" w:type="dxa"/>
+            <w:tcW w:w="2254" w:type="dxa"/>
             <w:tcBorders>
               <w:start w:val="single" w:sz="2" w:space="0" w:color="000000"/>
               <w:bottom w:val="single" w:sz="2" w:space="0" w:color="000000"/>
@@ -6239,7 +6229,7 @@
         <w:trPr/>
         <w:tc>
           <w:tcPr>
-            <w:tcW w:w="1421" w:type="dxa"/>
+            <w:tcW w:w="1420" w:type="dxa"/>
             <w:tcBorders>
               <w:start w:val="single" w:sz="18" w:space="0" w:color="000000"/>
               <w:bottom w:val="single" w:sz="18" w:space="0" w:color="000000"/>
@@ -6260,7 +6250,7 @@
         </w:tc>
         <w:tc>
           <w:tcPr>
-            <w:tcW w:w="1428" w:type="dxa"/>
+            <w:tcW w:w="1429" w:type="dxa"/>
             <w:tcBorders>
               <w:start w:val="single" w:sz="2" w:space="0" w:color="000000"/>
               <w:bottom w:val="single" w:sz="18" w:space="0" w:color="000000"/>
@@ -6302,7 +6292,7 @@
         </w:tc>
         <w:tc>
           <w:tcPr>
-            <w:tcW w:w="1422" w:type="dxa"/>
+            <w:tcW w:w="1421" w:type="dxa"/>
             <w:tcBorders>
               <w:start w:val="single" w:sz="2" w:space="0" w:color="000000"/>
               <w:bottom w:val="single" w:sz="18" w:space="0" w:color="000000"/>
@@ -6323,7 +6313,7 @@
         </w:tc>
         <w:tc>
           <w:tcPr>
-            <w:tcW w:w="2253" w:type="dxa"/>
+            <w:tcW w:w="2254" w:type="dxa"/>
             <w:tcBorders>
               <w:start w:val="single" w:sz="2" w:space="0" w:color="000000"/>
               <w:bottom w:val="single" w:sz="18" w:space="0" w:color="000000"/>
@@ -6382,7 +6372,7 @@
         <w:pStyle w:val="Heading3"/>
         <w:numPr>
           <w:ilvl w:val="2"/>
-          <w:numId w:val="2"/>
+          <w:numId w:val="1"/>
         </w:numPr>
         <w:bidi w:val="0"/>
         <w:ind w:hanging="0" w:start="0"/>
@@ -7237,7 +7227,7 @@
         <w:pStyle w:val="Heading2"/>
         <w:numPr>
           <w:ilvl w:val="1"/>
-          <w:numId w:val="2"/>
+          <w:numId w:val="1"/>
         </w:numPr>
         <w:bidi w:val="0"/>
         <w:ind w:hanging="0" w:start="0"/>
@@ -7295,7 +7285,7 @@
         <w:pStyle w:val="Heading2"/>
         <w:numPr>
           <w:ilvl w:val="1"/>
-          <w:numId w:val="2"/>
+          <w:numId w:val="1"/>
         </w:numPr>
         <w:bidi w:val="0"/>
         <w:ind w:hanging="0" w:start="0"/>
@@ -7319,11 +7309,7 @@
       </w:pPr>
       <w:r>
         <w:rPr/>
-        <w:t xml:space="preserve">TKG hardware uses a hardware controlled </w:t>
-      </w:r>
-      <w:r>
-        <w:rPr/>
-        <w:t>NMI. NMI is derived from the VBlank signal which pulses at approximately 60Hz. It goes through a 74ls74 flip flop (8F on TKG4 hardware) before ultimately toggling the NMI pin on the CPU. The flip flop acts as an NMI enable. To enable NMI, a non-zero value in the lower 4 bits must be written to $7D84. To disable the interrupt, write zero to $7D84. Every time NMI triggers it must it must be re-enabled. In original TKG software, it gets re-enabled towards the end of the NMI routine.</w:t>
+        <w:t>TKG hardware uses a hardware controlled NMI. NMI is derived from the VBlank signal which pulses at approximately 60Hz. It goes through a 74ls74 flip flop (8F on TKG4 hardware) before ultimately toggling the NMI pin on the CPU. The flip flop acts as an NMI enable. To enable NMI, a non-zero value in the lower 4 bits must be written to $7D84. To disable the interrupt, write zero to $7D84. Every time NMI triggers it must it must be re-enabled. In original TKG software, it gets re-enabled towards the end of the NMI routine.</w:t>
       </w:r>
     </w:p>
     <w:p>
@@ -7336,15 +7322,7 @@
       </w:pPr>
       <w:r>
         <w:rPr/>
-        <w:t xml:space="preserve">The test ROM </w:t>
-      </w:r>
-      <w:r>
-        <w:rPr/>
-        <w:t xml:space="preserve">validates that the NMI functionality works. NMI is enabled and when it jumps to the NMI routine it sets a bit in the results register. Immediately after </w:t>
-      </w:r>
-      <w:r>
-        <w:rPr/>
-        <w:t>enabling NMI, it enters a wait loop. If the NMI routine does not trigger during wait loop it “times out” and from there it will register it as a failure. It is required for the NMI test to pass in order to progress to the runtime tests.</w:t>
+        <w:t>The test ROM validates that the NMI functionality works. NMI is enabled and when it jumps to the NMI routine it sets a bit in the results register. Immediately after enabling NMI, it enters a wait loop. If the NMI routine does not trigger during wait loop it “times out” and from there it will register it as a failure. It is required for the NMI test to pass in order to progress to the runtime tests.</w:t>
       </w:r>
     </w:p>
     <w:p>
@@ -7352,7 +7330,7 @@
         <w:pStyle w:val="Heading2"/>
         <w:numPr>
           <w:ilvl w:val="1"/>
-          <w:numId w:val="2"/>
+          <w:numId w:val="1"/>
         </w:numPr>
         <w:bidi w:val="0"/>
         <w:ind w:hanging="0" w:start="0"/>
@@ -7384,14 +7362,14 @@
         <w:pStyle w:val="BodyText"/>
         <w:numPr>
           <w:ilvl w:val="1"/>
-          <w:numId w:val="2"/>
+          <w:numId w:val="1"/>
         </w:numPr>
         <w:rPr/>
       </w:pPr>
       <w:r>
         <w:rPr/>
         <w:drawing>
-          <wp:anchor distT="0" distB="0" distL="0" distR="0" simplePos="0" relativeHeight="13" behindDoc="0" locked="0" layoutInCell="0" allowOverlap="1">
+          <wp:anchor distT="0" distB="0" distL="0" distR="0" simplePos="0" relativeHeight="15" behindDoc="0" locked="0" layoutInCell="0" allowOverlap="1">
             <wp:simplePos x="0" y="0"/>
             <wp:positionH relativeFrom="column">
               <wp:posOffset>635</wp:posOffset>
@@ -7443,7 +7421,7 @@
         <w:pStyle w:val="Heading2"/>
         <w:numPr>
           <w:ilvl w:val="1"/>
-          <w:numId w:val="2"/>
+          <w:numId w:val="1"/>
         </w:numPr>
         <w:bidi w:val="0"/>
         <w:ind w:hanging="0" w:start="0"/>
@@ -7464,11 +7442,7 @@
       </w:pPr>
       <w:r>
         <w:rPr/>
-        <w:t xml:space="preserve">There are scenarios in which the test ROM will not transition to run time. </w:t>
-      </w:r>
-      <w:r>
-        <w:rPr/>
-        <w:t>It must pass all RAM tests and the NMI test. If any of these tests do not pass, the test ROM will report a startup test failure and the game will reset. During this time, it will print a message saying that there was a failure and print an error code. The error code translates to the result buffer. Refer to the error decoding sheet to decode this.</w:t>
+        <w:t>There are scenarios in which the test ROM will not transition to run time. It must pass all RAM tests and the NMI test. If any of these tests do not pass, the test ROM will report a startup test failure and the game will reset. During this time, it will print a message saying that there was a failure and print an error code. The error code translates to the result buffer. Refer to the error decoding sheet to decode this.</w:t>
       </w:r>
     </w:p>
     <w:p>
@@ -7478,7 +7452,7 @@
       </w:pPr>
       <w:r>
         <w:drawing>
-          <wp:anchor distT="0" distB="0" distL="0" distR="0" simplePos="0" relativeHeight="14" behindDoc="0" locked="0" layoutInCell="0" allowOverlap="1">
+          <wp:anchor distT="0" distB="0" distL="0" distR="0" simplePos="0" relativeHeight="16" behindDoc="0" locked="0" layoutInCell="0" allowOverlap="1">
             <wp:simplePos x="0" y="0"/>
             <wp:positionH relativeFrom="column">
               <wp:posOffset>13970</wp:posOffset>
@@ -7537,7 +7511,7 @@
         <w:pStyle w:val="Heading1"/>
         <w:numPr>
           <w:ilvl w:val="0"/>
-          <w:numId w:val="2"/>
+          <w:numId w:val="1"/>
         </w:numPr>
         <w:bidi w:val="0"/>
         <w:spacing w:before="0" w:after="120"/>
@@ -7557,7 +7531,7 @@
         <w:pStyle w:val="Heading2"/>
         <w:numPr>
           <w:ilvl w:val="1"/>
-          <w:numId w:val="2"/>
+          <w:numId w:val="1"/>
         </w:numPr>
         <w:bidi w:val="0"/>
         <w:ind w:hanging="0" w:start="0"/>
@@ -7581,15 +7555,7 @@
       </w:pPr>
       <w:r>
         <w:rPr/>
-        <w:t xml:space="preserve">This is a very simple test that just prints the state of the buttons. This does not have its own screen, it just prints the button state as part of the menu. P1 controls are all the controls on the upright and all available controls on player 1 side of the cocktail table. P2 controls are only available on the cocktail table P2 side. The coin switch is a bit unique. TKG hardware has no way to differentiate between the coin switch and the service switch using software. So if either switch is toggled </w:t>
-      </w:r>
-      <w:r>
-        <w:rPr/>
-        <w:t xml:space="preserve">it will register as “coin”. </w:t>
-      </w:r>
-      <w:r>
-        <w:rPr/>
-        <w:t>When a button is pushed, it will be represented by value of the button transitioning to “on”. If any of the values are “stuck” then the first place to check would be the pullup resistor arrays and the buffer ICs. There could also be some failures in the addressing circuitry that is enabling the read of the switches.</w:t>
+        <w:t>This is a very simple test that just prints the state of the buttons. This does not have its own screen, it just prints the button state as part of the menu. P1 controls are all the controls on the upright and all available controls on player 1 side of the cocktail table. P2 controls are only available on the cocktail table P2 side. The coin switch is a bit unique. TKG hardware has no way to differentiate between the coin switch and the service switch using software. So if either switch is toggled it will register as “coin”. When a button is pushed, it will be represented by value of the button transitioning to “on”. If any of the values are “stuck” then the first place to check would be the pullup resistor arrays and the buffer ICs. There could also be some failures in the addressing circuitry that is enabling the read of the switches.</w:t>
       </w:r>
     </w:p>
     <w:p>
@@ -7655,7 +7621,7 @@
         <w:pStyle w:val="Heading2"/>
         <w:numPr>
           <w:ilvl w:val="1"/>
-          <w:numId w:val="2"/>
+          <w:numId w:val="1"/>
         </w:numPr>
         <w:bidi w:val="0"/>
         <w:ind w:hanging="0" w:start="0"/>
@@ -7679,11 +7645,7 @@
       </w:pPr>
       <w:r>
         <w:rPr/>
-        <w:t xml:space="preserve">The DIP switches are a set of eight switches found on the CPU PCB. They are labeled both ‘1’ through ‘8’ and ‘A’ through ‘H’. The test will print the current state of the dip switches. “On ”is represented by a ‘1’. “Off” is represented by a ‘0’. To find out what the actual dip switches represent, refer to the game manual. If they are stuck on, like the controls, the first place to check would be the pullup resistors and </w:t>
-      </w:r>
-      <w:r>
-        <w:rPr/>
-        <w:t>buffer IC for the dip switches. For more details refer to the schematics on the CPU board.</w:t>
+        <w:t>The DIP switches are a set of eight switches found on the CPU PCB. They are labeled both ‘1’ through ‘8’ and ‘A’ through ‘H’. The test will print the current state of the dip switches. “On ”is represented by a ‘1’. “Off” is represented by a ‘0’. To find out what the actual dip switches represent, refer to the game manual. If they are stuck on, like the controls, the first place to check would be the pullup resistors and buffer IC for the dip switches. For more details refer to the schematics on the CPU board.</w:t>
       </w:r>
     </w:p>
     <w:p>
@@ -7795,7 +7757,7 @@
         <w:pStyle w:val="Heading2"/>
         <w:numPr>
           <w:ilvl w:val="1"/>
-          <w:numId w:val="2"/>
+          <w:numId w:val="1"/>
         </w:numPr>
         <w:bidi w:val="0"/>
         <w:ind w:hanging="0" w:start="0"/>
@@ -7827,7 +7789,7 @@
         <w:pStyle w:val="Heading2"/>
         <w:numPr>
           <w:ilvl w:val="1"/>
-          <w:numId w:val="2"/>
+          <w:numId w:val="1"/>
         </w:numPr>
         <w:bidi w:val="0"/>
         <w:ind w:hanging="0" w:start="0"/>
@@ -7851,31 +7813,7 @@
       </w:pPr>
       <w:r>
         <w:rPr/>
-        <w:t xml:space="preserve">This is yet another very simple test that just changes the screen inversion status, </w:t>
-      </w:r>
-      <w:r>
-        <w:rPr/>
-        <w:t>called flip in the schematics</w:t>
-      </w:r>
-      <w:r>
-        <w:rPr/>
-        <w:t>. By default, TKG prints to the screen “upside down”. The actual inversion process is handled through hardware and is enabled by software. To uninvert the screen, write ‘</w:t>
-      </w:r>
-      <w:r>
-        <w:rPr/>
-        <w:t>1’</w:t>
-      </w:r>
-      <w:r>
-        <w:rPr/>
-        <w:t xml:space="preserve"> to address $</w:t>
-      </w:r>
-      <w:r>
-        <w:rPr/>
-        <w:t xml:space="preserve">7D82. To invert the screen, write ‘0’ to $7D82. </w:t>
-      </w:r>
-      <w:r>
-        <w:rPr/>
-        <w:t>On TKG4, it is controlled by the 74LS259 at 5H and goes through an inverter at 5J. From there the flip signal is consumed by several chips on the video board to handle the flipping of individual video sections.</w:t>
+        <w:t>This is yet another very simple test that just changes the screen inversion status, called flip in the schematics. By default, TKG prints to the screen “upside down”. The actual inversion process is handled through hardware and is enabled by software. To uninvert the screen, write ‘1’ to address $7D82. To invert the screen, write ‘0’ to $7D82. On TKG4, it is controlled by the 74LS259 at 5H and goes through an inverter at 5J. From there the flip signal is consumed by several chips on the video board to handle the flipping of individual video sections.</w:t>
       </w:r>
     </w:p>
     <w:p>
@@ -7888,172 +7826,6 @@
       </w:pPr>
       <w:r>
         <w:rPr/>
-        <mc:AlternateContent>
-          <mc:Choice Requires="wps">
-            <w:drawing>
-              <wp:anchor distT="0" distB="0" distL="0" distR="0" simplePos="0" relativeHeight="11" behindDoc="0" locked="0" layoutInCell="0" allowOverlap="1">
-                <wp:simplePos x="0" y="0"/>
-                <wp:positionH relativeFrom="column">
-                  <wp:posOffset>927735</wp:posOffset>
-                </wp:positionH>
-                <wp:positionV relativeFrom="paragraph">
-                  <wp:posOffset>4147820</wp:posOffset>
-                </wp:positionV>
-                <wp:extent cx="958850" cy="208915"/>
-                <wp:effectExtent l="0" t="0" r="0" b="0"/>
-                <wp:wrapTopAndBottom/>
-                <wp:docPr id="10" name="Text Frame 1"/>
-                <a:graphic xmlns:a="http://schemas.openxmlformats.org/drawingml/2006/main">
-                  <a:graphicData uri="http://schemas.microsoft.com/office/word/2010/wordprocessingShape">
-                    <wps:wsp>
-                      <wps:cNvSpPr txBox="1"/>
-                      <wps:spPr>
-                        <a:xfrm>
-                          <a:off x="0" y="0"/>
-                          <a:ext cx="958680" cy="208800"/>
-                        </a:xfrm>
-                        <a:prstGeom prst="rect">
-                          <a:avLst/>
-                        </a:prstGeom>
-                        <a:noFill/>
-                        <a:ln w="0">
-                          <a:noFill/>
-                        </a:ln>
-                      </wps:spPr>
-                      <wps:txbx>
-                        <w:txbxContent>
-                          <w:p>
-                            <w:pPr>
-                              <w:overflowPunct w:val="false"/>
-                              <w:rPr/>
-                            </w:pPr>
-                            <w:r>
-                              <w:rPr/>
-                              <w:t>Normal Screen</w:t>
-                            </w:r>
-                          </w:p>
-                        </w:txbxContent>
-                      </wps:txbx>
-                      <wps:bodyPr wrap="square" lIns="0" tIns="0" rIns="0" bIns="0" anchor="t">
-                        <a:noAutofit/>
-                      </wps:bodyPr>
-                    </wps:wsp>
-                  </a:graphicData>
-                </a:graphic>
-              </wp:anchor>
-            </w:drawing>
-          </mc:Choice>
-          <mc:Fallback>
-            <w:pict>
-              <v:shapetype id="_x0000_t202" coordsize="21600,21600" o:spt="202" path="m,l,21600l21600,21600l21600,xe">
-                <v:stroke joinstyle="miter"/>
-                <v:path gradientshapeok="t" o:connecttype="rect"/>
-              </v:shapetype>
-              <v:shape id="shape_0" stroked="f" o:allowincell="f" style="position:absolute;margin-left:73.05pt;margin-top:326.6pt;width:75.45pt;height:16.4pt;mso-wrap-style:square;v-text-anchor:top" type="_x0000_t202">
-                <v:textbox>
-                  <w:txbxContent>
-                    <w:p>
-                      <w:pPr>
-                        <w:overflowPunct w:val="false"/>
-                        <w:rPr/>
-                      </w:pPr>
-                      <w:r>
-                        <w:rPr/>
-                        <w:t>Normal Screen</w:t>
-                      </w:r>
-                    </w:p>
-                  </w:txbxContent>
-                </v:textbox>
-                <v:fill o:detectmouseclick="t" on="false"/>
-                <v:stroke color="black" joinstyle="round" endcap="flat"/>
-                <w10:wrap type="topAndBottom"/>
-              </v:shape>
-            </w:pict>
-          </mc:Fallback>
-        </mc:AlternateContent>
-        <mc:AlternateContent>
-          <mc:Choice Requires="wps">
-            <w:drawing>
-              <wp:anchor distT="0" distB="0" distL="0" distR="0" simplePos="0" relativeHeight="12" behindDoc="0" locked="0" layoutInCell="1" allowOverlap="1">
-                <wp:simplePos x="0" y="0"/>
-                <wp:positionH relativeFrom="column">
-                  <wp:posOffset>4398010</wp:posOffset>
-                </wp:positionH>
-                <wp:positionV relativeFrom="paragraph">
-                  <wp:posOffset>4141470</wp:posOffset>
-                </wp:positionV>
-                <wp:extent cx="996950" cy="196215"/>
-                <wp:effectExtent l="0" t="0" r="0" b="0"/>
-                <wp:wrapNone/>
-                <wp:docPr id="11" name="Text Frame 2"/>
-                <a:graphic xmlns:a="http://schemas.openxmlformats.org/drawingml/2006/main">
-                  <a:graphicData uri="http://schemas.microsoft.com/office/word/2010/wordprocessingShape">
-                    <wps:wsp>
-                      <wps:cNvSpPr txBox="1"/>
-                      <wps:spPr>
-                        <a:xfrm>
-                          <a:off x="0" y="0"/>
-                          <a:ext cx="996840" cy="196200"/>
-                        </a:xfrm>
-                        <a:prstGeom prst="rect">
-                          <a:avLst/>
-                        </a:prstGeom>
-                        <a:noFill/>
-                        <a:ln w="0">
-                          <a:noFill/>
-                        </a:ln>
-                      </wps:spPr>
-                      <wps:txbx>
-                        <w:txbxContent>
-                          <w:p>
-                            <w:pPr>
-                              <w:overflowPunct w:val="false"/>
-                              <w:rPr/>
-                            </w:pPr>
-                            <w:r>
-                              <w:rPr>
-                                <w:sz w:val="24"/>
-                              </w:rPr>
-                              <w:t>Inverted Screen</w:t>
-                            </w:r>
-                          </w:p>
-                        </w:txbxContent>
-                      </wps:txbx>
-                      <wps:bodyPr wrap="square" lIns="0" tIns="0" rIns="0" bIns="0" anchor="t">
-                        <a:noAutofit/>
-                      </wps:bodyPr>
-                    </wps:wsp>
-                  </a:graphicData>
-                </a:graphic>
-              </wp:anchor>
-            </w:drawing>
-          </mc:Choice>
-          <mc:Fallback>
-            <w:pict>
-              <v:shape id="shape_0" stroked="f" o:allowincell="f" style="position:absolute;margin-left:346.3pt;margin-top:326.1pt;width:78.45pt;height:15.4pt;mso-wrap-style:square;v-text-anchor:top" type="_x0000_t202">
-                <v:textbox>
-                  <w:txbxContent>
-                    <w:p>
-                      <w:pPr>
-                        <w:overflowPunct w:val="false"/>
-                        <w:rPr/>
-                      </w:pPr>
-                      <w:r>
-                        <w:rPr>
-                          <w:sz w:val="24"/>
-                        </w:rPr>
-                        <w:t>Inverted Screen</w:t>
-                      </w:r>
-                    </w:p>
-                  </w:txbxContent>
-                </v:textbox>
-                <v:fill o:detectmouseclick="t" on="false"/>
-                <v:stroke color="black" joinstyle="round" endcap="flat"/>
-                <w10:wrap type="none"/>
-              </v:shape>
-            </w:pict>
-          </mc:Fallback>
-        </mc:AlternateContent>
         <w:drawing>
           <wp:anchor distT="0" distB="0" distL="0" distR="0" simplePos="0" relativeHeight="9" behindDoc="0" locked="0" layoutInCell="0" allowOverlap="1">
             <wp:simplePos x="0" y="0"/>
@@ -8066,7 +7838,7 @@
             <wp:extent cx="3163570" cy="4114800"/>
             <wp:effectExtent l="0" t="0" r="0" b="0"/>
             <wp:wrapTopAndBottom/>
-            <wp:docPr id="12" name="Image8"/>
+            <wp:docPr id="10" name="Image8"/>
             <wp:cNvGraphicFramePr>
               <a:graphicFrameLocks xmlns:a="http://schemas.openxmlformats.org/drawingml/2006/main" noChangeAspect="1"/>
             </wp:cNvGraphicFramePr>
@@ -8074,7 +7846,7 @@
               <a:graphicData uri="http://schemas.openxmlformats.org/drawingml/2006/picture">
                 <pic:pic xmlns:pic="http://schemas.openxmlformats.org/drawingml/2006/picture">
                   <pic:nvPicPr>
-                    <pic:cNvPr id="12" name="Image8"/>
+                    <pic:cNvPr id="10" name="Image8"/>
                     <pic:cNvPicPr>
                       <a:picLocks noChangeAspect="1" noChangeArrowheads="1"/>
                     </pic:cNvPicPr>
@@ -8112,7 +7884,7 @@
             <wp:extent cx="3163570" cy="4114800"/>
             <wp:effectExtent l="0" t="0" r="0" b="0"/>
             <wp:wrapTopAndBottom/>
-            <wp:docPr id="13" name="Image9"/>
+            <wp:docPr id="11" name="Image9"/>
             <wp:cNvGraphicFramePr>
               <a:graphicFrameLocks xmlns:a="http://schemas.openxmlformats.org/drawingml/2006/main" noChangeAspect="1"/>
             </wp:cNvGraphicFramePr>
@@ -8120,7 +7892,7 @@
               <a:graphicData uri="http://schemas.openxmlformats.org/drawingml/2006/picture">
                 <pic:pic xmlns:pic="http://schemas.openxmlformats.org/drawingml/2006/picture">
                   <pic:nvPicPr>
-                    <pic:cNvPr id="13" name="Image9"/>
+                    <pic:cNvPr id="11" name="Image9"/>
                     <pic:cNvPicPr>
                       <a:picLocks noChangeAspect="1" noChangeArrowheads="1"/>
                     </pic:cNvPicPr>
@@ -8146,6 +7918,184 @@
             </a:graphic>
           </wp:anchor>
         </w:drawing>
+        <mc:AlternateContent>
+          <mc:Choice Requires="wps">
+            <w:drawing>
+              <wp:anchor distT="0" distB="0" distL="0" distR="0" simplePos="0" relativeHeight="11" behindDoc="0" locked="0" layoutInCell="0" allowOverlap="1">
+                <wp:simplePos x="0" y="0"/>
+                <wp:positionH relativeFrom="column">
+                  <wp:posOffset>927735</wp:posOffset>
+                </wp:positionH>
+                <wp:positionV relativeFrom="paragraph">
+                  <wp:posOffset>4147820</wp:posOffset>
+                </wp:positionV>
+                <wp:extent cx="958850" cy="208915"/>
+                <wp:effectExtent l="0" t="0" r="0" b="0"/>
+                <wp:wrapTopAndBottom/>
+                <wp:docPr id="12" name="Text Frame 1"/>
+                <a:graphic xmlns:a="http://schemas.openxmlformats.org/drawingml/2006/main">
+                  <a:graphicData uri="http://schemas.microsoft.com/office/word/2010/wordprocessingShape">
+                    <wps:wsp>
+                      <wps:cNvSpPr/>
+                      <wps:spPr>
+                        <a:xfrm>
+                          <a:off x="0" y="0"/>
+                          <a:ext cx="958680" cy="208800"/>
+                        </a:xfrm>
+                        <a:prstGeom prst="rect">
+                          <a:avLst/>
+                        </a:prstGeom>
+                        <a:noFill/>
+                        <a:ln w="0">
+                          <a:noFill/>
+                        </a:ln>
+                      </wps:spPr>
+                      <wps:style>
+                        <a:lnRef idx="0"/>
+                        <a:fillRef idx="0"/>
+                        <a:effectRef idx="0"/>
+                        <a:fontRef idx="minor"/>
+                      </wps:style>
+                      <wps:txbx>
+                        <w:txbxContent>
+                          <w:p>
+                            <w:pPr>
+                              <w:pStyle w:val="FrameContents"/>
+                              <w:overflowPunct w:val="true"/>
+                              <w:rPr/>
+                            </w:pPr>
+                            <w:r>
+                              <w:rPr/>
+                              <w:t>Normal Screen</w:t>
+                            </w:r>
+                          </w:p>
+                        </w:txbxContent>
+                      </wps:txbx>
+                      <wps:bodyPr lIns="0" tIns="0" rIns="0" bIns="0" anchor="t">
+                        <a:noAutofit/>
+                      </wps:bodyPr>
+                    </wps:wsp>
+                  </a:graphicData>
+                </a:graphic>
+              </wp:anchor>
+            </w:drawing>
+          </mc:Choice>
+          <mc:Fallback>
+            <w:pict>
+              <v:rect id="shape_0" stroked="f" o:allowincell="f" style="position:absolute;margin-left:73.05pt;margin-top:326.6pt;width:75.45pt;height:16.4pt;mso-wrap-style:square;v-text-anchor:top">
+                <v:fill o:detectmouseclick="t" on="false"/>
+                <v:stroke color="#3465a4" joinstyle="round" endcap="flat"/>
+                <v:textbox>
+                  <w:txbxContent>
+                    <w:p>
+                      <w:pPr>
+                        <w:pStyle w:val="FrameContents"/>
+                        <w:overflowPunct w:val="true"/>
+                        <w:rPr/>
+                      </w:pPr>
+                      <w:r>
+                        <w:rPr/>
+                        <w:t>Normal Screen</w:t>
+                      </w:r>
+                    </w:p>
+                  </w:txbxContent>
+                </v:textbox>
+                <w10:wrap type="topAndBottom"/>
+              </v:rect>
+            </w:pict>
+          </mc:Fallback>
+        </mc:AlternateContent>
+        <mc:AlternateContent>
+          <mc:Choice Requires="wps">
+            <w:drawing>
+              <wp:anchor distT="0" distB="0" distL="0" distR="0" simplePos="0" relativeHeight="13" behindDoc="0" locked="0" layoutInCell="1" allowOverlap="1">
+                <wp:simplePos x="0" y="0"/>
+                <wp:positionH relativeFrom="column">
+                  <wp:posOffset>4398010</wp:posOffset>
+                </wp:positionH>
+                <wp:positionV relativeFrom="paragraph">
+                  <wp:posOffset>4141470</wp:posOffset>
+                </wp:positionV>
+                <wp:extent cx="996950" cy="196215"/>
+                <wp:effectExtent l="0" t="0" r="0" b="0"/>
+                <wp:wrapNone/>
+                <wp:docPr id="13" name="Text Frame 2"/>
+                <a:graphic xmlns:a="http://schemas.openxmlformats.org/drawingml/2006/main">
+                  <a:graphicData uri="http://schemas.microsoft.com/office/word/2010/wordprocessingShape">
+                    <wps:wsp>
+                      <wps:cNvSpPr/>
+                      <wps:spPr>
+                        <a:xfrm>
+                          <a:off x="0" y="0"/>
+                          <a:ext cx="996840" cy="196200"/>
+                        </a:xfrm>
+                        <a:prstGeom prst="rect">
+                          <a:avLst/>
+                        </a:prstGeom>
+                        <a:noFill/>
+                        <a:ln w="0">
+                          <a:noFill/>
+                        </a:ln>
+                      </wps:spPr>
+                      <wps:style>
+                        <a:lnRef idx="0"/>
+                        <a:fillRef idx="0"/>
+                        <a:effectRef idx="0"/>
+                        <a:fontRef idx="minor"/>
+                      </wps:style>
+                      <wps:txbx>
+                        <w:txbxContent>
+                          <w:p>
+                            <w:pPr>
+                              <w:pStyle w:val="FrameContents"/>
+                              <w:overflowPunct w:val="true"/>
+                              <w:rPr/>
+                            </w:pPr>
+                            <w:r>
+                              <w:rPr>
+                                <w:sz w:val="24"/>
+                              </w:rPr>
+                              <w:t>Inverted Screen</w:t>
+                            </w:r>
+                          </w:p>
+                        </w:txbxContent>
+                      </wps:txbx>
+                      <wps:bodyPr lIns="0" tIns="0" rIns="0" bIns="0" anchor="t">
+                        <a:noAutofit/>
+                      </wps:bodyPr>
+                    </wps:wsp>
+                  </a:graphicData>
+                </a:graphic>
+              </wp:anchor>
+            </w:drawing>
+          </mc:Choice>
+          <mc:Fallback>
+            <w:pict>
+              <v:rect id="shape_0" stroked="f" o:allowincell="f" style="position:absolute;margin-left:346.3pt;margin-top:326.1pt;width:78.45pt;height:15.4pt;mso-wrap-style:square;v-text-anchor:top">
+                <v:fill o:detectmouseclick="t" on="false"/>
+                <v:stroke color="#3465a4" joinstyle="round" endcap="flat"/>
+                <v:textbox>
+                  <w:txbxContent>
+                    <w:p>
+                      <w:pPr>
+                        <w:pStyle w:val="FrameContents"/>
+                        <w:overflowPunct w:val="true"/>
+                        <w:rPr/>
+                      </w:pPr>
+                      <w:r>
+                        <w:rPr>
+                          <w:sz w:val="24"/>
+                        </w:rPr>
+                        <w:t>Inverted Screen</w:t>
+                      </w:r>
+                    </w:p>
+                  </w:txbxContent>
+                </v:textbox>
+                <w10:wrap type="none"/>
+              </v:rect>
+            </w:pict>
+          </mc:Fallback>
+        </mc:AlternateContent>
       </w:r>
     </w:p>
     <w:p>
@@ -8153,18 +8103,15 @@
         <w:pStyle w:val="Heading2"/>
         <w:numPr>
           <w:ilvl w:val="1"/>
-          <w:numId w:val="2"/>
+          <w:numId w:val="1"/>
         </w:numPr>
         <w:bidi w:val="0"/>
         <w:ind w:hanging="0" w:start="0"/>
         <w:jc w:val="start"/>
         <w:rPr/>
       </w:pPr>
-      <w:bookmarkStart w:id="27" w:name="__RefHeading___Toc834_1351480008"/>
-      <w:bookmarkEnd w:id="27"/>
-      <w:r>
-        <w:rPr/>
-        <w:t>Monitor Test</w:t>
+      <w:r>
+        <w:rPr/>
       </w:r>
     </w:p>
     <w:p>
@@ -8172,18 +8119,15 @@
         <w:pStyle w:val="Heading2"/>
         <w:numPr>
           <w:ilvl w:val="1"/>
-          <w:numId w:val="2"/>
+          <w:numId w:val="1"/>
         </w:numPr>
         <w:bidi w:val="0"/>
         <w:ind w:hanging="0" w:start="0"/>
         <w:jc w:val="start"/>
         <w:rPr/>
       </w:pPr>
-      <w:bookmarkStart w:id="28" w:name="__RefHeading___Toc836_1351480008"/>
-      <w:bookmarkEnd w:id="28"/>
-      <w:r>
-        <w:rPr/>
-        <w:t>Sound Test</w:t>
+      <w:r>
+        <w:rPr/>
       </w:r>
     </w:p>
     <w:p>
@@ -8191,18 +8135,541 @@
         <w:pStyle w:val="Heading2"/>
         <w:numPr>
           <w:ilvl w:val="1"/>
-          <w:numId w:val="2"/>
+          <w:numId w:val="1"/>
         </w:numPr>
         <w:bidi w:val="0"/>
         <w:ind w:hanging="0" w:start="0"/>
         <w:jc w:val="start"/>
         <w:rPr/>
       </w:pPr>
-      <w:bookmarkStart w:id="29" w:name="__RefHeading___Toc838_1351480008"/>
+      <w:bookmarkStart w:id="27" w:name="__RefHeading___Toc834_1351480008"/>
+      <w:bookmarkEnd w:id="27"/>
+      <w:r>
+        <w:rPr/>
+        <w:t>Monitor Test</w:t>
+      </w:r>
+    </w:p>
+    <w:p>
+      <w:pPr>
+        <w:pStyle w:val="BodyText"/>
+        <w:bidi w:val="0"/>
+        <w:ind w:hanging="0" w:start="0"/>
+        <w:jc w:val="start"/>
+        <w:rPr/>
+      </w:pPr>
+      <w:r>
+        <w:rPr/>
+        <w:t>This section will give a brief overview of what patterns are available. For a better understanding do additional research about dialing in the monitor.</w:t>
+      </w:r>
+    </w:p>
+    <w:p>
+      <w:pPr>
+        <w:pStyle w:val="Heading3"/>
+        <w:numPr>
+          <w:ilvl w:val="2"/>
+          <w:numId w:val="1"/>
+        </w:numPr>
+        <w:ind w:hanging="0" w:start="0"/>
+        <w:rPr/>
+      </w:pPr>
+      <w:bookmarkStart w:id="28" w:name="__RefHeading___Toc1244_4272816106"/>
+      <w:bookmarkEnd w:id="28"/>
+      <w:r>
+        <w:rPr/>
+        <w:drawing>
+          <wp:anchor distT="0" distB="0" distL="0" distR="0" simplePos="0" relativeHeight="17" behindDoc="0" locked="0" layoutInCell="0" allowOverlap="1">
+            <wp:simplePos x="0" y="0"/>
+            <wp:positionH relativeFrom="column">
+              <wp:posOffset>4501515</wp:posOffset>
+            </wp:positionH>
+            <wp:positionV relativeFrom="paragraph">
+              <wp:posOffset>149225</wp:posOffset>
+            </wp:positionV>
+            <wp:extent cx="1736090" cy="2303145"/>
+            <wp:effectExtent l="0" t="0" r="0" b="0"/>
+            <wp:wrapSquare wrapText="bothSides"/>
+            <wp:docPr id="14" name="Image12"/>
+            <wp:cNvGraphicFramePr>
+              <a:graphicFrameLocks xmlns:a="http://schemas.openxmlformats.org/drawingml/2006/main" noChangeAspect="1"/>
+            </wp:cNvGraphicFramePr>
+            <a:graphic xmlns:a="http://schemas.openxmlformats.org/drawingml/2006/main">
+              <a:graphicData uri="http://schemas.openxmlformats.org/drawingml/2006/picture">
+                <pic:pic xmlns:pic="http://schemas.openxmlformats.org/drawingml/2006/picture">
+                  <pic:nvPicPr>
+                    <pic:cNvPr id="14" name="Image12"/>
+                    <pic:cNvPicPr>
+                      <a:picLocks noChangeAspect="1" noChangeArrowheads="1"/>
+                    </pic:cNvPicPr>
+                  </pic:nvPicPr>
+                  <pic:blipFill>
+                    <a:blip r:embed="rId13"/>
+                    <a:stretch>
+                      <a:fillRect/>
+                    </a:stretch>
+                  </pic:blipFill>
+                  <pic:spPr bwMode="auto">
+                    <a:xfrm>
+                      <a:off x="0" y="0"/>
+                      <a:ext cx="1736090" cy="2303145"/>
+                    </a:xfrm>
+                    <a:prstGeom prst="rect">
+                      <a:avLst/>
+                    </a:prstGeom>
+                    <a:noFill/>
+                  </pic:spPr>
+                </pic:pic>
+              </a:graphicData>
+            </a:graphic>
+          </wp:anchor>
+        </w:drawing>
+      </w:r>
+      <w:r>
+        <w:rPr/>
+        <w:t>Pattern 0 – Checker Board</w:t>
+      </w:r>
+    </w:p>
+    <w:p>
+      <w:pPr>
+        <w:pStyle w:val="BodyText"/>
+        <w:rPr/>
+      </w:pPr>
+      <w:r>
+        <w:rPr/>
+        <w:t>This pattern can be used to adjust the drive, contrast, and brightness of the display. If contrast or drive is too high, the colors will “bleed” past the edges of the checker board. If they bleed past it, try turning down the appropriate drive or contrast of the monitor.</w:t>
+      </w:r>
+    </w:p>
+    <w:p>
+      <w:pPr>
+        <w:pStyle w:val="BodyText"/>
+        <w:rPr/>
+      </w:pPr>
+      <w:r>
+        <w:rPr/>
+      </w:r>
+    </w:p>
+    <w:p>
+      <w:pPr>
+        <w:pStyle w:val="BodyText"/>
+        <w:rPr/>
+      </w:pPr>
+      <w:r>
+        <w:rPr/>
+      </w:r>
+    </w:p>
+    <w:p>
+      <w:pPr>
+        <w:pStyle w:val="BodyText"/>
+        <w:rPr/>
+      </w:pPr>
+      <w:r>
+        <w:rPr/>
+      </w:r>
+    </w:p>
+    <w:p>
+      <w:pPr>
+        <w:pStyle w:val="BodyText"/>
+        <w:rPr/>
+      </w:pPr>
+      <w:r>
+        <w:rPr/>
+      </w:r>
+    </w:p>
+    <w:p>
+      <w:pPr>
+        <w:pStyle w:val="BodyText"/>
+        <w:rPr/>
+      </w:pPr>
+      <w:r>
+        <w:rPr/>
+      </w:r>
+    </w:p>
+    <w:p>
+      <w:pPr>
+        <w:pStyle w:val="Heading3"/>
+        <w:numPr>
+          <w:ilvl w:val="2"/>
+          <w:numId w:val="1"/>
+        </w:numPr>
+        <w:ind w:hanging="0" w:start="0"/>
+        <w:rPr/>
+      </w:pPr>
+      <w:bookmarkStart w:id="29" w:name="__RefHeading___Toc1246_4272816106"/>
       <w:bookmarkEnd w:id="29"/>
       <w:r>
         <w:rPr/>
-        <w:t>Music Test</w:t>
+        <w:drawing>
+          <wp:anchor distT="0" distB="0" distL="0" distR="0" simplePos="0" relativeHeight="18" behindDoc="0" locked="0" layoutInCell="0" allowOverlap="1">
+            <wp:simplePos x="0" y="0"/>
+            <wp:positionH relativeFrom="column">
+              <wp:posOffset>4489450</wp:posOffset>
+            </wp:positionH>
+            <wp:positionV relativeFrom="paragraph">
+              <wp:posOffset>118745</wp:posOffset>
+            </wp:positionV>
+            <wp:extent cx="1737360" cy="2313305"/>
+            <wp:effectExtent l="0" t="0" r="0" b="0"/>
+            <wp:wrapSquare wrapText="bothSides"/>
+            <wp:docPr id="15" name="Image13"/>
+            <wp:cNvGraphicFramePr>
+              <a:graphicFrameLocks xmlns:a="http://schemas.openxmlformats.org/drawingml/2006/main" noChangeAspect="1"/>
+            </wp:cNvGraphicFramePr>
+            <a:graphic xmlns:a="http://schemas.openxmlformats.org/drawingml/2006/main">
+              <a:graphicData uri="http://schemas.openxmlformats.org/drawingml/2006/picture">
+                <pic:pic xmlns:pic="http://schemas.openxmlformats.org/drawingml/2006/picture">
+                  <pic:nvPicPr>
+                    <pic:cNvPr id="15" name="Image13"/>
+                    <pic:cNvPicPr>
+                      <a:picLocks noChangeAspect="1" noChangeArrowheads="1"/>
+                    </pic:cNvPicPr>
+                  </pic:nvPicPr>
+                  <pic:blipFill>
+                    <a:blip r:embed="rId14"/>
+                    <a:stretch>
+                      <a:fillRect/>
+                    </a:stretch>
+                  </pic:blipFill>
+                  <pic:spPr bwMode="auto">
+                    <a:xfrm>
+                      <a:off x="0" y="0"/>
+                      <a:ext cx="1737360" cy="2313305"/>
+                    </a:xfrm>
+                    <a:prstGeom prst="rect">
+                      <a:avLst/>
+                    </a:prstGeom>
+                    <a:noFill/>
+                  </pic:spPr>
+                </pic:pic>
+              </a:graphicData>
+            </a:graphic>
+          </wp:anchor>
+        </w:drawing>
+      </w:r>
+      <w:r>
+        <w:rPr/>
+        <w:t xml:space="preserve">Pattern 1 – Grid </w:t>
+      </w:r>
+    </w:p>
+    <w:p>
+      <w:pPr>
+        <w:pStyle w:val="BodyText"/>
+        <w:rPr/>
+      </w:pPr>
+      <w:r>
+        <w:rPr/>
+        <w:t xml:space="preserve">This pattern is useful for adjusting the monitor’s convergence. </w:t>
+      </w:r>
+      <w:r>
+        <w:rPr/>
+        <w:t>Convergence issues look like colors separating from each other. They can be very tough to troubleshoot. The Wells Gardner K4900 manual has a good section about convergence adjustments. There is an issue where there are red and blue sections at the top of the screen. This is an issue with TKG hardware due to the fixed color palette for background objects. Unlike the checker board pattern, this could not be easily corrected.</w:t>
+      </w:r>
+    </w:p>
+    <w:p>
+      <w:pPr>
+        <w:pStyle w:val="BodyText"/>
+        <w:rPr/>
+      </w:pPr>
+      <w:r>
+        <w:rPr/>
+      </w:r>
+    </w:p>
+    <w:p>
+      <w:pPr>
+        <w:pStyle w:val="BodyText"/>
+        <w:rPr/>
+      </w:pPr>
+      <w:r>
+        <w:rPr/>
+      </w:r>
+    </w:p>
+    <w:p>
+      <w:pPr>
+        <w:pStyle w:val="BodyText"/>
+        <w:rPr/>
+      </w:pPr>
+      <w:r>
+        <w:rPr/>
+      </w:r>
+    </w:p>
+    <w:p>
+      <w:pPr>
+        <w:pStyle w:val="BodyText"/>
+        <w:rPr/>
+      </w:pPr>
+      <w:r>
+        <w:rPr/>
+      </w:r>
+    </w:p>
+    <w:p>
+      <w:pPr>
+        <w:pStyle w:val="BodyText"/>
+        <w:rPr/>
+      </w:pPr>
+      <w:r>
+        <w:rPr/>
+      </w:r>
+    </w:p>
+    <w:p>
+      <w:pPr>
+        <w:pStyle w:val="BodyText"/>
+        <w:rPr/>
+      </w:pPr>
+      <w:r>
+        <w:rPr/>
+      </w:r>
+    </w:p>
+    <w:p>
+      <w:pPr>
+        <w:pStyle w:val="BodyText"/>
+        <w:rPr/>
+      </w:pPr>
+      <w:r>
+        <w:rPr/>
+      </w:r>
+    </w:p>
+    <w:p>
+      <w:pPr>
+        <w:pStyle w:val="BodyText"/>
+        <w:rPr/>
+      </w:pPr>
+      <w:r>
+        <w:rPr/>
+      </w:r>
+    </w:p>
+    <w:p>
+      <w:pPr>
+        <w:pStyle w:val="Heading3"/>
+        <w:numPr>
+          <w:ilvl w:val="2"/>
+          <w:numId w:val="1"/>
+        </w:numPr>
+        <w:ind w:hanging="0" w:start="0"/>
+        <w:rPr/>
+      </w:pPr>
+      <w:bookmarkStart w:id="30" w:name="__RefHeading___Toc1248_4272816106"/>
+      <w:bookmarkEnd w:id="30"/>
+      <w:r>
+        <w:rPr/>
+        <w:t>Pattern 2 – Block</w:t>
+      </w:r>
+    </w:p>
+    <w:p>
+      <w:pPr>
+        <w:pStyle w:val="Heading3"/>
+        <w:numPr>
+          <w:ilvl w:val="2"/>
+          <w:numId w:val="1"/>
+        </w:numPr>
+        <w:ind w:hanging="0" w:start="0"/>
+        <w:rPr/>
+      </w:pPr>
+      <w:bookmarkStart w:id="31" w:name="__RefHeading___Toc1250_4272816106"/>
+      <w:bookmarkEnd w:id="31"/>
+      <w:r>
+        <w:rPr/>
+        <w:t>Pattern 2 - Block</w:t>
+      </w:r>
+    </w:p>
+    <w:p>
+      <w:pPr>
+        <w:pStyle w:val="BodyText"/>
+        <w:rPr/>
+      </w:pPr>
+      <w:r>
+        <w:rPr/>
+        <w:t>This section is to just give a solid background. The background is primarily white so it could be used to adjust the color to not have a hue. It can also be used to verify that there aren’t issues with the color PROMs. The color of the test is dependent on which palette is selected in the runtime menu.</w:t>
+      </w:r>
+    </w:p>
+    <w:p>
+      <w:pPr>
+        <w:pStyle w:val="BodyText"/>
+        <w:rPr/>
+      </w:pPr>
+      <w:r>
+        <w:rPr/>
+        <w:drawing>
+          <wp:anchor distT="0" distB="0" distL="0" distR="0" simplePos="0" relativeHeight="19" behindDoc="0" locked="0" layoutInCell="0" allowOverlap="1">
+            <wp:simplePos x="0" y="0"/>
+            <wp:positionH relativeFrom="column">
+              <wp:posOffset>12065</wp:posOffset>
+            </wp:positionH>
+            <wp:positionV relativeFrom="paragraph">
+              <wp:posOffset>-74930</wp:posOffset>
+            </wp:positionV>
+            <wp:extent cx="1506855" cy="2004695"/>
+            <wp:effectExtent l="0" t="0" r="0" b="0"/>
+            <wp:wrapSquare wrapText="largest"/>
+            <wp:docPr id="16" name="Image14"/>
+            <wp:cNvGraphicFramePr>
+              <a:graphicFrameLocks xmlns:a="http://schemas.openxmlformats.org/drawingml/2006/main" noChangeAspect="1"/>
+            </wp:cNvGraphicFramePr>
+            <a:graphic xmlns:a="http://schemas.openxmlformats.org/drawingml/2006/main">
+              <a:graphicData uri="http://schemas.openxmlformats.org/drawingml/2006/picture">
+                <pic:pic xmlns:pic="http://schemas.openxmlformats.org/drawingml/2006/picture">
+                  <pic:nvPicPr>
+                    <pic:cNvPr id="16" name="Image14"/>
+                    <pic:cNvPicPr>
+                      <a:picLocks noChangeAspect="1" noChangeArrowheads="1"/>
+                    </pic:cNvPicPr>
+                  </pic:nvPicPr>
+                  <pic:blipFill>
+                    <a:blip r:embed="rId15"/>
+                    <a:stretch>
+                      <a:fillRect/>
+                    </a:stretch>
+                  </pic:blipFill>
+                  <pic:spPr bwMode="auto">
+                    <a:xfrm>
+                      <a:off x="0" y="0"/>
+                      <a:ext cx="1506855" cy="2004695"/>
+                    </a:xfrm>
+                    <a:prstGeom prst="rect">
+                      <a:avLst/>
+                    </a:prstGeom>
+                    <a:noFill/>
+                  </pic:spPr>
+                </pic:pic>
+              </a:graphicData>
+            </a:graphic>
+          </wp:anchor>
+        </w:drawing>
+        <w:drawing>
+          <wp:anchor distT="0" distB="0" distL="0" distR="0" simplePos="0" relativeHeight="20" behindDoc="0" locked="0" layoutInCell="0" allowOverlap="1">
+            <wp:simplePos x="0" y="0"/>
+            <wp:positionH relativeFrom="column">
+              <wp:posOffset>1573530</wp:posOffset>
+            </wp:positionH>
+            <wp:positionV relativeFrom="paragraph">
+              <wp:posOffset>-73025</wp:posOffset>
+            </wp:positionV>
+            <wp:extent cx="1508760" cy="1993265"/>
+            <wp:effectExtent l="0" t="0" r="0" b="0"/>
+            <wp:wrapSquare wrapText="largest"/>
+            <wp:docPr id="17" name="Image15"/>
+            <wp:cNvGraphicFramePr>
+              <a:graphicFrameLocks xmlns:a="http://schemas.openxmlformats.org/drawingml/2006/main" noChangeAspect="1"/>
+            </wp:cNvGraphicFramePr>
+            <a:graphic xmlns:a="http://schemas.openxmlformats.org/drawingml/2006/main">
+              <a:graphicData uri="http://schemas.openxmlformats.org/drawingml/2006/picture">
+                <pic:pic xmlns:pic="http://schemas.openxmlformats.org/drawingml/2006/picture">
+                  <pic:nvPicPr>
+                    <pic:cNvPr id="17" name="Image15"/>
+                    <pic:cNvPicPr>
+                      <a:picLocks noChangeAspect="1" noChangeArrowheads="1"/>
+                    </pic:cNvPicPr>
+                  </pic:nvPicPr>
+                  <pic:blipFill>
+                    <a:blip r:embed="rId16"/>
+                    <a:stretch>
+                      <a:fillRect/>
+                    </a:stretch>
+                  </pic:blipFill>
+                  <pic:spPr bwMode="auto">
+                    <a:xfrm>
+                      <a:off x="0" y="0"/>
+                      <a:ext cx="1508760" cy="1993265"/>
+                    </a:xfrm>
+                    <a:prstGeom prst="rect">
+                      <a:avLst/>
+                    </a:prstGeom>
+                    <a:noFill/>
+                  </pic:spPr>
+                </pic:pic>
+              </a:graphicData>
+            </a:graphic>
+          </wp:anchor>
+        </w:drawing>
+        <w:drawing>
+          <wp:anchor distT="0" distB="0" distL="0" distR="0" simplePos="0" relativeHeight="21" behindDoc="0" locked="0" layoutInCell="0" allowOverlap="1">
+            <wp:simplePos x="0" y="0"/>
+            <wp:positionH relativeFrom="column">
+              <wp:posOffset>3124835</wp:posOffset>
+            </wp:positionH>
+            <wp:positionV relativeFrom="paragraph">
+              <wp:posOffset>-73025</wp:posOffset>
+            </wp:positionV>
+            <wp:extent cx="1499870" cy="2002790"/>
+            <wp:effectExtent l="0" t="0" r="0" b="0"/>
+            <wp:wrapSquare wrapText="largest"/>
+            <wp:docPr id="18" name="Image16"/>
+            <wp:cNvGraphicFramePr>
+              <a:graphicFrameLocks xmlns:a="http://schemas.openxmlformats.org/drawingml/2006/main" noChangeAspect="1"/>
+            </wp:cNvGraphicFramePr>
+            <a:graphic xmlns:a="http://schemas.openxmlformats.org/drawingml/2006/main">
+              <a:graphicData uri="http://schemas.openxmlformats.org/drawingml/2006/picture">
+                <pic:pic xmlns:pic="http://schemas.openxmlformats.org/drawingml/2006/picture">
+                  <pic:nvPicPr>
+                    <pic:cNvPr id="18" name="Image16"/>
+                    <pic:cNvPicPr>
+                      <a:picLocks noChangeAspect="1" noChangeArrowheads="1"/>
+                    </pic:cNvPicPr>
+                  </pic:nvPicPr>
+                  <pic:blipFill>
+                    <a:blip r:embed="rId17"/>
+                    <a:stretch>
+                      <a:fillRect/>
+                    </a:stretch>
+                  </pic:blipFill>
+                  <pic:spPr bwMode="auto">
+                    <a:xfrm>
+                      <a:off x="0" y="0"/>
+                      <a:ext cx="1499870" cy="2002790"/>
+                    </a:xfrm>
+                    <a:prstGeom prst="rect">
+                      <a:avLst/>
+                    </a:prstGeom>
+                    <a:noFill/>
+                  </pic:spPr>
+                </pic:pic>
+              </a:graphicData>
+            </a:graphic>
+          </wp:anchor>
+        </w:drawing>
+        <w:drawing>
+          <wp:anchor distT="0" distB="0" distL="0" distR="0" simplePos="0" relativeHeight="22" behindDoc="0" locked="0" layoutInCell="0" allowOverlap="1">
+            <wp:simplePos x="0" y="0"/>
+            <wp:positionH relativeFrom="column">
+              <wp:posOffset>4681220</wp:posOffset>
+            </wp:positionH>
+            <wp:positionV relativeFrom="paragraph">
+              <wp:posOffset>-73025</wp:posOffset>
+            </wp:positionV>
+            <wp:extent cx="1508760" cy="2002790"/>
+            <wp:effectExtent l="0" t="0" r="0" b="0"/>
+            <wp:wrapSquare wrapText="largest"/>
+            <wp:docPr id="19" name="Image17"/>
+            <wp:cNvGraphicFramePr>
+              <a:graphicFrameLocks xmlns:a="http://schemas.openxmlformats.org/drawingml/2006/main" noChangeAspect="1"/>
+            </wp:cNvGraphicFramePr>
+            <a:graphic xmlns:a="http://schemas.openxmlformats.org/drawingml/2006/main">
+              <a:graphicData uri="http://schemas.openxmlformats.org/drawingml/2006/picture">
+                <pic:pic xmlns:pic="http://schemas.openxmlformats.org/drawingml/2006/picture">
+                  <pic:nvPicPr>
+                    <pic:cNvPr id="19" name="Image17"/>
+                    <pic:cNvPicPr>
+                      <a:picLocks noChangeAspect="1" noChangeArrowheads="1"/>
+                    </pic:cNvPicPr>
+                  </pic:nvPicPr>
+                  <pic:blipFill>
+                    <a:blip r:embed="rId18"/>
+                    <a:stretch>
+                      <a:fillRect/>
+                    </a:stretch>
+                  </pic:blipFill>
+                  <pic:spPr bwMode="auto">
+                    <a:xfrm>
+                      <a:off x="0" y="0"/>
+                      <a:ext cx="1508760" cy="2002790"/>
+                    </a:xfrm>
+                    <a:prstGeom prst="rect">
+                      <a:avLst/>
+                    </a:prstGeom>
+                    <a:noFill/>
+                  </pic:spPr>
+                </pic:pic>
+              </a:graphicData>
+            </a:graphic>
+          </wp:anchor>
+        </w:drawing>
       </w:r>
     </w:p>
     <w:p>
@@ -8210,18 +8677,15 @@
         <w:pStyle w:val="Heading2"/>
         <w:numPr>
           <w:ilvl w:val="1"/>
-          <w:numId w:val="2"/>
+          <w:numId w:val="1"/>
         </w:numPr>
         <w:bidi w:val="0"/>
         <w:ind w:hanging="0" w:start="0"/>
         <w:jc w:val="start"/>
         <w:rPr/>
       </w:pPr>
-      <w:bookmarkStart w:id="30" w:name="__RefHeading___Toc840_1351480008"/>
-      <w:bookmarkEnd w:id="30"/>
-      <w:r>
-        <w:rPr/>
-        <w:t>Background Test</w:t>
+      <w:r>
+        <w:rPr/>
       </w:r>
     </w:p>
     <w:p>
@@ -8229,18 +8693,15 @@
         <w:pStyle w:val="Heading2"/>
         <w:numPr>
           <w:ilvl w:val="1"/>
-          <w:numId w:val="2"/>
+          <w:numId w:val="1"/>
         </w:numPr>
         <w:bidi w:val="0"/>
         <w:ind w:hanging="0" w:start="0"/>
         <w:jc w:val="start"/>
         <w:rPr/>
       </w:pPr>
-      <w:bookmarkStart w:id="31" w:name="__RefHeading___Toc842_1351480008"/>
-      <w:bookmarkEnd w:id="31"/>
-      <w:r>
-        <w:rPr/>
-        <w:t>Sprite Test</w:t>
+      <w:r>
+        <w:rPr/>
       </w:r>
     </w:p>
     <w:p>
@@ -8248,18 +8709,407 @@
         <w:pStyle w:val="Heading2"/>
         <w:numPr>
           <w:ilvl w:val="1"/>
-          <w:numId w:val="2"/>
+          <w:numId w:val="1"/>
         </w:numPr>
         <w:bidi w:val="0"/>
         <w:ind w:hanging="0" w:start="0"/>
         <w:jc w:val="start"/>
         <w:rPr/>
       </w:pPr>
-      <w:bookmarkStart w:id="32" w:name="__RefHeading___Toc844_1351480008"/>
+      <w:r>
+        <w:rPr/>
+      </w:r>
+    </w:p>
+    <w:p>
+      <w:pPr>
+        <w:pStyle w:val="Heading2"/>
+        <w:numPr>
+          <w:ilvl w:val="1"/>
+          <w:numId w:val="1"/>
+        </w:numPr>
+        <w:bidi w:val="0"/>
+        <w:ind w:hanging="0" w:start="0"/>
+        <w:jc w:val="start"/>
+        <w:rPr/>
+      </w:pPr>
+      <w:r>
+        <w:rPr/>
+      </w:r>
+    </w:p>
+    <w:p>
+      <w:pPr>
+        <w:pStyle w:val="Heading2"/>
+        <w:numPr>
+          <w:ilvl w:val="1"/>
+          <w:numId w:val="1"/>
+        </w:numPr>
+        <w:bidi w:val="0"/>
+        <w:ind w:hanging="0" w:start="0"/>
+        <w:jc w:val="start"/>
+        <w:rPr/>
+      </w:pPr>
+      <w:r>
+        <w:rPr/>
+      </w:r>
+    </w:p>
+    <w:p>
+      <w:pPr>
+        <w:pStyle w:val="BodyText"/>
+        <w:numPr>
+          <w:ilvl w:val="1"/>
+          <w:numId w:val="1"/>
+        </w:numPr>
+        <w:rPr/>
+      </w:pPr>
+      <w:r>
+        <w:rPr/>
+        <mc:AlternateContent>
+          <mc:Choice Requires="wps">
+            <w:drawing>
+              <wp:anchor distT="0" distB="0" distL="0" distR="0" simplePos="0" relativeHeight="23" behindDoc="0" locked="0" layoutInCell="1" allowOverlap="1">
+                <wp:simplePos x="0" y="0"/>
+                <wp:positionH relativeFrom="column">
+                  <wp:posOffset>12065</wp:posOffset>
+                </wp:positionH>
+                <wp:positionV relativeFrom="paragraph">
+                  <wp:posOffset>-71755</wp:posOffset>
+                </wp:positionV>
+                <wp:extent cx="1499235" cy="175895"/>
+                <wp:effectExtent l="0" t="0" r="0" b="0"/>
+                <wp:wrapNone/>
+                <wp:docPr id="20" name="Text Frame 3"/>
+                <a:graphic xmlns:a="http://schemas.openxmlformats.org/drawingml/2006/main">
+                  <a:graphicData uri="http://schemas.microsoft.com/office/word/2010/wordprocessingShape">
+                    <wps:wsp>
+                      <wps:cNvSpPr txBox="1"/>
+                      <wps:spPr>
+                        <a:xfrm>
+                          <a:off x="0" y="0"/>
+                          <a:ext cx="1499400" cy="176040"/>
+                        </a:xfrm>
+                        <a:prstGeom prst="rect">
+                          <a:avLst/>
+                        </a:prstGeom>
+                        <a:noFill/>
+                        <a:ln w="0">
+                          <a:noFill/>
+                        </a:ln>
+                      </wps:spPr>
+                      <wps:txbx>
+                        <w:txbxContent>
+                          <w:p>
+                            <w:pPr>
+                              <w:overflowPunct w:val="false"/>
+                              <w:jc w:val="center"/>
+                              <w:rPr/>
+                            </w:pPr>
+                            <w:r>
+                              <w:rPr/>
+                              <w:t>Palette 0</w:t>
+                            </w:r>
+                          </w:p>
+                        </w:txbxContent>
+                      </wps:txbx>
+                      <wps:bodyPr wrap="square" lIns="0" tIns="0" rIns="0" bIns="0" anchor="t">
+                        <a:noAutofit/>
+                      </wps:bodyPr>
+                    </wps:wsp>
+                  </a:graphicData>
+                </a:graphic>
+              </wp:anchor>
+            </w:drawing>
+          </mc:Choice>
+          <mc:Fallback>
+            <w:pict>
+              <v:shapetype id="_x0000_t202" coordsize="21600,21600" o:spt="202" path="m,l,21600l21600,21600l21600,xe">
+                <v:stroke joinstyle="miter"/>
+                <v:path gradientshapeok="t" o:connecttype="rect"/>
+              </v:shapetype>
+              <v:shape id="shape_0" stroked="f" o:allowincell="f" style="position:absolute;margin-left:0.95pt;margin-top:-5.65pt;width:118pt;height:13.8pt;mso-wrap-style:square;v-text-anchor:top" type="_x0000_t202">
+                <v:textbox>
+                  <w:txbxContent>
+                    <w:p>
+                      <w:pPr>
+                        <w:overflowPunct w:val="false"/>
+                        <w:jc w:val="center"/>
+                        <w:rPr/>
+                      </w:pPr>
+                      <w:r>
+                        <w:rPr/>
+                        <w:t>Palette 0</w:t>
+                      </w:r>
+                    </w:p>
+                  </w:txbxContent>
+                </v:textbox>
+                <v:fill o:detectmouseclick="t" on="false"/>
+                <v:stroke color="black" joinstyle="round" endcap="flat"/>
+                <w10:wrap type="none"/>
+              </v:shape>
+            </w:pict>
+          </mc:Fallback>
+        </mc:AlternateContent>
+        <mc:AlternateContent>
+          <mc:Choice Requires="wps">
+            <w:drawing>
+              <wp:anchor distT="0" distB="0" distL="0" distR="0" simplePos="0" relativeHeight="24" behindDoc="0" locked="0" layoutInCell="1" allowOverlap="1">
+                <wp:simplePos x="0" y="0"/>
+                <wp:positionH relativeFrom="column">
+                  <wp:posOffset>1579880</wp:posOffset>
+                </wp:positionH>
+                <wp:positionV relativeFrom="paragraph">
+                  <wp:posOffset>-71755</wp:posOffset>
+                </wp:positionV>
+                <wp:extent cx="1499235" cy="175895"/>
+                <wp:effectExtent l="0" t="0" r="0" b="0"/>
+                <wp:wrapNone/>
+                <wp:docPr id="21" name="Text Frame 5"/>
+                <a:graphic xmlns:a="http://schemas.openxmlformats.org/drawingml/2006/main">
+                  <a:graphicData uri="http://schemas.microsoft.com/office/word/2010/wordprocessingShape">
+                    <wps:wsp>
+                      <wps:cNvSpPr txBox="1"/>
+                      <wps:spPr>
+                        <a:xfrm>
+                          <a:off x="0" y="0"/>
+                          <a:ext cx="1499400" cy="176040"/>
+                        </a:xfrm>
+                        <a:prstGeom prst="rect">
+                          <a:avLst/>
+                        </a:prstGeom>
+                        <a:noFill/>
+                        <a:ln w="0">
+                          <a:noFill/>
+                        </a:ln>
+                      </wps:spPr>
+                      <wps:txbx>
+                        <w:txbxContent>
+                          <w:p>
+                            <w:pPr>
+                              <w:overflowPunct w:val="false"/>
+                              <w:jc w:val="center"/>
+                              <w:rPr/>
+                            </w:pPr>
+                            <w:r>
+                              <w:rPr/>
+                              <w:t>Palette 1</w:t>
+                            </w:r>
+                          </w:p>
+                        </w:txbxContent>
+                      </wps:txbx>
+                      <wps:bodyPr wrap="square" lIns="0" tIns="0" rIns="0" bIns="0" anchor="t">
+                        <a:noAutofit/>
+                      </wps:bodyPr>
+                    </wps:wsp>
+                  </a:graphicData>
+                </a:graphic>
+              </wp:anchor>
+            </w:drawing>
+          </mc:Choice>
+          <mc:Fallback>
+            <w:pict>
+              <v:shape id="shape_0" stroked="f" o:allowincell="f" style="position:absolute;margin-left:124.4pt;margin-top:-5.65pt;width:118pt;height:13.8pt;mso-wrap-style:square;v-text-anchor:top" type="_x0000_t202">
+                <v:textbox>
+                  <w:txbxContent>
+                    <w:p>
+                      <w:pPr>
+                        <w:overflowPunct w:val="false"/>
+                        <w:jc w:val="center"/>
+                        <w:rPr/>
+                      </w:pPr>
+                      <w:r>
+                        <w:rPr/>
+                        <w:t>Palette 1</w:t>
+                      </w:r>
+                    </w:p>
+                  </w:txbxContent>
+                </v:textbox>
+                <v:fill o:detectmouseclick="t" on="false"/>
+                <v:stroke color="black" joinstyle="round" endcap="flat"/>
+                <w10:wrap type="none"/>
+              </v:shape>
+            </w:pict>
+          </mc:Fallback>
+        </mc:AlternateContent>
+        <mc:AlternateContent>
+          <mc:Choice Requires="wps">
+            <w:drawing>
+              <wp:anchor distT="0" distB="0" distL="0" distR="0" simplePos="0" relativeHeight="25" behindDoc="0" locked="0" layoutInCell="1" allowOverlap="1">
+                <wp:simplePos x="0" y="0"/>
+                <wp:positionH relativeFrom="column">
+                  <wp:posOffset>3124835</wp:posOffset>
+                </wp:positionH>
+                <wp:positionV relativeFrom="paragraph">
+                  <wp:posOffset>-71755</wp:posOffset>
+                </wp:positionV>
+                <wp:extent cx="1499235" cy="175895"/>
+                <wp:effectExtent l="0" t="0" r="0" b="0"/>
+                <wp:wrapNone/>
+                <wp:docPr id="22" name="Text Frame 6"/>
+                <a:graphic xmlns:a="http://schemas.openxmlformats.org/drawingml/2006/main">
+                  <a:graphicData uri="http://schemas.microsoft.com/office/word/2010/wordprocessingShape">
+                    <wps:wsp>
+                      <wps:cNvSpPr txBox="1"/>
+                      <wps:spPr>
+                        <a:xfrm>
+                          <a:off x="0" y="0"/>
+                          <a:ext cx="1499400" cy="176040"/>
+                        </a:xfrm>
+                        <a:prstGeom prst="rect">
+                          <a:avLst/>
+                        </a:prstGeom>
+                        <a:noFill/>
+                        <a:ln w="0">
+                          <a:noFill/>
+                        </a:ln>
+                      </wps:spPr>
+                      <wps:txbx>
+                        <w:txbxContent>
+                          <w:p>
+                            <w:pPr>
+                              <w:overflowPunct w:val="false"/>
+                              <w:jc w:val="center"/>
+                              <w:rPr/>
+                            </w:pPr>
+                            <w:r>
+                              <w:rPr/>
+                              <w:t>Palette 2</w:t>
+                            </w:r>
+                          </w:p>
+                        </w:txbxContent>
+                      </wps:txbx>
+                      <wps:bodyPr wrap="square" lIns="0" tIns="0" rIns="0" bIns="0" anchor="t">
+                        <a:noAutofit/>
+                      </wps:bodyPr>
+                    </wps:wsp>
+                  </a:graphicData>
+                </a:graphic>
+              </wp:anchor>
+            </w:drawing>
+          </mc:Choice>
+          <mc:Fallback>
+            <w:pict>
+              <v:shape id="shape_0" stroked="f" o:allowincell="f" style="position:absolute;margin-left:246.05pt;margin-top:-5.65pt;width:118pt;height:13.8pt;mso-wrap-style:square;v-text-anchor:top" type="_x0000_t202">
+                <v:textbox>
+                  <w:txbxContent>
+                    <w:p>
+                      <w:pPr>
+                        <w:overflowPunct w:val="false"/>
+                        <w:jc w:val="center"/>
+                        <w:rPr/>
+                      </w:pPr>
+                      <w:r>
+                        <w:rPr/>
+                        <w:t>Palette 2</w:t>
+                      </w:r>
+                    </w:p>
+                  </w:txbxContent>
+                </v:textbox>
+                <v:fill o:detectmouseclick="t" on="false"/>
+                <v:stroke color="black" joinstyle="round" endcap="flat"/>
+                <w10:wrap type="none"/>
+              </v:shape>
+            </w:pict>
+          </mc:Fallback>
+        </mc:AlternateContent>
+        <mc:AlternateContent>
+          <mc:Choice Requires="wps">
+            <w:drawing>
+              <wp:anchor distT="0" distB="0" distL="0" distR="0" simplePos="0" relativeHeight="26" behindDoc="0" locked="0" layoutInCell="1" allowOverlap="1">
+                <wp:simplePos x="0" y="0"/>
+                <wp:positionH relativeFrom="column">
+                  <wp:posOffset>4679315</wp:posOffset>
+                </wp:positionH>
+                <wp:positionV relativeFrom="paragraph">
+                  <wp:posOffset>-71755</wp:posOffset>
+                </wp:positionV>
+                <wp:extent cx="1499235" cy="175895"/>
+                <wp:effectExtent l="0" t="0" r="0" b="0"/>
+                <wp:wrapNone/>
+                <wp:docPr id="23" name="Text Frame 7"/>
+                <a:graphic xmlns:a="http://schemas.openxmlformats.org/drawingml/2006/main">
+                  <a:graphicData uri="http://schemas.microsoft.com/office/word/2010/wordprocessingShape">
+                    <wps:wsp>
+                      <wps:cNvSpPr txBox="1"/>
+                      <wps:spPr>
+                        <a:xfrm>
+                          <a:off x="0" y="0"/>
+                          <a:ext cx="1499400" cy="176040"/>
+                        </a:xfrm>
+                        <a:prstGeom prst="rect">
+                          <a:avLst/>
+                        </a:prstGeom>
+                        <a:noFill/>
+                        <a:ln w="0">
+                          <a:noFill/>
+                        </a:ln>
+                      </wps:spPr>
+                      <wps:txbx>
+                        <w:txbxContent>
+                          <w:p>
+                            <w:pPr>
+                              <w:overflowPunct w:val="false"/>
+                              <w:jc w:val="center"/>
+                              <w:rPr/>
+                            </w:pPr>
+                            <w:r>
+                              <w:rPr/>
+                              <w:t>Palette 3</w:t>
+                            </w:r>
+                          </w:p>
+                        </w:txbxContent>
+                      </wps:txbx>
+                      <wps:bodyPr wrap="square" lIns="0" tIns="0" rIns="0" bIns="0" anchor="t">
+                        <a:noAutofit/>
+                      </wps:bodyPr>
+                    </wps:wsp>
+                  </a:graphicData>
+                </a:graphic>
+              </wp:anchor>
+            </w:drawing>
+          </mc:Choice>
+          <mc:Fallback>
+            <w:pict>
+              <v:shape id="shape_0" stroked="f" o:allowincell="f" style="position:absolute;margin-left:368.45pt;margin-top:-5.65pt;width:118pt;height:13.8pt;mso-wrap-style:square;v-text-anchor:top" type="_x0000_t202">
+                <v:textbox>
+                  <w:txbxContent>
+                    <w:p>
+                      <w:pPr>
+                        <w:overflowPunct w:val="false"/>
+                        <w:jc w:val="center"/>
+                        <w:rPr/>
+                      </w:pPr>
+                      <w:r>
+                        <w:rPr/>
+                        <w:t>Palette 3</w:t>
+                      </w:r>
+                    </w:p>
+                  </w:txbxContent>
+                </v:textbox>
+                <v:fill o:detectmouseclick="t" on="false"/>
+                <v:stroke color="black" joinstyle="round" endcap="flat"/>
+                <w10:wrap type="none"/>
+              </v:shape>
+            </w:pict>
+          </mc:Fallback>
+        </mc:AlternateContent>
+      </w:r>
+    </w:p>
+    <w:p>
+      <w:pPr>
+        <w:pStyle w:val="Heading2"/>
+        <w:numPr>
+          <w:ilvl w:val="1"/>
+          <w:numId w:val="1"/>
+        </w:numPr>
+        <w:bidi w:val="0"/>
+        <w:ind w:hanging="0" w:start="0"/>
+        <w:jc w:val="start"/>
+        <w:rPr/>
+      </w:pPr>
+      <w:bookmarkStart w:id="32" w:name="__RefHeading___Toc836_1351480008"/>
       <w:bookmarkEnd w:id="32"/>
       <w:r>
         <w:rPr/>
-        <w:t>Reset</w:t>
+        <w:t>Sound Test</w:t>
       </w:r>
     </w:p>
     <w:p>
@@ -8272,11 +9122,855 @@
       </w:pPr>
       <w:r>
         <w:rPr/>
-        <w:t xml:space="preserve">This is not really a test. It’s only purpose is to enter a loop to wait for the watchdog to reset the hardware. If there is no watchdog present, then it will timeout and jump back to $0000 where all the startup tests will run again. </w:t>
-      </w:r>
-      <w:r>
-        <w:rPr/>
-        <w:t>During this waiting period between initiating the reset and the actual reset it will print “reset in progress”.</w:t>
+        <w:t>There are seven total dedicated sounds. Some are discretely generated and some are generated by the 8035 MPU. The startup test plays each sound but these can all be selected in the test menu.</w:t>
+      </w:r>
+    </w:p>
+    <w:tbl>
+      <w:tblPr>
+        <w:tblW w:w="8463" w:type="dxa"/>
+        <w:jc w:val="start"/>
+        <w:tblInd w:w="-22" w:type="dxa"/>
+        <w:tblLayout w:type="fixed"/>
+        <w:tblCellMar>
+          <w:top w:w="55" w:type="dxa"/>
+          <w:start w:w="55" w:type="dxa"/>
+          <w:bottom w:w="55" w:type="dxa"/>
+          <w:end w:w="55" w:type="dxa"/>
+        </w:tblCellMar>
+      </w:tblPr>
+      <w:tblGrid>
+        <w:gridCol w:w="1225"/>
+        <w:gridCol w:w="2375"/>
+        <w:gridCol w:w="3238"/>
+        <w:gridCol w:w="1625"/>
+      </w:tblGrid>
+      <w:tr>
+        <w:trPr>
+          <w:trHeight w:val="88" w:hRule="atLeast"/>
+        </w:trPr>
+        <w:tc>
+          <w:tcPr>
+            <w:tcW w:w="1225" w:type="dxa"/>
+            <w:tcBorders>
+              <w:top w:val="single" w:sz="18" w:space="0" w:color="000000"/>
+              <w:start w:val="single" w:sz="18" w:space="0" w:color="000000"/>
+              <w:bottom w:val="single" w:sz="4" w:space="0" w:color="000000"/>
+            </w:tcBorders>
+          </w:tcPr>
+          <w:p>
+            <w:pPr>
+              <w:pStyle w:val="TableContents"/>
+              <w:rPr>
+                <w:b/>
+                <w:bCs/>
+              </w:rPr>
+            </w:pPr>
+            <w:r>
+              <w:rPr>
+                <w:b/>
+                <w:bCs/>
+              </w:rPr>
+              <w:t>Sound ID</w:t>
+            </w:r>
+          </w:p>
+        </w:tc>
+        <w:tc>
+          <w:tcPr>
+            <w:tcW w:w="2375" w:type="dxa"/>
+            <w:tcBorders>
+              <w:top w:val="single" w:sz="18" w:space="0" w:color="000000"/>
+              <w:start w:val="single" w:sz="4" w:space="0" w:color="000000"/>
+              <w:bottom w:val="single" w:sz="4" w:space="0" w:color="000000"/>
+            </w:tcBorders>
+          </w:tcPr>
+          <w:p>
+            <w:pPr>
+              <w:pStyle w:val="TableContents"/>
+              <w:rPr>
+                <w:b/>
+                <w:bCs/>
+              </w:rPr>
+            </w:pPr>
+            <w:r>
+              <w:rPr>
+                <w:b/>
+                <w:bCs/>
+              </w:rPr>
+              <w:t>Name</w:t>
+            </w:r>
+          </w:p>
+        </w:tc>
+        <w:tc>
+          <w:tcPr>
+            <w:tcW w:w="3238" w:type="dxa"/>
+            <w:tcBorders>
+              <w:top w:val="single" w:sz="18" w:space="0" w:color="000000"/>
+              <w:start w:val="single" w:sz="4" w:space="0" w:color="000000"/>
+              <w:bottom w:val="single" w:sz="4" w:space="0" w:color="000000"/>
+            </w:tcBorders>
+          </w:tcPr>
+          <w:p>
+            <w:pPr>
+              <w:pStyle w:val="TableContents"/>
+              <w:rPr>
+                <w:b/>
+                <w:bCs/>
+              </w:rPr>
+            </w:pPr>
+            <w:r>
+              <w:rPr>
+                <w:b/>
+                <w:bCs/>
+              </w:rPr>
+              <w:t>Discretely generated or MPU?</w:t>
+            </w:r>
+          </w:p>
+        </w:tc>
+        <w:tc>
+          <w:tcPr>
+            <w:tcW w:w="1625" w:type="dxa"/>
+            <w:tcBorders>
+              <w:top w:val="single" w:sz="18" w:space="0" w:color="000000"/>
+              <w:start w:val="single" w:sz="4" w:space="0" w:color="000000"/>
+              <w:bottom w:val="single" w:sz="4" w:space="0" w:color="000000"/>
+              <w:end w:val="single" w:sz="18" w:space="0" w:color="000000"/>
+            </w:tcBorders>
+          </w:tcPr>
+          <w:p>
+            <w:pPr>
+              <w:pStyle w:val="TableContents"/>
+              <w:rPr>
+                <w:b/>
+                <w:bCs/>
+              </w:rPr>
+            </w:pPr>
+            <w:r>
+              <w:rPr>
+                <w:b/>
+                <w:bCs/>
+              </w:rPr>
+              <w:t>Write Address</w:t>
+            </w:r>
+          </w:p>
+        </w:tc>
+      </w:tr>
+      <w:tr>
+        <w:trPr/>
+        <w:tc>
+          <w:tcPr>
+            <w:tcW w:w="1225" w:type="dxa"/>
+            <w:tcBorders>
+              <w:start w:val="single" w:sz="18" w:space="0" w:color="000000"/>
+              <w:bottom w:val="single" w:sz="4" w:space="0" w:color="000000"/>
+            </w:tcBorders>
+          </w:tcPr>
+          <w:p>
+            <w:pPr>
+              <w:pStyle w:val="TableContents"/>
+              <w:rPr/>
+            </w:pPr>
+            <w:r>
+              <w:rPr/>
+              <w:t>0</w:t>
+            </w:r>
+          </w:p>
+        </w:tc>
+        <w:tc>
+          <w:tcPr>
+            <w:tcW w:w="2375" w:type="dxa"/>
+            <w:tcBorders>
+              <w:start w:val="single" w:sz="4" w:space="0" w:color="000000"/>
+              <w:bottom w:val="single" w:sz="4" w:space="0" w:color="000000"/>
+            </w:tcBorders>
+          </w:tcPr>
+          <w:p>
+            <w:pPr>
+              <w:pStyle w:val="TableContents"/>
+              <w:rPr/>
+            </w:pPr>
+            <w:r>
+              <w:rPr/>
+              <w:t>Walking/Shoe Squeak</w:t>
+            </w:r>
+          </w:p>
+        </w:tc>
+        <w:tc>
+          <w:tcPr>
+            <w:tcW w:w="3238" w:type="dxa"/>
+            <w:tcBorders>
+              <w:start w:val="single" w:sz="4" w:space="0" w:color="000000"/>
+              <w:bottom w:val="single" w:sz="4" w:space="0" w:color="000000"/>
+            </w:tcBorders>
+          </w:tcPr>
+          <w:p>
+            <w:pPr>
+              <w:pStyle w:val="TableContents"/>
+              <w:rPr/>
+            </w:pPr>
+            <w:r>
+              <w:rPr/>
+              <w:t>Discrete</w:t>
+            </w:r>
+          </w:p>
+        </w:tc>
+        <w:tc>
+          <w:tcPr>
+            <w:tcW w:w="1625" w:type="dxa"/>
+            <w:tcBorders>
+              <w:start w:val="single" w:sz="4" w:space="0" w:color="000000"/>
+              <w:bottom w:val="single" w:sz="4" w:space="0" w:color="000000"/>
+              <w:end w:val="single" w:sz="18" w:space="0" w:color="000000"/>
+            </w:tcBorders>
+          </w:tcPr>
+          <w:p>
+            <w:pPr>
+              <w:pStyle w:val="TableContents"/>
+              <w:rPr/>
+            </w:pPr>
+            <w:r>
+              <w:rPr/>
+              <w:t>$7D00</w:t>
+            </w:r>
+          </w:p>
+        </w:tc>
+      </w:tr>
+      <w:tr>
+        <w:trPr/>
+        <w:tc>
+          <w:tcPr>
+            <w:tcW w:w="1225" w:type="dxa"/>
+            <w:tcBorders>
+              <w:start w:val="single" w:sz="18" w:space="0" w:color="000000"/>
+              <w:bottom w:val="single" w:sz="4" w:space="0" w:color="000000"/>
+            </w:tcBorders>
+          </w:tcPr>
+          <w:p>
+            <w:pPr>
+              <w:pStyle w:val="TableContents"/>
+              <w:rPr/>
+            </w:pPr>
+            <w:r>
+              <w:rPr/>
+              <w:t>1</w:t>
+            </w:r>
+          </w:p>
+        </w:tc>
+        <w:tc>
+          <w:tcPr>
+            <w:tcW w:w="2375" w:type="dxa"/>
+            <w:tcBorders>
+              <w:start w:val="single" w:sz="4" w:space="0" w:color="000000"/>
+              <w:bottom w:val="single" w:sz="4" w:space="0" w:color="000000"/>
+            </w:tcBorders>
+          </w:tcPr>
+          <w:p>
+            <w:pPr>
+              <w:pStyle w:val="TableContents"/>
+              <w:rPr/>
+            </w:pPr>
+            <w:r>
+              <w:rPr/>
+              <w:t>Jump</w:t>
+            </w:r>
+          </w:p>
+        </w:tc>
+        <w:tc>
+          <w:tcPr>
+            <w:tcW w:w="3238" w:type="dxa"/>
+            <w:tcBorders>
+              <w:start w:val="single" w:sz="4" w:space="0" w:color="000000"/>
+              <w:bottom w:val="single" w:sz="4" w:space="0" w:color="000000"/>
+            </w:tcBorders>
+          </w:tcPr>
+          <w:p>
+            <w:pPr>
+              <w:pStyle w:val="TableContents"/>
+              <w:rPr/>
+            </w:pPr>
+            <w:r>
+              <w:rPr/>
+              <w:t>Discrete</w:t>
+            </w:r>
+          </w:p>
+        </w:tc>
+        <w:tc>
+          <w:tcPr>
+            <w:tcW w:w="1625" w:type="dxa"/>
+            <w:tcBorders>
+              <w:start w:val="single" w:sz="4" w:space="0" w:color="000000"/>
+              <w:bottom w:val="single" w:sz="4" w:space="0" w:color="000000"/>
+              <w:end w:val="single" w:sz="18" w:space="0" w:color="000000"/>
+            </w:tcBorders>
+          </w:tcPr>
+          <w:p>
+            <w:pPr>
+              <w:pStyle w:val="TableContents"/>
+              <w:rPr/>
+            </w:pPr>
+            <w:r>
+              <w:rPr/>
+              <w:t>$7D01</w:t>
+            </w:r>
+          </w:p>
+        </w:tc>
+      </w:tr>
+      <w:tr>
+        <w:trPr/>
+        <w:tc>
+          <w:tcPr>
+            <w:tcW w:w="1225" w:type="dxa"/>
+            <w:tcBorders>
+              <w:start w:val="single" w:sz="18" w:space="0" w:color="000000"/>
+              <w:bottom w:val="single" w:sz="4" w:space="0" w:color="000000"/>
+            </w:tcBorders>
+          </w:tcPr>
+          <w:p>
+            <w:pPr>
+              <w:pStyle w:val="TableContents"/>
+              <w:rPr/>
+            </w:pPr>
+            <w:r>
+              <w:rPr/>
+              <w:t>2</w:t>
+            </w:r>
+          </w:p>
+        </w:tc>
+        <w:tc>
+          <w:tcPr>
+            <w:tcW w:w="2375" w:type="dxa"/>
+            <w:tcBorders>
+              <w:start w:val="single" w:sz="4" w:space="0" w:color="000000"/>
+              <w:bottom w:val="single" w:sz="4" w:space="0" w:color="000000"/>
+            </w:tcBorders>
+          </w:tcPr>
+          <w:p>
+            <w:pPr>
+              <w:pStyle w:val="TableContents"/>
+              <w:rPr/>
+            </w:pPr>
+            <w:r>
+              <w:rPr/>
+              <w:t>Crash/Boom</w:t>
+            </w:r>
+          </w:p>
+        </w:tc>
+        <w:tc>
+          <w:tcPr>
+            <w:tcW w:w="3238" w:type="dxa"/>
+            <w:tcBorders>
+              <w:start w:val="single" w:sz="4" w:space="0" w:color="000000"/>
+              <w:bottom w:val="single" w:sz="4" w:space="0" w:color="000000"/>
+            </w:tcBorders>
+          </w:tcPr>
+          <w:p>
+            <w:pPr>
+              <w:pStyle w:val="TableContents"/>
+              <w:rPr/>
+            </w:pPr>
+            <w:r>
+              <w:rPr/>
+              <w:t>Discrete</w:t>
+            </w:r>
+          </w:p>
+        </w:tc>
+        <w:tc>
+          <w:tcPr>
+            <w:tcW w:w="1625" w:type="dxa"/>
+            <w:tcBorders>
+              <w:start w:val="single" w:sz="4" w:space="0" w:color="000000"/>
+              <w:bottom w:val="single" w:sz="4" w:space="0" w:color="000000"/>
+              <w:end w:val="single" w:sz="18" w:space="0" w:color="000000"/>
+            </w:tcBorders>
+          </w:tcPr>
+          <w:p>
+            <w:pPr>
+              <w:pStyle w:val="TableContents"/>
+              <w:rPr/>
+            </w:pPr>
+            <w:r>
+              <w:rPr/>
+              <w:t>$7D02</w:t>
+            </w:r>
+          </w:p>
+        </w:tc>
+      </w:tr>
+      <w:tr>
+        <w:trPr/>
+        <w:tc>
+          <w:tcPr>
+            <w:tcW w:w="1225" w:type="dxa"/>
+            <w:tcBorders>
+              <w:start w:val="single" w:sz="18" w:space="0" w:color="000000"/>
+              <w:bottom w:val="single" w:sz="4" w:space="0" w:color="000000"/>
+            </w:tcBorders>
+          </w:tcPr>
+          <w:p>
+            <w:pPr>
+              <w:pStyle w:val="TableContents"/>
+              <w:rPr/>
+            </w:pPr>
+            <w:r>
+              <w:rPr/>
+              <w:t>3</w:t>
+            </w:r>
+          </w:p>
+        </w:tc>
+        <w:tc>
+          <w:tcPr>
+            <w:tcW w:w="2375" w:type="dxa"/>
+            <w:tcBorders>
+              <w:start w:val="single" w:sz="4" w:space="0" w:color="000000"/>
+              <w:bottom w:val="single" w:sz="4" w:space="0" w:color="000000"/>
+            </w:tcBorders>
+          </w:tcPr>
+          <w:p>
+            <w:pPr>
+              <w:pStyle w:val="TableContents"/>
+              <w:rPr/>
+            </w:pPr>
+            <w:r>
+              <w:rPr/>
+              <w:t>Spring/Insert Credit</w:t>
+            </w:r>
+          </w:p>
+        </w:tc>
+        <w:tc>
+          <w:tcPr>
+            <w:tcW w:w="3238" w:type="dxa"/>
+            <w:tcBorders>
+              <w:start w:val="single" w:sz="4" w:space="0" w:color="000000"/>
+              <w:bottom w:val="single" w:sz="4" w:space="0" w:color="000000"/>
+            </w:tcBorders>
+          </w:tcPr>
+          <w:p>
+            <w:pPr>
+              <w:pStyle w:val="TableContents"/>
+              <w:rPr/>
+            </w:pPr>
+            <w:r>
+              <w:rPr/>
+              <w:t>MPU</w:t>
+            </w:r>
+          </w:p>
+        </w:tc>
+        <w:tc>
+          <w:tcPr>
+            <w:tcW w:w="1625" w:type="dxa"/>
+            <w:tcBorders>
+              <w:start w:val="single" w:sz="4" w:space="0" w:color="000000"/>
+              <w:bottom w:val="single" w:sz="4" w:space="0" w:color="000000"/>
+              <w:end w:val="single" w:sz="18" w:space="0" w:color="000000"/>
+            </w:tcBorders>
+          </w:tcPr>
+          <w:p>
+            <w:pPr>
+              <w:pStyle w:val="TableContents"/>
+              <w:rPr/>
+            </w:pPr>
+            <w:r>
+              <w:rPr/>
+              <w:t>$7D03</w:t>
+            </w:r>
+          </w:p>
+        </w:tc>
+      </w:tr>
+      <w:tr>
+        <w:trPr/>
+        <w:tc>
+          <w:tcPr>
+            <w:tcW w:w="1225" w:type="dxa"/>
+            <w:tcBorders>
+              <w:start w:val="single" w:sz="18" w:space="0" w:color="000000"/>
+              <w:bottom w:val="single" w:sz="4" w:space="0" w:color="000000"/>
+            </w:tcBorders>
+          </w:tcPr>
+          <w:p>
+            <w:pPr>
+              <w:pStyle w:val="TableContents"/>
+              <w:rPr/>
+            </w:pPr>
+            <w:r>
+              <w:rPr/>
+              <w:t>4</w:t>
+            </w:r>
+          </w:p>
+        </w:tc>
+        <w:tc>
+          <w:tcPr>
+            <w:tcW w:w="2375" w:type="dxa"/>
+            <w:tcBorders>
+              <w:start w:val="single" w:sz="4" w:space="0" w:color="000000"/>
+              <w:bottom w:val="single" w:sz="4" w:space="0" w:color="000000"/>
+            </w:tcBorders>
+          </w:tcPr>
+          <w:p>
+            <w:pPr>
+              <w:pStyle w:val="TableContents"/>
+              <w:rPr/>
+            </w:pPr>
+            <w:r>
+              <w:rPr/>
+              <w:t>Falling</w:t>
+            </w:r>
+          </w:p>
+        </w:tc>
+        <w:tc>
+          <w:tcPr>
+            <w:tcW w:w="3238" w:type="dxa"/>
+            <w:tcBorders>
+              <w:start w:val="single" w:sz="4" w:space="0" w:color="000000"/>
+              <w:bottom w:val="single" w:sz="4" w:space="0" w:color="000000"/>
+            </w:tcBorders>
+          </w:tcPr>
+          <w:p>
+            <w:pPr>
+              <w:pStyle w:val="TableContents"/>
+              <w:rPr/>
+            </w:pPr>
+            <w:r>
+              <w:rPr/>
+              <w:t>MPU</w:t>
+            </w:r>
+          </w:p>
+        </w:tc>
+        <w:tc>
+          <w:tcPr>
+            <w:tcW w:w="1625" w:type="dxa"/>
+            <w:tcBorders>
+              <w:start w:val="single" w:sz="4" w:space="0" w:color="000000"/>
+              <w:bottom w:val="single" w:sz="4" w:space="0" w:color="000000"/>
+              <w:end w:val="single" w:sz="18" w:space="0" w:color="000000"/>
+            </w:tcBorders>
+          </w:tcPr>
+          <w:p>
+            <w:pPr>
+              <w:pStyle w:val="TableContents"/>
+              <w:rPr/>
+            </w:pPr>
+            <w:r>
+              <w:rPr/>
+              <w:t>$7D04</w:t>
+            </w:r>
+          </w:p>
+        </w:tc>
+      </w:tr>
+      <w:tr>
+        <w:trPr/>
+        <w:tc>
+          <w:tcPr>
+            <w:tcW w:w="1225" w:type="dxa"/>
+            <w:tcBorders>
+              <w:start w:val="single" w:sz="18" w:space="0" w:color="000000"/>
+              <w:bottom w:val="single" w:sz="4" w:space="0" w:color="000000"/>
+            </w:tcBorders>
+          </w:tcPr>
+          <w:p>
+            <w:pPr>
+              <w:pStyle w:val="TableContents"/>
+              <w:rPr/>
+            </w:pPr>
+            <w:r>
+              <w:rPr/>
+              <w:t>5</w:t>
+            </w:r>
+          </w:p>
+        </w:tc>
+        <w:tc>
+          <w:tcPr>
+            <w:tcW w:w="2375" w:type="dxa"/>
+            <w:tcBorders>
+              <w:start w:val="single" w:sz="4" w:space="0" w:color="000000"/>
+              <w:bottom w:val="single" w:sz="4" w:space="0" w:color="000000"/>
+            </w:tcBorders>
+          </w:tcPr>
+          <w:p>
+            <w:pPr>
+              <w:pStyle w:val="TableContents"/>
+              <w:rPr/>
+            </w:pPr>
+            <w:r>
+              <w:rPr/>
+              <w:t>Point Get</w:t>
+            </w:r>
+          </w:p>
+        </w:tc>
+        <w:tc>
+          <w:tcPr>
+            <w:tcW w:w="3238" w:type="dxa"/>
+            <w:tcBorders>
+              <w:start w:val="single" w:sz="4" w:space="0" w:color="000000"/>
+              <w:bottom w:val="single" w:sz="4" w:space="0" w:color="000000"/>
+            </w:tcBorders>
+          </w:tcPr>
+          <w:p>
+            <w:pPr>
+              <w:pStyle w:val="TableContents"/>
+              <w:rPr/>
+            </w:pPr>
+            <w:r>
+              <w:rPr/>
+              <w:t>MPU</w:t>
+            </w:r>
+          </w:p>
+        </w:tc>
+        <w:tc>
+          <w:tcPr>
+            <w:tcW w:w="1625" w:type="dxa"/>
+            <w:tcBorders>
+              <w:start w:val="single" w:sz="4" w:space="0" w:color="000000"/>
+              <w:bottom w:val="single" w:sz="4" w:space="0" w:color="000000"/>
+              <w:end w:val="single" w:sz="18" w:space="0" w:color="000000"/>
+            </w:tcBorders>
+          </w:tcPr>
+          <w:p>
+            <w:pPr>
+              <w:pStyle w:val="TableContents"/>
+              <w:rPr/>
+            </w:pPr>
+            <w:r>
+              <w:rPr/>
+              <w:t>$7D05</w:t>
+            </w:r>
+          </w:p>
+        </w:tc>
+      </w:tr>
+      <w:tr>
+        <w:trPr>
+          <w:trHeight w:val="143" w:hRule="atLeast"/>
+        </w:trPr>
+        <w:tc>
+          <w:tcPr>
+            <w:tcW w:w="1225" w:type="dxa"/>
+            <w:tcBorders>
+              <w:start w:val="single" w:sz="18" w:space="0" w:color="000000"/>
+              <w:bottom w:val="single" w:sz="18" w:space="0" w:color="000000"/>
+            </w:tcBorders>
+          </w:tcPr>
+          <w:p>
+            <w:pPr>
+              <w:pStyle w:val="TableContents"/>
+              <w:rPr/>
+            </w:pPr>
+            <w:r>
+              <w:rPr/>
+              <w:t>6</w:t>
+            </w:r>
+          </w:p>
+        </w:tc>
+        <w:tc>
+          <w:tcPr>
+            <w:tcW w:w="2375" w:type="dxa"/>
+            <w:tcBorders>
+              <w:start w:val="single" w:sz="4" w:space="0" w:color="000000"/>
+              <w:bottom w:val="single" w:sz="18" w:space="0" w:color="000000"/>
+            </w:tcBorders>
+          </w:tcPr>
+          <w:p>
+            <w:pPr>
+              <w:pStyle w:val="TableContents"/>
+              <w:rPr/>
+            </w:pPr>
+            <w:r>
+              <w:rPr/>
+              <w:t>Lose a life</w:t>
+            </w:r>
+          </w:p>
+        </w:tc>
+        <w:tc>
+          <w:tcPr>
+            <w:tcW w:w="3238" w:type="dxa"/>
+            <w:tcBorders>
+              <w:start w:val="single" w:sz="4" w:space="0" w:color="000000"/>
+              <w:bottom w:val="single" w:sz="18" w:space="0" w:color="000000"/>
+            </w:tcBorders>
+          </w:tcPr>
+          <w:p>
+            <w:pPr>
+              <w:pStyle w:val="TableContents"/>
+              <w:rPr/>
+            </w:pPr>
+            <w:r>
+              <w:rPr/>
+              <w:t>MPU</w:t>
+            </w:r>
+          </w:p>
+        </w:tc>
+        <w:tc>
+          <w:tcPr>
+            <w:tcW w:w="1625" w:type="dxa"/>
+            <w:tcBorders>
+              <w:start w:val="single" w:sz="4" w:space="0" w:color="000000"/>
+              <w:bottom w:val="single" w:sz="18" w:space="0" w:color="000000"/>
+              <w:end w:val="single" w:sz="18" w:space="0" w:color="000000"/>
+            </w:tcBorders>
+          </w:tcPr>
+          <w:p>
+            <w:pPr>
+              <w:pStyle w:val="TableContents"/>
+              <w:rPr/>
+            </w:pPr>
+            <w:r>
+              <w:rPr/>
+              <w:t>$7D80</w:t>
+            </w:r>
+          </w:p>
+        </w:tc>
+      </w:tr>
+    </w:tbl>
+    <w:p>
+      <w:pPr>
+        <w:pStyle w:val="BodyText"/>
+        <w:bidi w:val="0"/>
+        <w:ind w:hanging="0" w:start="0"/>
+        <w:jc w:val="start"/>
+        <w:rPr/>
+      </w:pPr>
+      <w:r>
+        <w:rPr/>
+      </w:r>
+    </w:p>
+    <w:p>
+      <w:pPr>
+        <w:pStyle w:val="BodyText"/>
+        <w:bidi w:val="0"/>
+        <w:ind w:hanging="0" w:start="0"/>
+        <w:jc w:val="start"/>
+        <w:rPr/>
+      </w:pPr>
+      <w:r>
+        <w:rPr/>
+        <w:t>With the exception of sound 6, sound is selected by a 74LS259 (6H on TKG4). Output 0 is sound 0, output 1 is sound 1, ect. After it goes through a 74LS04 inverter (6J on TKG4).</w:t>
+      </w:r>
+    </w:p>
+    <w:p>
+      <w:pPr>
+        <w:pStyle w:val="BodyText"/>
+        <w:bidi w:val="0"/>
+        <w:ind w:hanging="0" w:start="0"/>
+        <w:jc w:val="start"/>
+        <w:rPr/>
+      </w:pPr>
+      <w:r>
+        <w:rPr/>
+        <w:t>The discrete sounds then feed into a 74LS05 hex inverter with an open collector output. This is what triggers the discrete sound. The walking and jumping sound have their clock generated by a 556 Dual Timer (8N on TKG4). Sometimes when the 556 fails it can result in either a non-existent sound or a flat sound. The crash sound is has its sporadic clock generated by three 74LS164 shift registers and a 74LS161 binary counter. A failure in the clock circuit can either result in an incorrect sound crash sound or a non-existent one. Each of these sounds also have their own output sections of discrete components. Occasionally these can fail due to a broken or failed electrolytic capacitor. Especially if the PCB is stored incorrectly.</w:t>
+      </w:r>
+    </w:p>
+    <w:p>
+      <w:pPr>
+        <w:pStyle w:val="BodyText"/>
+        <w:bidi w:val="0"/>
+        <w:ind w:hanging="0" w:start="0"/>
+        <w:jc w:val="start"/>
+        <w:rPr/>
+      </w:pPr>
+      <w:r>
+        <w:rPr/>
+        <w:t xml:space="preserve">MPU sounds work a bit differently. They are controlled by an 8035 MPU which references two 2716 ROMs. If the ROMs are not good, the MPU will be unable to function. There are also two 74LS74 latch ICs that are involved with the ROM addressing. There is also a little bit of ROM decoding logics. Assuming the MPU is working, it feeds data into a DAC-08. These seldomly fail but it isn’t unheard of. The output of the DAC feeds into an MB3614 (LM324 equivalent). </w:t>
+      </w:r>
+      <w:r>
+        <w:rPr/>
+        <w:t>The MB3614 is a higher failure component that results in either a quiet or distorted MPU sound set or in some cases no MPU sounds at all. After that it feeds directly into a volume potentiometer and then gets mixed in with the rest of the sounds. The potentiometer sometimes can get damaged if the board is incorrectly stored.</w:t>
+      </w:r>
+    </w:p>
+    <w:p>
+      <w:pPr>
+        <w:pStyle w:val="Heading2"/>
+        <w:numPr>
+          <w:ilvl w:val="1"/>
+          <w:numId w:val="1"/>
+        </w:numPr>
+        <w:bidi w:val="0"/>
+        <w:ind w:hanging="0" w:start="0"/>
+        <w:jc w:val="start"/>
+        <w:rPr/>
+      </w:pPr>
+      <w:bookmarkStart w:id="33" w:name="__RefHeading___Toc838_1351480008"/>
+      <w:bookmarkEnd w:id="33"/>
+      <w:r>
+        <w:rPr/>
+        <w:t>Music Test</w:t>
+      </w:r>
+    </w:p>
+    <w:p>
+      <w:pPr>
+        <w:pStyle w:val="BodyText"/>
+        <w:bidi w:val="0"/>
+        <w:ind w:hanging="0" w:start="0"/>
+        <w:jc w:val="start"/>
+        <w:rPr/>
+      </w:pPr>
+      <w:r>
+        <w:rPr/>
+      </w:r>
+    </w:p>
+    <w:p>
+      <w:pPr>
+        <w:pStyle w:val="Heading2"/>
+        <w:numPr>
+          <w:ilvl w:val="1"/>
+          <w:numId w:val="1"/>
+        </w:numPr>
+        <w:bidi w:val="0"/>
+        <w:ind w:hanging="0" w:start="0"/>
+        <w:jc w:val="start"/>
+        <w:rPr/>
+      </w:pPr>
+      <w:bookmarkStart w:id="34" w:name="__RefHeading___Toc840_1351480008"/>
+      <w:bookmarkEnd w:id="34"/>
+      <w:r>
+        <w:rPr/>
+        <w:t>Background Test</w:t>
+      </w:r>
+    </w:p>
+    <w:p>
+      <w:pPr>
+        <w:pStyle w:val="Heading2"/>
+        <w:numPr>
+          <w:ilvl w:val="1"/>
+          <w:numId w:val="1"/>
+        </w:numPr>
+        <w:bidi w:val="0"/>
+        <w:ind w:hanging="0" w:start="0"/>
+        <w:jc w:val="start"/>
+        <w:rPr/>
+      </w:pPr>
+      <w:bookmarkStart w:id="35" w:name="__RefHeading___Toc842_1351480008"/>
+      <w:bookmarkEnd w:id="35"/>
+      <w:r>
+        <w:rPr/>
+        <w:t>Sprite Test</w:t>
+      </w:r>
+    </w:p>
+    <w:p>
+      <w:pPr>
+        <w:pStyle w:val="Heading2"/>
+        <w:numPr>
+          <w:ilvl w:val="1"/>
+          <w:numId w:val="1"/>
+        </w:numPr>
+        <w:bidi w:val="0"/>
+        <w:ind w:hanging="0" w:start="0"/>
+        <w:jc w:val="start"/>
+        <w:rPr/>
+      </w:pPr>
+      <w:bookmarkStart w:id="36" w:name="__RefHeading___Toc844_1351480008"/>
+      <w:bookmarkEnd w:id="36"/>
+      <w:r>
+        <w:rPr/>
+        <w:t>Reset</w:t>
+      </w:r>
+    </w:p>
+    <w:p>
+      <w:pPr>
+        <w:pStyle w:val="BodyText"/>
+        <w:bidi w:val="0"/>
+        <w:ind w:hanging="0" w:start="0"/>
+        <w:jc w:val="start"/>
+        <w:rPr/>
+      </w:pPr>
+      <w:r>
+        <w:rPr/>
+        <w:t>This is not really a test. It’s only purpose is to enter a loop to wait for the watchdog to reset the hardware. If there is no watchdog present, then it will timeout and jump back to $0000 where all the startup tests will run again. During this waiting period between initiating the reset and the actual reset it will print “reset in progress”.</w:t>
       </w:r>
     </w:p>
     <w:p>
@@ -8305,7 +9999,7 @@
         <w:pStyle w:val="Heading1"/>
         <w:numPr>
           <w:ilvl w:val="0"/>
-          <w:numId w:val="2"/>
+          <w:numId w:val="1"/>
         </w:numPr>
         <w:bidi w:val="0"/>
         <w:spacing w:before="0" w:after="120"/>
@@ -8313,8 +10007,8 @@
         <w:jc w:val="start"/>
         <w:rPr/>
       </w:pPr>
-      <w:bookmarkStart w:id="33" w:name="__RefHeading___Toc233_1351480008"/>
-      <w:bookmarkEnd w:id="33"/>
+      <w:bookmarkStart w:id="37" w:name="__RefHeading___Toc233_1351480008"/>
+      <w:bookmarkEnd w:id="37"/>
       <w:r>
         <w:rPr/>
         <w:t>Chapter 4: Test Architectures</w:t>
@@ -8345,21 +10039,17 @@
         <w:pStyle w:val="Heading1"/>
         <w:numPr>
           <w:ilvl w:val="0"/>
-          <w:numId w:val="2"/>
+          <w:numId w:val="1"/>
         </w:numPr>
         <w:spacing w:before="0" w:after="120"/>
         <w:ind w:hanging="0" w:start="0"/>
         <w:rPr/>
       </w:pPr>
-      <w:bookmarkStart w:id="34" w:name="__RefHeading___Toc915_2335499624"/>
-      <w:bookmarkEnd w:id="34"/>
-      <w:r>
-        <w:rPr/>
-        <w:t xml:space="preserve">Appendix A: </w:t>
-      </w:r>
-      <w:r>
-        <w:rPr/>
-        <w:t>Abbreviations</w:t>
+      <w:bookmarkStart w:id="38" w:name="__RefHeading___Toc915_2335499624"/>
+      <w:bookmarkEnd w:id="38"/>
+      <w:r>
+        <w:rPr/>
+        <w:t>Appendix A: Abbreviations</w:t>
       </w:r>
     </w:p>
     <w:p>
@@ -8398,6 +10088,29 @@
           <w:b/>
           <w:bCs/>
         </w:rPr>
+        <w:t>DAC:</w:t>
+      </w:r>
+      <w:r>
+        <w:rPr>
+          <w:b w:val="false"/>
+          <w:bCs w:val="false"/>
+        </w:rPr>
+        <w:t xml:space="preserve"> Digital to Analog Converter</w:t>
+      </w:r>
+    </w:p>
+    <w:p>
+      <w:pPr>
+        <w:pStyle w:val="BodyText"/>
+        <w:rPr>
+          <w:b w:val="false"/>
+          <w:bCs w:val="false"/>
+        </w:rPr>
+      </w:pPr>
+      <w:r>
+        <w:rPr>
+          <w:b/>
+          <w:bCs/>
+        </w:rPr>
         <w:t xml:space="preserve">DIP: </w:t>
       </w:r>
       <w:r>
@@ -8467,6 +10180,29 @@
           <w:b/>
           <w:bCs/>
         </w:rPr>
+        <w:t xml:space="preserve">MPU: </w:t>
+      </w:r>
+      <w:r>
+        <w:rPr>
+          <w:b w:val="false"/>
+          <w:bCs w:val="false"/>
+        </w:rPr>
+        <w:t>Micro-Processor Unit</w:t>
+      </w:r>
+    </w:p>
+    <w:p>
+      <w:pPr>
+        <w:pStyle w:val="BodyText"/>
+        <w:rPr>
+          <w:b/>
+          <w:bCs/>
+        </w:rPr>
+      </w:pPr>
+      <w:r>
+        <w:rPr>
+          <w:b/>
+          <w:bCs/>
+        </w:rPr>
         <w:t xml:space="preserve">N.A.: </w:t>
       </w:r>
       <w:r>
@@ -8521,6 +10257,29 @@
           <w:bCs w:val="false"/>
         </w:rPr>
         <w:t>Printed Circuit Board</w:t>
+      </w:r>
+    </w:p>
+    <w:p>
+      <w:pPr>
+        <w:pStyle w:val="BodyText"/>
+        <w:rPr>
+          <w:b/>
+          <w:bCs/>
+        </w:rPr>
+      </w:pPr>
+      <w:r>
+        <w:rPr>
+          <w:b/>
+          <w:bCs/>
+        </w:rPr>
+        <w:t xml:space="preserve">PROM: </w:t>
+      </w:r>
+      <w:r>
+        <w:rPr>
+          <w:b w:val="false"/>
+          <w:bCs w:val="false"/>
+        </w:rPr>
+        <w:t>Programmable Read Only Memory (Also called Bipolar PROM)</w:t>
       </w:r>
     </w:p>
     <w:p>
@@ -8594,14 +10353,14 @@
         <w:pStyle w:val="Heading1"/>
         <w:numPr>
           <w:ilvl w:val="0"/>
-          <w:numId w:val="2"/>
+          <w:numId w:val="1"/>
         </w:numPr>
         <w:spacing w:before="0" w:after="120"/>
         <w:ind w:hanging="0" w:start="0"/>
         <w:rPr/>
       </w:pPr>
-      <w:bookmarkStart w:id="35" w:name="__RefHeading___Toc915_2335499624_Copy_1"/>
-      <w:bookmarkEnd w:id="35"/>
+      <w:bookmarkStart w:id="39" w:name="__RefHeading___Toc915_2335499624_Copy_1"/>
+      <w:bookmarkEnd w:id="39"/>
       <w:r>
         <w:rPr/>
         <w:t>Appendix B: ICs mentioned</w:t>
@@ -8624,7 +10383,7 @@
         </w:rPr>
         <w:t xml:space="preserve">2114: </w:t>
       </w:r>
-      <w:hyperlink r:id="rId13">
+      <w:hyperlink r:id="rId19">
         <w:r>
           <w:rPr>
             <w:rStyle w:val="Hyperlink"/>
@@ -8652,30 +10411,14 @@
         </w:rPr>
         <w:t xml:space="preserve">2148: </w:t>
       </w:r>
-      <w:hyperlink r:id="rId14">
+      <w:hyperlink r:id="rId20">
         <w:r>
           <w:rPr>
             <w:rStyle w:val="Hyperlink"/>
             <w:b w:val="false"/>
             <w:bCs w:val="false"/>
           </w:rPr>
-          <w:t xml:space="preserve">1k x 4 </w:t>
-        </w:r>
-        <w:r>
-          <w:rPr>
-            <w:rStyle w:val="Hyperlink"/>
-            <w:b w:val="false"/>
-            <w:bCs w:val="false"/>
-          </w:rPr>
-          <w:t xml:space="preserve">High Speed </w:t>
-        </w:r>
-        <w:r>
-          <w:rPr>
-            <w:rStyle w:val="Hyperlink"/>
-            <w:b w:val="false"/>
-            <w:bCs w:val="false"/>
-          </w:rPr>
-          <w:t>SRAM</w:t>
+          <w:t>1k x 4 High Speed SRAM</w:t>
         </w:r>
       </w:hyperlink>
     </w:p>
@@ -8696,7 +10439,7 @@
         </w:rPr>
         <w:t xml:space="preserve">74LS08: </w:t>
       </w:r>
-      <w:hyperlink r:id="rId15">
+      <w:hyperlink r:id="rId21">
         <w:r>
           <w:rPr>
             <w:rStyle w:val="Hyperlink"/>
@@ -8724,7 +10467,7 @@
         </w:rPr>
         <w:t xml:space="preserve">74LS32: </w:t>
       </w:r>
-      <w:hyperlink r:id="rId16">
+      <w:hyperlink r:id="rId22">
         <w:r>
           <w:rPr>
             <w:rStyle w:val="Hyperlink"/>
@@ -8752,7 +10495,7 @@
         </w:rPr>
         <w:t xml:space="preserve">74LS138: </w:t>
       </w:r>
-      <w:hyperlink r:id="rId17">
+      <w:hyperlink r:id="rId23">
         <w:r>
           <w:rPr>
             <w:rStyle w:val="Hyperlink"/>
@@ -8780,7 +10523,7 @@
         </w:rPr>
         <w:t xml:space="preserve">74LS139: </w:t>
       </w:r>
-      <w:hyperlink r:id="rId18">
+      <w:hyperlink r:id="rId24">
         <w:r>
           <w:rPr>
             <w:rStyle w:val="Hyperlink"/>
@@ -8815,7 +10558,7 @@
         </w:rPr>
         <w:t xml:space="preserve"> </w:t>
       </w:r>
-      <w:hyperlink r:id="rId19">
+      <w:hyperlink r:id="rId25">
         <w:r>
           <w:rPr>
             <w:rStyle w:val="Hyperlink"/>
@@ -8850,7 +10593,7 @@
         </w:rPr>
         <w:t xml:space="preserve"> </w:t>
       </w:r>
-      <w:hyperlink r:id="rId20">
+      <w:hyperlink r:id="rId26">
         <w:r>
           <w:rPr>
             <w:rStyle w:val="Hyperlink"/>
@@ -8912,9 +10655,9 @@
       </w:r>
     </w:p>
     <w:sectPr>
-      <w:footerReference w:type="even" r:id="rId21"/>
-      <w:footerReference w:type="default" r:id="rId22"/>
-      <w:footerReference w:type="first" r:id="rId23"/>
+      <w:footerReference w:type="even" r:id="rId27"/>
+      <w:footerReference w:type="default" r:id="rId28"/>
+      <w:footerReference w:type="first" r:id="rId29"/>
       <w:type w:val="nextPage"/>
       <w:pgSz w:w="12240" w:h="15840"/>
       <w:pgMar w:left="1134" w:right="1134" w:gutter="0" w:header="0" w:top="1134" w:footer="756" w:bottom="1318"/>
@@ -8956,7 +10699,7 @@
       <w:tab/>
       <w:tab/>
     </w:r>
-    <w:bookmarkStart w:id="36" w:name="PageNumWizard_FOOTER_Default_Page_Style3"/>
+    <w:bookmarkStart w:id="40" w:name="PageNumWizard_FOOTER_Default_Page_Style3"/>
     <w:r>
       <w:rPr/>
       <w:fldChar w:fldCharType="begin"/>
@@ -8971,13 +10714,13 @@
     </w:r>
     <w:r>
       <w:rPr/>
-      <w:t>15</w:t>
+      <w:t>17</w:t>
     </w:r>
     <w:r>
       <w:rPr/>
       <w:fldChar w:fldCharType="end"/>
     </w:r>
-    <w:bookmarkEnd w:id="36"/>
+    <w:bookmarkEnd w:id="40"/>
   </w:p>
 </w:ftr>
 </file>
@@ -9011,125 +10754,6 @@
         </w:tabs>
         <w:ind w:start="0" w:hanging="0"/>
       </w:pPr>
-    </w:lvl>
-    <w:lvl w:ilvl="1">
-      <w:start w:val="1"/>
-      <w:numFmt w:val="none"/>
-      <w:suff w:val="nothing"/>
-      <w:lvlText w:val=""/>
-      <w:lvlJc w:val="start"/>
-      <w:pPr>
-        <w:tabs>
-          <w:tab w:val="num" w:pos="0"/>
-        </w:tabs>
-        <w:ind w:start="0" w:hanging="0"/>
-      </w:pPr>
-    </w:lvl>
-    <w:lvl w:ilvl="2">
-      <w:start w:val="1"/>
-      <w:numFmt w:val="none"/>
-      <w:suff w:val="nothing"/>
-      <w:lvlText w:val=""/>
-      <w:lvlJc w:val="start"/>
-      <w:pPr>
-        <w:tabs>
-          <w:tab w:val="num" w:pos="0"/>
-        </w:tabs>
-        <w:ind w:start="0" w:hanging="0"/>
-      </w:pPr>
-    </w:lvl>
-    <w:lvl w:ilvl="3">
-      <w:start w:val="1"/>
-      <w:numFmt w:val="none"/>
-      <w:suff w:val="nothing"/>
-      <w:lvlText w:val=""/>
-      <w:lvlJc w:val="start"/>
-      <w:pPr>
-        <w:tabs>
-          <w:tab w:val="num" w:pos="0"/>
-        </w:tabs>
-        <w:ind w:start="0" w:hanging="0"/>
-      </w:pPr>
-    </w:lvl>
-    <w:lvl w:ilvl="4">
-      <w:start w:val="1"/>
-      <w:numFmt w:val="none"/>
-      <w:suff w:val="nothing"/>
-      <w:lvlText w:val=""/>
-      <w:lvlJc w:val="start"/>
-      <w:pPr>
-        <w:tabs>
-          <w:tab w:val="num" w:pos="0"/>
-        </w:tabs>
-        <w:ind w:start="0" w:hanging="0"/>
-      </w:pPr>
-    </w:lvl>
-    <w:lvl w:ilvl="5">
-      <w:start w:val="1"/>
-      <w:numFmt w:val="none"/>
-      <w:suff w:val="nothing"/>
-      <w:lvlText w:val=""/>
-      <w:lvlJc w:val="start"/>
-      <w:pPr>
-        <w:tabs>
-          <w:tab w:val="num" w:pos="0"/>
-        </w:tabs>
-        <w:ind w:start="0" w:hanging="0"/>
-      </w:pPr>
-    </w:lvl>
-    <w:lvl w:ilvl="6">
-      <w:start w:val="1"/>
-      <w:numFmt w:val="none"/>
-      <w:suff w:val="nothing"/>
-      <w:lvlText w:val=""/>
-      <w:lvlJc w:val="start"/>
-      <w:pPr>
-        <w:tabs>
-          <w:tab w:val="num" w:pos="0"/>
-        </w:tabs>
-        <w:ind w:start="0" w:hanging="0"/>
-      </w:pPr>
-    </w:lvl>
-    <w:lvl w:ilvl="7">
-      <w:start w:val="1"/>
-      <w:numFmt w:val="none"/>
-      <w:suff w:val="nothing"/>
-      <w:lvlText w:val=""/>
-      <w:lvlJc w:val="start"/>
-      <w:pPr>
-        <w:tabs>
-          <w:tab w:val="num" w:pos="0"/>
-        </w:tabs>
-        <w:ind w:start="0" w:hanging="0"/>
-      </w:pPr>
-    </w:lvl>
-    <w:lvl w:ilvl="8">
-      <w:start w:val="1"/>
-      <w:numFmt w:val="none"/>
-      <w:suff w:val="nothing"/>
-      <w:lvlText w:val=""/>
-      <w:lvlJc w:val="start"/>
-      <w:pPr>
-        <w:tabs>
-          <w:tab w:val="num" w:pos="0"/>
-        </w:tabs>
-        <w:ind w:start="0" w:hanging="0"/>
-      </w:pPr>
-    </w:lvl>
-  </w:abstractNum>
-  <w:abstractNum w:abstractNumId="2">
-    <w:lvl w:ilvl="0">
-      <w:start w:val="1"/>
-      <w:numFmt w:val="none"/>
-      <w:suff w:val="nothing"/>
-      <w:lvlText w:val=""/>
-      <w:lvlJc w:val="start"/>
-      <w:pPr>
-        <w:tabs>
-          <w:tab w:val="num" w:pos="0"/>
-        </w:tabs>
-        <w:ind w:start="0" w:hanging="0"/>
-      </w:pPr>
       <w:rPr/>
     </w:lvl>
     <w:lvl w:ilvl="1">
@@ -9245,7 +10869,7 @@
       <w:rPr/>
     </w:lvl>
   </w:abstractNum>
-  <w:abstractNum w:abstractNumId="3">
+  <w:abstractNum w:abstractNumId="2">
     <w:lvl w:ilvl="0">
       <w:start w:val="1"/>
       <w:numFmt w:val="bullet"/>
@@ -9382,7 +11006,7 @@
       </w:rPr>
     </w:lvl>
   </w:abstractNum>
-  <w:abstractNum w:abstractNumId="4">
+  <w:abstractNum w:abstractNumId="3">
     <w:lvl w:ilvl="0">
       <w:start w:val="1"/>
       <w:numFmt w:val="bullet"/>
@@ -9517,6 +11141,125 @@
       <w:rPr>
         <w:rFonts w:ascii="OpenSymbol" w:hAnsi="OpenSymbol" w:cs="OpenSymbol" w:hint="default"/>
       </w:rPr>
+    </w:lvl>
+  </w:abstractNum>
+  <w:abstractNum w:abstractNumId="4">
+    <w:lvl w:ilvl="0">
+      <w:start w:val="1"/>
+      <w:numFmt w:val="none"/>
+      <w:suff w:val="nothing"/>
+      <w:lvlText w:val=""/>
+      <w:lvlJc w:val="start"/>
+      <w:pPr>
+        <w:tabs>
+          <w:tab w:val="num" w:pos="0"/>
+        </w:tabs>
+        <w:ind w:start="0" w:hanging="0"/>
+      </w:pPr>
+    </w:lvl>
+    <w:lvl w:ilvl="1">
+      <w:start w:val="1"/>
+      <w:numFmt w:val="none"/>
+      <w:suff w:val="nothing"/>
+      <w:lvlText w:val=""/>
+      <w:lvlJc w:val="start"/>
+      <w:pPr>
+        <w:tabs>
+          <w:tab w:val="num" w:pos="0"/>
+        </w:tabs>
+        <w:ind w:start="0" w:hanging="0"/>
+      </w:pPr>
+    </w:lvl>
+    <w:lvl w:ilvl="2">
+      <w:start w:val="1"/>
+      <w:numFmt w:val="none"/>
+      <w:suff w:val="nothing"/>
+      <w:lvlText w:val=""/>
+      <w:lvlJc w:val="start"/>
+      <w:pPr>
+        <w:tabs>
+          <w:tab w:val="num" w:pos="0"/>
+        </w:tabs>
+        <w:ind w:start="0" w:hanging="0"/>
+      </w:pPr>
+    </w:lvl>
+    <w:lvl w:ilvl="3">
+      <w:start w:val="1"/>
+      <w:numFmt w:val="none"/>
+      <w:suff w:val="nothing"/>
+      <w:lvlText w:val=""/>
+      <w:lvlJc w:val="start"/>
+      <w:pPr>
+        <w:tabs>
+          <w:tab w:val="num" w:pos="0"/>
+        </w:tabs>
+        <w:ind w:start="0" w:hanging="0"/>
+      </w:pPr>
+    </w:lvl>
+    <w:lvl w:ilvl="4">
+      <w:start w:val="1"/>
+      <w:numFmt w:val="none"/>
+      <w:suff w:val="nothing"/>
+      <w:lvlText w:val=""/>
+      <w:lvlJc w:val="start"/>
+      <w:pPr>
+        <w:tabs>
+          <w:tab w:val="num" w:pos="0"/>
+        </w:tabs>
+        <w:ind w:start="0" w:hanging="0"/>
+      </w:pPr>
+    </w:lvl>
+    <w:lvl w:ilvl="5">
+      <w:start w:val="1"/>
+      <w:numFmt w:val="none"/>
+      <w:suff w:val="nothing"/>
+      <w:lvlText w:val=""/>
+      <w:lvlJc w:val="start"/>
+      <w:pPr>
+        <w:tabs>
+          <w:tab w:val="num" w:pos="0"/>
+        </w:tabs>
+        <w:ind w:start="0" w:hanging="0"/>
+      </w:pPr>
+    </w:lvl>
+    <w:lvl w:ilvl="6">
+      <w:start w:val="1"/>
+      <w:numFmt w:val="none"/>
+      <w:suff w:val="nothing"/>
+      <w:lvlText w:val=""/>
+      <w:lvlJc w:val="start"/>
+      <w:pPr>
+        <w:tabs>
+          <w:tab w:val="num" w:pos="0"/>
+        </w:tabs>
+        <w:ind w:start="0" w:hanging="0"/>
+      </w:pPr>
+    </w:lvl>
+    <w:lvl w:ilvl="7">
+      <w:start w:val="1"/>
+      <w:numFmt w:val="none"/>
+      <w:suff w:val="nothing"/>
+      <w:lvlText w:val=""/>
+      <w:lvlJc w:val="start"/>
+      <w:pPr>
+        <w:tabs>
+          <w:tab w:val="num" w:pos="0"/>
+        </w:tabs>
+        <w:ind w:start="0" w:hanging="0"/>
+      </w:pPr>
+    </w:lvl>
+    <w:lvl w:ilvl="8">
+      <w:start w:val="1"/>
+      <w:numFmt w:val="none"/>
+      <w:suff w:val="nothing"/>
+      <w:lvlText w:val=""/>
+      <w:lvlJc w:val="start"/>
+      <w:pPr>
+        <w:tabs>
+          <w:tab w:val="num" w:pos="0"/>
+        </w:tabs>
+        <w:ind w:start="0" w:hanging="0"/>
+      </w:pPr>
     </w:lvl>
   </w:abstractNum>
   <w:num w:numId="1">
@@ -9579,7 +11322,7 @@
     <w:pPr>
       <w:numPr>
         <w:ilvl w:val="0"/>
-        <w:numId w:val="2"/>
+        <w:numId w:val="1"/>
       </w:numPr>
       <w:spacing w:before="240" w:after="120"/>
       <w:outlineLvl w:val="0"/>
@@ -9599,7 +11342,7 @@
     <w:pPr>
       <w:numPr>
         <w:ilvl w:val="1"/>
-        <w:numId w:val="2"/>
+        <w:numId w:val="1"/>
       </w:numPr>
       <w:spacing w:before="200" w:after="120"/>
       <w:outlineLvl w:val="1"/>
@@ -9619,7 +11362,7 @@
     <w:pPr>
       <w:numPr>
         <w:ilvl w:val="2"/>
-        <w:numId w:val="2"/>
+        <w:numId w:val="1"/>
       </w:numPr>
       <w:spacing w:before="140" w:after="120"/>
       <w:outlineLvl w:val="2"/>
@@ -9651,8 +11394,8 @@
       <w:bCs/>
     </w:rPr>
   </w:style>
-  <w:style w:type="character" w:styleId="Bulletsuser">
-    <w:name w:val="Bullets (user)"/>
+  <w:style w:type="character" w:styleId="Bullets">
+    <w:name w:val="Bullets"/>
     <w:qFormat/>
     <w:rPr>
       <w:rFonts w:ascii="OpenSymbol" w:hAnsi="OpenSymbol" w:eastAsia="OpenSymbol" w:cs="OpenSymbol"/>
@@ -9665,8 +11408,8 @@
       <w:u w:val="single"/>
     </w:rPr>
   </w:style>
-  <w:style w:type="character" w:styleId="Bullets">
-    <w:name w:val="Bullets"/>
+  <w:style w:type="character" w:styleId="Bulletsuser">
+    <w:name w:val="Bullets (user)"/>
     <w:qFormat/>
     <w:rPr>
       <w:rFonts w:ascii="OpenSymbol" w:hAnsi="OpenSymbol" w:eastAsia="OpenSymbol" w:cs="OpenSymbol"/>
@@ -9869,6 +11612,13 @@
     </w:pPr>
     <w:rPr/>
   </w:style>
+  <w:style w:type="paragraph" w:styleId="FrameContents">
+    <w:name w:val="Frame Contents"/>
+    <w:basedOn w:val="Normal"/>
+    <w:qFormat/>
+    <w:pPr/>
+    <w:rPr/>
+  </w:style>
 </w:styles>
 </file>
 

</xml_diff>

<commit_message>
Added background test and sprite test
</commit_message>
<xml_diff>
--- a/Donkey Kong/Manual/TKGTestROMManual.docx
+++ b/Donkey Kong/Manual/TKGTestROMManual.docx
@@ -1458,20 +1458,41 @@
     </w:p>
     <w:p>
       <w:pPr>
-        <w:pStyle w:val="Heading1"/>
-        <w:widowControl/>
+        <w:pStyle w:val="Heading2"/>
         <w:numPr>
           <w:ilvl w:val="0"/>
-          <w:numId w:val="0"/>
+          <w:numId w:val="1"/>
         </w:numPr>
-        <w:suppressAutoHyphens w:val="true"/>
-        <w:bidi w:val="0"/>
         <w:ind w:hanging="0" w:start="0"/>
-        <w:jc w:val="start"/>
-        <w:rPr/>
-      </w:pPr>
-      <w:r>
-        <w:rPr/>
+        <w:rPr/>
+      </w:pPr>
+      <w:r>
+        <w:rPr/>
+        <w:t>Limitations</w:t>
+      </w:r>
+    </w:p>
+    <w:p>
+      <w:pPr>
+        <w:pStyle w:val="BodyText"/>
+        <w:rPr/>
+      </w:pPr>
+      <w:r>
+        <w:rPr/>
+        <w:t>The test ROM is unable to directly test every component on the board but rather is meant to test functionality and sections. The board has to be able to run code in order for it to execute at all which means the power on reset circuit, clocks, and ROM addressing circuitry must be working. If it cannot read any data, verify that it can access the ROMs and data is not being corrupted on the way back.</w:t>
+      </w:r>
+    </w:p>
+    <w:p>
+      <w:pPr>
+        <w:pStyle w:val="BodyText"/>
+        <w:rPr/>
+      </w:pPr>
+      <w:r>
+        <w:rPr/>
+        <w:t xml:space="preserve">This manual also mentions many ICs, it will not mention every part of a circuit for every combination of TKG hardware. It will do its best to explain how it works but reference the schematics </w:t>
+      </w:r>
+      <w:r>
+        <w:rPr/>
+        <w:t>for specifics. This test ROM, if it can execute, will do its best to give clues on what is going wrong. Note that this will not be explaining the clock, ECL, or video/sprite circuitry that much farther than the RAM covered by the test. That is still up to the technician to figure out if there is an issue as it falls outside the scope of the test ROM.</w:t>
       </w:r>
       <w:r>
         <w:br w:type="page"/>
@@ -1690,7 +1711,11 @@
       </w:pPr>
       <w:r>
         <w:rPr/>
-        <w:t>The video PCB side is adds an extra layer of complexity as the sprite and video RAM data has to be utilized by the rest of the video board. It does this by switching between video counter signals and CPU address lines depending on the situation. Whenever the CPU needs to access sprite or video RAM, the appropriate 74LS157s switch the address lines from the video counters to the address lines. After that switch the appropriate 74LS245 buffer turns on and gives access to the sprite or video RAM data lines.</w:t>
+        <w:t xml:space="preserve">The video PCB side is adds an extra layer of complexity as the sprite and video RAM data has to be utilized by the rest of the video board. It does this by switching between video counter signals and CPU address lines depending on the situation. Whenever the CPU needs to access sprite or video RAM, the appropriate 74LS157s switch the address lines from the video counters to the address lines. After that switch the appropriate 74LS245 buffer turns on and gives access to the sprite or video RAM data lines. </w:t>
+      </w:r>
+      <w:r>
+        <w:rPr/>
+        <w:t>The sprite RAM is very similarly written to as the video RAM. Refer to the schematics for more information on what chips are used to access the RAM. The only difference is that the RAM is 2148 and it has an additional object request signal to handle. Where the RAMs really differ is how their data is used by the rest of the video board. Video RAM data gets fed into ROMs whose data gets merged back to video out more directly. Sprite RAM has to go through the whole ECL circuit setup for it.</w:t>
       </w:r>
     </w:p>
     <w:p>
@@ -1707,7 +1732,7 @@
       </w:pPr>
       <w:r>
         <w:rPr/>
-        <w:t>Unforutnately the test ROM can only validate that the CPU has access to the sprite and video RAM. It cannot directly test how the video board interprets that data. However, the background and sprite test can be used to troubleshoot the video PCB functionality.</w:t>
+        <w:t>Unfortunately the test ROM can only validate that the CPU has access to the sprite and video RAM. It cannot directly test how the video board interprets that data. However, the background and sprite test can be used to troubleshoot the video PCB functionality.</w:t>
       </w:r>
     </w:p>
     <w:p>
@@ -5623,36 +5648,6 @@
       <w:r>
         <w:rPr/>
         <w:t>trustworthy and could run into issues during execution.</w:t>
-      </w:r>
-    </w:p>
-    <w:p>
-      <w:pPr>
-        <w:pStyle w:val="Heading3"/>
-        <w:numPr>
-          <w:ilvl w:val="2"/>
-          <w:numId w:val="1"/>
-        </w:numPr>
-        <w:bidi w:val="0"/>
-        <w:ind w:hanging="0" w:start="0"/>
-        <w:jc w:val="start"/>
-        <w:rPr/>
-      </w:pPr>
-      <w:r>
-        <w:rPr/>
-      </w:r>
-    </w:p>
-    <w:p>
-      <w:pPr>
-        <w:pStyle w:val="Heading3"/>
-        <w:numPr>
-          <w:ilvl w:val="2"/>
-          <w:numId w:val="1"/>
-        </w:numPr>
-        <w:ind w:hanging="0" w:start="0"/>
-        <w:rPr/>
-      </w:pPr>
-      <w:r>
-        <w:rPr/>
       </w:r>
     </w:p>
     <w:p>
@@ -9794,7 +9789,15 @@
       </w:pPr>
       <w:r>
         <w:rPr/>
-        <w:t>Default TKG software supports up to sixteen music tracks. However, two of the music tracks are silent. Music is generated by the 8035 MPU on TKG hardware. One thing to keep in mind is that it can also be substituted with an 8039 MPU which is nearly identical other than having more internal RAM. The MPU, when running, reads a 4-bit ($00-$0F</w:t>
+        <w:t xml:space="preserve">Default TKG software supports up to sixteen music tracks. However, two of the music tracks are silent. </w:t>
+      </w:r>
+      <w:r>
+        <w:rPr/>
+        <w:t xml:space="preserve">Pressing the jump button selects the current music track to be played. For the most part, it will repeat until another track is selected. </w:t>
+      </w:r>
+      <w:r>
+        <w:rPr/>
+        <w:t>Music is generated by the 8035 MPU on TKG hardware. One thing to keep in mind is that it can also be substituted with an 8039 MPU which is nearly identical other than having more internal RAM. The MPU, when running, reads a 4-bit ($00-$0F</w:t>
       </w:r>
       <w:r>
         <w:rPr/>
@@ -9825,13 +9828,13 @@
       <w:tblPr>
         <w:tblW w:w="6025" w:type="dxa"/>
         <w:jc w:val="start"/>
-        <w:tblInd w:w="0" w:type="dxa"/>
+        <w:tblInd w:w="-22" w:type="dxa"/>
         <w:tblLayout w:type="fixed"/>
         <w:tblCellMar>
-          <w:top w:w="0" w:type="dxa"/>
-          <w:start w:w="0" w:type="dxa"/>
-          <w:bottom w:w="0" w:type="dxa"/>
-          <w:end w:w="0" w:type="dxa"/>
+          <w:top w:w="29" w:type="dxa"/>
+          <w:start w:w="29" w:type="dxa"/>
+          <w:bottom w:w="29" w:type="dxa"/>
+          <w:end w:w="29" w:type="dxa"/>
         </w:tblCellMar>
       </w:tblPr>
       <w:tblGrid>
@@ -9843,7 +9846,11 @@
         <w:tc>
           <w:tcPr>
             <w:tcW w:w="1887" w:type="dxa"/>
-            <w:tcBorders/>
+            <w:tcBorders>
+              <w:top w:val="single" w:sz="18" w:space="0" w:color="000000"/>
+              <w:start w:val="single" w:sz="18" w:space="0" w:color="000000"/>
+              <w:bottom w:val="single" w:sz="4" w:space="0" w:color="000000"/>
+            </w:tcBorders>
           </w:tcPr>
           <w:p>
             <w:pPr>
@@ -9865,7 +9872,12 @@
         <w:tc>
           <w:tcPr>
             <w:tcW w:w="4138" w:type="dxa"/>
-            <w:tcBorders/>
+            <w:tcBorders>
+              <w:top w:val="single" w:sz="18" w:space="0" w:color="000000"/>
+              <w:start w:val="single" w:sz="2" w:space="0" w:color="000000"/>
+              <w:bottom w:val="single" w:sz="4" w:space="0" w:color="000000"/>
+              <w:end w:val="single" w:sz="18" w:space="0" w:color="000000"/>
+            </w:tcBorders>
           </w:tcPr>
           <w:p>
             <w:pPr>
@@ -9890,7 +9902,10 @@
         <w:tc>
           <w:tcPr>
             <w:tcW w:w="1887" w:type="dxa"/>
-            <w:tcBorders/>
+            <w:tcBorders>
+              <w:start w:val="single" w:sz="18" w:space="0" w:color="000000"/>
+              <w:bottom w:val="single" w:sz="4" w:space="0" w:color="000000"/>
+            </w:tcBorders>
           </w:tcPr>
           <w:p>
             <w:pPr>
@@ -9906,7 +9921,11 @@
         <w:tc>
           <w:tcPr>
             <w:tcW w:w="4138" w:type="dxa"/>
-            <w:tcBorders/>
+            <w:tcBorders>
+              <w:start w:val="single" w:sz="2" w:space="0" w:color="000000"/>
+              <w:bottom w:val="single" w:sz="4" w:space="0" w:color="000000"/>
+              <w:end w:val="single" w:sz="18" w:space="0" w:color="000000"/>
+            </w:tcBorders>
           </w:tcPr>
           <w:p>
             <w:pPr>
@@ -9925,7 +9944,10 @@
         <w:tc>
           <w:tcPr>
             <w:tcW w:w="1887" w:type="dxa"/>
-            <w:tcBorders/>
+            <w:tcBorders>
+              <w:start w:val="single" w:sz="18" w:space="0" w:color="000000"/>
+              <w:bottom w:val="single" w:sz="4" w:space="0" w:color="000000"/>
+            </w:tcBorders>
           </w:tcPr>
           <w:p>
             <w:pPr>
@@ -9941,7 +9963,11 @@
         <w:tc>
           <w:tcPr>
             <w:tcW w:w="4138" w:type="dxa"/>
-            <w:tcBorders/>
+            <w:tcBorders>
+              <w:start w:val="single" w:sz="2" w:space="0" w:color="000000"/>
+              <w:bottom w:val="single" w:sz="4" w:space="0" w:color="000000"/>
+              <w:end w:val="single" w:sz="18" w:space="0" w:color="000000"/>
+            </w:tcBorders>
           </w:tcPr>
           <w:p>
             <w:pPr>
@@ -9960,7 +9986,10 @@
         <w:tc>
           <w:tcPr>
             <w:tcW w:w="1887" w:type="dxa"/>
-            <w:tcBorders/>
+            <w:tcBorders>
+              <w:start w:val="single" w:sz="18" w:space="0" w:color="000000"/>
+              <w:bottom w:val="single" w:sz="4" w:space="0" w:color="000000"/>
+            </w:tcBorders>
           </w:tcPr>
           <w:p>
             <w:pPr>
@@ -9976,7 +10005,11 @@
         <w:tc>
           <w:tcPr>
             <w:tcW w:w="4138" w:type="dxa"/>
-            <w:tcBorders/>
+            <w:tcBorders>
+              <w:start w:val="single" w:sz="2" w:space="0" w:color="000000"/>
+              <w:bottom w:val="single" w:sz="4" w:space="0" w:color="000000"/>
+              <w:end w:val="single" w:sz="18" w:space="0" w:color="000000"/>
+            </w:tcBorders>
           </w:tcPr>
           <w:p>
             <w:pPr>
@@ -9995,7 +10028,10 @@
         <w:tc>
           <w:tcPr>
             <w:tcW w:w="1887" w:type="dxa"/>
-            <w:tcBorders/>
+            <w:tcBorders>
+              <w:start w:val="single" w:sz="18" w:space="0" w:color="000000"/>
+              <w:bottom w:val="single" w:sz="4" w:space="0" w:color="000000"/>
+            </w:tcBorders>
           </w:tcPr>
           <w:p>
             <w:pPr>
@@ -10011,7 +10047,11 @@
         <w:tc>
           <w:tcPr>
             <w:tcW w:w="4138" w:type="dxa"/>
-            <w:tcBorders/>
+            <w:tcBorders>
+              <w:start w:val="single" w:sz="2" w:space="0" w:color="000000"/>
+              <w:bottom w:val="single" w:sz="4" w:space="0" w:color="000000"/>
+              <w:end w:val="single" w:sz="18" w:space="0" w:color="000000"/>
+            </w:tcBorders>
           </w:tcPr>
           <w:p>
             <w:pPr>
@@ -10030,7 +10070,10 @@
         <w:tc>
           <w:tcPr>
             <w:tcW w:w="1887" w:type="dxa"/>
-            <w:tcBorders/>
+            <w:tcBorders>
+              <w:start w:val="single" w:sz="18" w:space="0" w:color="000000"/>
+              <w:bottom w:val="single" w:sz="4" w:space="0" w:color="000000"/>
+            </w:tcBorders>
           </w:tcPr>
           <w:p>
             <w:pPr>
@@ -10046,7 +10089,11 @@
         <w:tc>
           <w:tcPr>
             <w:tcW w:w="4138" w:type="dxa"/>
-            <w:tcBorders/>
+            <w:tcBorders>
+              <w:start w:val="single" w:sz="2" w:space="0" w:color="000000"/>
+              <w:bottom w:val="single" w:sz="4" w:space="0" w:color="000000"/>
+              <w:end w:val="single" w:sz="18" w:space="0" w:color="000000"/>
+            </w:tcBorders>
           </w:tcPr>
           <w:p>
             <w:pPr>
@@ -10065,7 +10112,10 @@
         <w:tc>
           <w:tcPr>
             <w:tcW w:w="1887" w:type="dxa"/>
-            <w:tcBorders/>
+            <w:tcBorders>
+              <w:start w:val="single" w:sz="18" w:space="0" w:color="000000"/>
+              <w:bottom w:val="single" w:sz="4" w:space="0" w:color="000000"/>
+            </w:tcBorders>
           </w:tcPr>
           <w:p>
             <w:pPr>
@@ -10081,7 +10131,11 @@
         <w:tc>
           <w:tcPr>
             <w:tcW w:w="4138" w:type="dxa"/>
-            <w:tcBorders/>
+            <w:tcBorders>
+              <w:start w:val="single" w:sz="2" w:space="0" w:color="000000"/>
+              <w:bottom w:val="single" w:sz="4" w:space="0" w:color="000000"/>
+              <w:end w:val="single" w:sz="18" w:space="0" w:color="000000"/>
+            </w:tcBorders>
           </w:tcPr>
           <w:p>
             <w:pPr>
@@ -10100,7 +10154,10 @@
         <w:tc>
           <w:tcPr>
             <w:tcW w:w="1887" w:type="dxa"/>
-            <w:tcBorders/>
+            <w:tcBorders>
+              <w:start w:val="single" w:sz="18" w:space="0" w:color="000000"/>
+              <w:bottom w:val="single" w:sz="4" w:space="0" w:color="000000"/>
+            </w:tcBorders>
           </w:tcPr>
           <w:p>
             <w:pPr>
@@ -10116,7 +10173,11 @@
         <w:tc>
           <w:tcPr>
             <w:tcW w:w="4138" w:type="dxa"/>
-            <w:tcBorders/>
+            <w:tcBorders>
+              <w:start w:val="single" w:sz="2" w:space="0" w:color="000000"/>
+              <w:bottom w:val="single" w:sz="4" w:space="0" w:color="000000"/>
+              <w:end w:val="single" w:sz="18" w:space="0" w:color="000000"/>
+            </w:tcBorders>
           </w:tcPr>
           <w:p>
             <w:pPr>
@@ -10137,7 +10198,10 @@
         <w:tc>
           <w:tcPr>
             <w:tcW w:w="1887" w:type="dxa"/>
-            <w:tcBorders/>
+            <w:tcBorders>
+              <w:start w:val="single" w:sz="18" w:space="0" w:color="000000"/>
+              <w:bottom w:val="single" w:sz="4" w:space="0" w:color="000000"/>
+            </w:tcBorders>
           </w:tcPr>
           <w:p>
             <w:pPr>
@@ -10153,7 +10217,11 @@
         <w:tc>
           <w:tcPr>
             <w:tcW w:w="4138" w:type="dxa"/>
-            <w:tcBorders/>
+            <w:tcBorders>
+              <w:start w:val="single" w:sz="2" w:space="0" w:color="000000"/>
+              <w:bottom w:val="single" w:sz="4" w:space="0" w:color="000000"/>
+              <w:end w:val="single" w:sz="18" w:space="0" w:color="000000"/>
+            </w:tcBorders>
           </w:tcPr>
           <w:p>
             <w:pPr>
@@ -10172,7 +10240,10 @@
         <w:tc>
           <w:tcPr>
             <w:tcW w:w="1887" w:type="dxa"/>
-            <w:tcBorders/>
+            <w:tcBorders>
+              <w:start w:val="single" w:sz="18" w:space="0" w:color="000000"/>
+              <w:bottom w:val="single" w:sz="4" w:space="0" w:color="000000"/>
+            </w:tcBorders>
           </w:tcPr>
           <w:p>
             <w:pPr>
@@ -10188,7 +10259,11 @@
         <w:tc>
           <w:tcPr>
             <w:tcW w:w="4138" w:type="dxa"/>
-            <w:tcBorders/>
+            <w:tcBorders>
+              <w:start w:val="single" w:sz="2" w:space="0" w:color="000000"/>
+              <w:bottom w:val="single" w:sz="4" w:space="0" w:color="000000"/>
+              <w:end w:val="single" w:sz="18" w:space="0" w:color="000000"/>
+            </w:tcBorders>
           </w:tcPr>
           <w:p>
             <w:pPr>
@@ -10207,7 +10282,10 @@
         <w:tc>
           <w:tcPr>
             <w:tcW w:w="1887" w:type="dxa"/>
-            <w:tcBorders/>
+            <w:tcBorders>
+              <w:start w:val="single" w:sz="18" w:space="0" w:color="000000"/>
+              <w:bottom w:val="single" w:sz="4" w:space="0" w:color="000000"/>
+            </w:tcBorders>
           </w:tcPr>
           <w:p>
             <w:pPr>
@@ -10223,7 +10301,11 @@
         <w:tc>
           <w:tcPr>
             <w:tcW w:w="4138" w:type="dxa"/>
-            <w:tcBorders/>
+            <w:tcBorders>
+              <w:start w:val="single" w:sz="2" w:space="0" w:color="000000"/>
+              <w:bottom w:val="single" w:sz="4" w:space="0" w:color="000000"/>
+              <w:end w:val="single" w:sz="18" w:space="0" w:color="000000"/>
+            </w:tcBorders>
           </w:tcPr>
           <w:p>
             <w:pPr>
@@ -10242,7 +10324,10 @@
         <w:tc>
           <w:tcPr>
             <w:tcW w:w="1887" w:type="dxa"/>
-            <w:tcBorders/>
+            <w:tcBorders>
+              <w:start w:val="single" w:sz="18" w:space="0" w:color="000000"/>
+              <w:bottom w:val="single" w:sz="4" w:space="0" w:color="000000"/>
+            </w:tcBorders>
           </w:tcPr>
           <w:p>
             <w:pPr>
@@ -10258,7 +10343,11 @@
         <w:tc>
           <w:tcPr>
             <w:tcW w:w="4138" w:type="dxa"/>
-            <w:tcBorders/>
+            <w:tcBorders>
+              <w:start w:val="single" w:sz="2" w:space="0" w:color="000000"/>
+              <w:bottom w:val="single" w:sz="4" w:space="0" w:color="000000"/>
+              <w:end w:val="single" w:sz="18" w:space="0" w:color="000000"/>
+            </w:tcBorders>
           </w:tcPr>
           <w:p>
             <w:pPr>
@@ -10277,7 +10366,10 @@
         <w:tc>
           <w:tcPr>
             <w:tcW w:w="1887" w:type="dxa"/>
-            <w:tcBorders/>
+            <w:tcBorders>
+              <w:start w:val="single" w:sz="18" w:space="0" w:color="000000"/>
+              <w:bottom w:val="single" w:sz="4" w:space="0" w:color="000000"/>
+            </w:tcBorders>
           </w:tcPr>
           <w:p>
             <w:pPr>
@@ -10293,7 +10385,11 @@
         <w:tc>
           <w:tcPr>
             <w:tcW w:w="4138" w:type="dxa"/>
-            <w:tcBorders/>
+            <w:tcBorders>
+              <w:start w:val="single" w:sz="2" w:space="0" w:color="000000"/>
+              <w:bottom w:val="single" w:sz="4" w:space="0" w:color="000000"/>
+              <w:end w:val="single" w:sz="18" w:space="0" w:color="000000"/>
+            </w:tcBorders>
           </w:tcPr>
           <w:p>
             <w:pPr>
@@ -10312,7 +10408,10 @@
         <w:tc>
           <w:tcPr>
             <w:tcW w:w="1887" w:type="dxa"/>
-            <w:tcBorders/>
+            <w:tcBorders>
+              <w:start w:val="single" w:sz="18" w:space="0" w:color="000000"/>
+              <w:bottom w:val="single" w:sz="4" w:space="0" w:color="000000"/>
+            </w:tcBorders>
           </w:tcPr>
           <w:p>
             <w:pPr>
@@ -10328,7 +10427,11 @@
         <w:tc>
           <w:tcPr>
             <w:tcW w:w="4138" w:type="dxa"/>
-            <w:tcBorders/>
+            <w:tcBorders>
+              <w:start w:val="single" w:sz="2" w:space="0" w:color="000000"/>
+              <w:bottom w:val="single" w:sz="4" w:space="0" w:color="000000"/>
+              <w:end w:val="single" w:sz="18" w:space="0" w:color="000000"/>
+            </w:tcBorders>
           </w:tcPr>
           <w:p>
             <w:pPr>
@@ -10347,7 +10450,10 @@
         <w:tc>
           <w:tcPr>
             <w:tcW w:w="1887" w:type="dxa"/>
-            <w:tcBorders/>
+            <w:tcBorders>
+              <w:start w:val="single" w:sz="18" w:space="0" w:color="000000"/>
+              <w:bottom w:val="single" w:sz="4" w:space="0" w:color="000000"/>
+            </w:tcBorders>
           </w:tcPr>
           <w:p>
             <w:pPr>
@@ -10363,7 +10469,11 @@
         <w:tc>
           <w:tcPr>
             <w:tcW w:w="4138" w:type="dxa"/>
-            <w:tcBorders/>
+            <w:tcBorders>
+              <w:start w:val="single" w:sz="2" w:space="0" w:color="000000"/>
+              <w:bottom w:val="single" w:sz="4" w:space="0" w:color="000000"/>
+              <w:end w:val="single" w:sz="18" w:space="0" w:color="000000"/>
+            </w:tcBorders>
           </w:tcPr>
           <w:p>
             <w:pPr>
@@ -10382,7 +10492,10 @@
         <w:tc>
           <w:tcPr>
             <w:tcW w:w="1887" w:type="dxa"/>
-            <w:tcBorders/>
+            <w:tcBorders>
+              <w:start w:val="single" w:sz="18" w:space="0" w:color="000000"/>
+              <w:bottom w:val="single" w:sz="4" w:space="0" w:color="000000"/>
+            </w:tcBorders>
           </w:tcPr>
           <w:p>
             <w:pPr>
@@ -10398,7 +10511,11 @@
         <w:tc>
           <w:tcPr>
             <w:tcW w:w="4138" w:type="dxa"/>
-            <w:tcBorders/>
+            <w:tcBorders>
+              <w:start w:val="single" w:sz="2" w:space="0" w:color="000000"/>
+              <w:bottom w:val="single" w:sz="4" w:space="0" w:color="000000"/>
+              <w:end w:val="single" w:sz="18" w:space="0" w:color="000000"/>
+            </w:tcBorders>
           </w:tcPr>
           <w:p>
             <w:pPr>
@@ -10417,7 +10534,10 @@
         <w:tc>
           <w:tcPr>
             <w:tcW w:w="1887" w:type="dxa"/>
-            <w:tcBorders/>
+            <w:tcBorders>
+              <w:start w:val="single" w:sz="18" w:space="0" w:color="000000"/>
+              <w:bottom w:val="single" w:sz="18" w:space="0" w:color="000000"/>
+            </w:tcBorders>
           </w:tcPr>
           <w:p>
             <w:pPr>
@@ -10433,7 +10553,11 @@
         <w:tc>
           <w:tcPr>
             <w:tcW w:w="4138" w:type="dxa"/>
-            <w:tcBorders/>
+            <w:tcBorders>
+              <w:start w:val="single" w:sz="2" w:space="0" w:color="000000"/>
+              <w:bottom w:val="single" w:sz="18" w:space="0" w:color="000000"/>
+              <w:end w:val="single" w:sz="18" w:space="0" w:color="000000"/>
+            </w:tcBorders>
           </w:tcPr>
           <w:p>
             <w:pPr>
@@ -10476,7 +10600,114 @@
       <w:bookmarkEnd w:id="34"/>
       <w:r>
         <w:rPr/>
+        <w:drawing>
+          <wp:anchor distT="0" distB="0" distL="0" distR="0" simplePos="0" relativeHeight="27" behindDoc="0" locked="0" layoutInCell="0" allowOverlap="1">
+            <wp:simplePos x="0" y="0"/>
+            <wp:positionH relativeFrom="column">
+              <wp:posOffset>4444365</wp:posOffset>
+            </wp:positionH>
+            <wp:positionV relativeFrom="paragraph">
+              <wp:posOffset>227965</wp:posOffset>
+            </wp:positionV>
+            <wp:extent cx="1992630" cy="2646680"/>
+            <wp:effectExtent l="0" t="0" r="0" b="0"/>
+            <wp:wrapSquare wrapText="left"/>
+            <wp:docPr id="24" name="Image18"/>
+            <wp:cNvGraphicFramePr>
+              <a:graphicFrameLocks xmlns:a="http://schemas.openxmlformats.org/drawingml/2006/main" noChangeAspect="1"/>
+            </wp:cNvGraphicFramePr>
+            <a:graphic xmlns:a="http://schemas.openxmlformats.org/drawingml/2006/main">
+              <a:graphicData uri="http://schemas.openxmlformats.org/drawingml/2006/picture">
+                <pic:pic xmlns:pic="http://schemas.openxmlformats.org/drawingml/2006/picture">
+                  <pic:nvPicPr>
+                    <pic:cNvPr id="24" name="Image18"/>
+                    <pic:cNvPicPr>
+                      <a:picLocks noChangeAspect="1" noChangeArrowheads="1"/>
+                    </pic:cNvPicPr>
+                  </pic:nvPicPr>
+                  <pic:blipFill>
+                    <a:blip r:embed="rId19"/>
+                    <a:stretch>
+                      <a:fillRect/>
+                    </a:stretch>
+                  </pic:blipFill>
+                  <pic:spPr bwMode="auto">
+                    <a:xfrm>
+                      <a:off x="0" y="0"/>
+                      <a:ext cx="1992630" cy="2646680"/>
+                    </a:xfrm>
+                    <a:prstGeom prst="rect">
+                      <a:avLst/>
+                    </a:prstGeom>
+                    <a:noFill/>
+                  </pic:spPr>
+                </pic:pic>
+              </a:graphicData>
+            </a:graphic>
+          </wp:anchor>
+        </w:drawing>
+      </w:r>
+      <w:r>
+        <w:rPr/>
         <w:t>Background Test</w:t>
+      </w:r>
+    </w:p>
+    <w:p>
+      <w:pPr>
+        <w:pStyle w:val="BodyText"/>
+        <w:bidi w:val="0"/>
+        <w:ind w:hanging="0" w:start="0"/>
+        <w:jc w:val="start"/>
+        <w:rPr/>
+      </w:pPr>
+      <w:r>
+        <w:rPr/>
+        <w:t xml:space="preserve">The background objects are things like the text that prints onto the screen. It has a fixed color palette for the whole screen. This test’s purpose is to print the entire contents of both video ROMs as it would be used by the game </w:t>
+      </w:r>
+      <w:r>
+        <w:rPr/>
+        <w:t>in a 16 x 16 grid</w:t>
+      </w:r>
+      <w:r>
+        <w:rPr/>
+        <w:t xml:space="preserve">. </w:t>
+      </w:r>
+      <w:r>
+        <w:rPr/>
+        <w:t xml:space="preserve">The background object ID can be represented by $YX where Y is the vertical values and X is the horizontal values of the grid. </w:t>
+      </w:r>
+      <w:r>
+        <w:rPr/>
+        <w:t>To return back to the runtime menu press the jump button.</w:t>
+      </w:r>
+    </w:p>
+    <w:p>
+      <w:pPr>
+        <w:pStyle w:val="BodyText"/>
+        <w:bidi w:val="0"/>
+        <w:ind w:hanging="0" w:start="0"/>
+        <w:jc w:val="start"/>
+        <w:rPr/>
+      </w:pPr>
+      <w:r>
+        <w:rPr/>
+        <w:t xml:space="preserve">The video ROMs are driven by 2114 SRAMs on the video board in order to make make the background object data. It also feeds a MB7052 (82S129) color PROM to account for the color data for the background objects. When the CPU isn’t writing to the background objects </w:t>
+      </w:r>
+      <w:r>
+        <w:rPr/>
+        <w:t xml:space="preserve">the RAM uses the horizontal and vertical counters. In the event that there is issues with the CPU not being able to write to the RAM but the data is not corrupted, then it could be the control logic, 74LS157 Multiplexers, or 74LS245 buffer. </w:t>
+      </w:r>
+      <w:r>
+        <w:rPr/>
+        <w:t xml:space="preserve">If the background </w:t>
+      </w:r>
+      <w:r>
+        <w:rPr/>
+        <w:t xml:space="preserve">objects themselves are corrupted, it is likely an issue with the ROMs themselves or an issue with the data after the ROMs. The ROM data feeds into two 74LS299 shift registers </w:t>
+      </w:r>
+      <w:r>
+        <w:rPr/>
+        <w:t>and then gets mixed with the sprite data before going to the CPU board.</w:t>
       </w:r>
     </w:p>
     <w:p>
@@ -10495,7 +10726,86 @@
       <w:bookmarkEnd w:id="35"/>
       <w:r>
         <w:rPr/>
+        <w:drawing>
+          <wp:anchor distT="0" distB="0" distL="0" distR="0" simplePos="0" relativeHeight="28" behindDoc="0" locked="0" layoutInCell="0" allowOverlap="1">
+            <wp:simplePos x="0" y="0"/>
+            <wp:positionH relativeFrom="column">
+              <wp:posOffset>4192905</wp:posOffset>
+            </wp:positionH>
+            <wp:positionV relativeFrom="paragraph">
+              <wp:posOffset>225425</wp:posOffset>
+            </wp:positionV>
+            <wp:extent cx="2201545" cy="2931160"/>
+            <wp:effectExtent l="0" t="0" r="0" b="0"/>
+            <wp:wrapSquare wrapText="largest"/>
+            <wp:docPr id="25" name="Image19"/>
+            <wp:cNvGraphicFramePr>
+              <a:graphicFrameLocks xmlns:a="http://schemas.openxmlformats.org/drawingml/2006/main" noChangeAspect="1"/>
+            </wp:cNvGraphicFramePr>
+            <a:graphic xmlns:a="http://schemas.openxmlformats.org/drawingml/2006/main">
+              <a:graphicData uri="http://schemas.openxmlformats.org/drawingml/2006/picture">
+                <pic:pic xmlns:pic="http://schemas.openxmlformats.org/drawingml/2006/picture">
+                  <pic:nvPicPr>
+                    <pic:cNvPr id="25" name="Image19"/>
+                    <pic:cNvPicPr>
+                      <a:picLocks noChangeAspect="1" noChangeArrowheads="1"/>
+                    </pic:cNvPicPr>
+                  </pic:nvPicPr>
+                  <pic:blipFill>
+                    <a:blip r:embed="rId20"/>
+                    <a:stretch>
+                      <a:fillRect/>
+                    </a:stretch>
+                  </pic:blipFill>
+                  <pic:spPr bwMode="auto">
+                    <a:xfrm>
+                      <a:off x="0" y="0"/>
+                      <a:ext cx="2201545" cy="2931160"/>
+                    </a:xfrm>
+                    <a:prstGeom prst="rect">
+                      <a:avLst/>
+                    </a:prstGeom>
+                    <a:noFill/>
+                  </pic:spPr>
+                </pic:pic>
+              </a:graphicData>
+            </a:graphic>
+          </wp:anchor>
+        </w:drawing>
+      </w:r>
+      <w:r>
+        <w:rPr/>
         <w:t>Sprite Test</w:t>
+      </w:r>
+    </w:p>
+    <w:p>
+      <w:pPr>
+        <w:pStyle w:val="BodyText"/>
+        <w:bidi w:val="0"/>
+        <w:ind w:hanging="0" w:start="0"/>
+        <w:jc w:val="start"/>
+        <w:rPr/>
+      </w:pPr>
+      <w:r>
+        <w:rPr/>
+        <w:t xml:space="preserve">The sprite test simply gives means to print a sprite and give the user the ability to move it around on the screen. The sprite can be changed by pressing P1 and the color palette can be changed by pressing P2. The sprite can be moved around on the screen using the </w:t>
+      </w:r>
+      <w:r>
+        <w:rPr/>
+        <w:t>joystick.</w:t>
+      </w:r>
+    </w:p>
+    <w:p>
+      <w:pPr>
+        <w:pStyle w:val="BodyText"/>
+        <w:bidi w:val="0"/>
+        <w:ind w:hanging="0" w:start="0"/>
+        <w:jc w:val="start"/>
+        <w:rPr/>
+      </w:pPr>
+      <w:r>
+        <w:rPr/>
+        <w:t>The test can be useful for troubleshooting position issues and issues where there are “dead zones” in which the sprite disappears. The sprite data gets written to the 2148 SRAMs on the video board. It’s access circuitry is nearly identical to the video/background RAM. Data from the CPU goes through a 74LS245 buffer and the address lines get mixed in using 74LS157 multiplexers. How the RAM data is used is much more complicated. The data gets latched then aligned with the vertical positions. From there it goes through an 82S09 bipolar RAM. After the bipolar RAM it goes through the ECL RAM setup which is responsible for color and pixel data. It also references the four 2716 ROMs for the actual sprite data. Sprite issues can get very tricky and convoluted quickly. To troubleshoot the data after the RAM refer to the schematics.</w:t>
       </w:r>
     </w:p>
     <w:p>
@@ -10940,7 +11250,7 @@
         </w:rPr>
         <w:t xml:space="preserve">2114: </w:t>
       </w:r>
-      <w:hyperlink r:id="rId19">
+      <w:hyperlink r:id="rId21">
         <w:r>
           <w:rPr>
             <w:rStyle w:val="Hyperlink"/>
@@ -10968,7 +11278,7 @@
         </w:rPr>
         <w:t xml:space="preserve">2148: </w:t>
       </w:r>
-      <w:hyperlink r:id="rId20">
+      <w:hyperlink r:id="rId22">
         <w:r>
           <w:rPr>
             <w:rStyle w:val="Hyperlink"/>
@@ -11021,7 +11331,7 @@
         </w:rPr>
         <w:t xml:space="preserve">74LS08: </w:t>
       </w:r>
-      <w:hyperlink r:id="rId21">
+      <w:hyperlink r:id="rId23">
         <w:r>
           <w:rPr>
             <w:rStyle w:val="Hyperlink"/>
@@ -11049,7 +11359,7 @@
         </w:rPr>
         <w:t xml:space="preserve">74LS32: </w:t>
       </w:r>
-      <w:hyperlink r:id="rId22">
+      <w:hyperlink r:id="rId24">
         <w:r>
           <w:rPr>
             <w:rStyle w:val="Hyperlink"/>
@@ -11077,7 +11387,7 @@
         </w:rPr>
         <w:t xml:space="preserve">74LS138: </w:t>
       </w:r>
-      <w:hyperlink r:id="rId23">
+      <w:hyperlink r:id="rId25">
         <w:r>
           <w:rPr>
             <w:rStyle w:val="Hyperlink"/>
@@ -11105,7 +11415,7 @@
         </w:rPr>
         <w:t xml:space="preserve">74LS139: </w:t>
       </w:r>
-      <w:hyperlink r:id="rId24">
+      <w:hyperlink r:id="rId26">
         <w:r>
           <w:rPr>
             <w:rStyle w:val="Hyperlink"/>
@@ -11140,7 +11450,7 @@
         </w:rPr>
         <w:t xml:space="preserve"> </w:t>
       </w:r>
-      <w:hyperlink r:id="rId25">
+      <w:hyperlink r:id="rId27">
         <w:r>
           <w:rPr>
             <w:rStyle w:val="Hyperlink"/>
@@ -11175,7 +11485,7 @@
         </w:rPr>
         <w:t xml:space="preserve"> </w:t>
       </w:r>
-      <w:hyperlink r:id="rId26">
+      <w:hyperlink r:id="rId28">
         <w:r>
           <w:rPr>
             <w:rStyle w:val="Hyperlink"/>
@@ -11362,9 +11672,9 @@
       </w:r>
     </w:p>
     <w:sectPr>
-      <w:footerReference w:type="even" r:id="rId27"/>
-      <w:footerReference w:type="default" r:id="rId28"/>
-      <w:footerReference w:type="first" r:id="rId29"/>
+      <w:footerReference w:type="even" r:id="rId29"/>
+      <w:footerReference w:type="default" r:id="rId30"/>
+      <w:footerReference w:type="first" r:id="rId31"/>
       <w:type w:val="nextPage"/>
       <w:pgSz w:w="12240" w:h="15840"/>
       <w:pgMar w:left="1134" w:right="1134" w:gutter="0" w:header="0" w:top="1134" w:footer="756" w:bottom="1318"/>
@@ -11421,7 +11731,7 @@
     </w:r>
     <w:r>
       <w:rPr/>
-      <w:t>16</w:t>
+      <w:t>18</w:t>
     </w:r>
     <w:r>
       <w:rPr/>
@@ -12027,11 +12337,16 @@
     <w:next w:val="BodyText"/>
     <w:qFormat/>
     <w:pPr>
+      <w:widowControl/>
       <w:numPr>
         <w:ilvl w:val="0"/>
-        <w:numId w:val="1"/>
+        <w:numId w:val="0"/>
       </w:numPr>
+      <w:suppressAutoHyphens w:val="true"/>
+      <w:bidi w:val="0"/>
       <w:spacing w:before="240" w:after="120"/>
+      <w:ind w:hanging="0" w:start="0"/>
+      <w:jc w:val="start"/>
       <w:outlineLvl w:val="0"/>
     </w:pPr>
     <w:rPr>

</xml_diff>

<commit_message>
Added a couple bits of clarification
</commit_message>
<xml_diff>
--- a/Donkey Kong/Manual/TKGTestROMManual.docx
+++ b/Donkey Kong/Manual/TKGTestROMManual.docx
@@ -1286,7 +1286,11 @@
       </w:pPr>
       <w:r>
         <w:rPr/>
-        <w:t>TRS2 – RAM, ROM, DMA, and NMI tests should all work. However, it is a different game so audio tests will not work. Monitor tests might also not work correctly.</w:t>
+        <w:t xml:space="preserve">TRS2 – RAM, ROM, DMA, and NMI tests should all work. However, it is a different game so audio tests will not work. Monitor tests might also not work correctly. </w:t>
+      </w:r>
+      <w:r>
+        <w:rPr/>
+        <w:t>It is recommended to use the TRS variant of the test ROM.</w:t>
       </w:r>
     </w:p>
     <w:p>
@@ -1334,7 +1338,15 @@
       <w:bookmarkEnd w:id="4"/>
       <w:r>
         <w:rPr/>
-        <w:t>Using the test ROM is very simple. The ROM is burnt onto a 2532 4k EPROM. In order to run the tests you place the EPROM into location 5F for TKG2/TKG3 hardware and 5E TKG4 hardware. Note the notch in the socket, EPROM, and pin 1 markers. After the ROM is inserted reconnect the board back to the cabinet or bench setup for testing.</w:t>
+        <w:t xml:space="preserve">Using the test ROM is very simple. The ROM is burnt onto a 2532 4k EPROM. In order to run the tests you place the EPROM into location 5F for TKG2/TKG3 hardware and 5E TKG4 hardware </w:t>
+      </w:r>
+      <w:r>
+        <w:rPr/>
+        <w:t>(removing the ROM IC that is already installed at that location)</w:t>
+      </w:r>
+      <w:r>
+        <w:rPr/>
+        <w:t>. Note the notch in the socket, EPROM, and pin 1 markers. After the ROM is inserted reconnect the board back to the cabinet or bench setup for testing.</w:t>
       </w:r>
     </w:p>
     <w:p>
@@ -2309,8 +2321,8 @@
       <w:pPr>
         <w:pStyle w:val="Heading3"/>
         <w:numPr>
-          <w:ilvl w:val="2"/>
-          <w:numId w:val="1"/>
+          <w:ilvl w:val="0"/>
+          <w:numId w:val="0"/>
         </w:numPr>
         <w:bidi w:val="0"/>
         <w:ind w:hanging="0" w:start="0"/>
@@ -11731,7 +11743,7 @@
     </w:r>
     <w:r>
       <w:rPr/>
-      <w:t>18</w:t>
+      <w:t>19</w:t>
     </w:r>
     <w:r>
       <w:rPr/>

</xml_diff>

<commit_message>
Updated table of contents
</commit_message>
<xml_diff>
--- a/Donkey Kong/Manual/TKGTestROMManual.docx
+++ b/Donkey Kong/Manual/TKGTestROMManual.docx
@@ -274,6 +274,26 @@
         </w:p>
         <w:p>
           <w:pPr>
+            <w:pStyle w:val="TOC2"/>
+            <w:tabs>
+              <w:tab w:val="clear" w:pos="9972"/>
+              <w:tab w:val="right" w:pos="9971" w:leader="dot"/>
+            </w:tabs>
+            <w:rPr/>
+          </w:pPr>
+          <w:hyperlink w:anchor="__RefHeading___Toc4994_4272816106" w:tooltip="Limitations">
+            <w:r>
+              <w:rPr>
+                <w:rStyle w:val="IndexLink"/>
+              </w:rPr>
+              <w:t>Limitations</w:t>
+              <w:tab/>
+              <w:t>4</w:t>
+            </w:r>
+          </w:hyperlink>
+        </w:p>
+        <w:p>
+          <w:pPr>
             <w:pStyle w:val="TOC1"/>
             <w:tabs>
               <w:tab w:val="clear" w:pos="9972"/>
@@ -288,7 +308,7 @@
               </w:rPr>
               <w:t>Chapter 2: Startup Tests</w:t>
               <w:tab/>
-              <w:t>5</w:t>
+              <w:t>6</w:t>
             </w:r>
           </w:hyperlink>
         </w:p>
@@ -308,7 +328,7 @@
               </w:rPr>
               <w:t>RAM Tests</w:t>
               <w:tab/>
-              <w:t>5</w:t>
+              <w:t>6</w:t>
             </w:r>
           </w:hyperlink>
         </w:p>
@@ -328,7 +348,7 @@
               </w:rPr>
               <w:t>RAM IC Tests</w:t>
               <w:tab/>
-              <w:t>5</w:t>
+              <w:t>6</w:t>
             </w:r>
           </w:hyperlink>
         </w:p>
@@ -348,7 +368,7 @@
               </w:rPr>
               <w:t>RAM Bank Test</w:t>
               <w:tab/>
-              <w:t>5</w:t>
+              <w:t>6</w:t>
             </w:r>
           </w:hyperlink>
         </w:p>
@@ -361,14 +381,14 @@
             </w:tabs>
             <w:rPr/>
           </w:pPr>
-          <w:hyperlink w:anchor="__RefHeading___Toc3936_33709793" w:tooltip="Brief Explaination of RAM Functionality">
+          <w:hyperlink w:anchor="__RefHeading___Toc3936_33709793" w:tooltip="Brief Explanation of RAM Functionality">
             <w:r>
               <w:rPr>
                 <w:rStyle w:val="IndexLink"/>
               </w:rPr>
-              <w:t>Brief Explaination of RAM Functionality</w:t>
+              <w:t>Brief Explanation of RAM Functionality</w:t>
               <w:tab/>
-              <w:t>5</w:t>
+              <w:t>6</w:t>
             </w:r>
           </w:hyperlink>
         </w:p>
@@ -388,7 +408,7 @@
               </w:rPr>
               <w:t>RAM Failure Tones</w:t>
               <w:tab/>
-              <w:t>6</w:t>
+              <w:t>7</w:t>
             </w:r>
           </w:hyperlink>
         </w:p>
@@ -408,7 +428,7 @@
               </w:rPr>
               <w:t>TRS2 and TKG2 RAM Locations</w:t>
               <w:tab/>
-              <w:t>6</w:t>
+              <w:t>7</w:t>
             </w:r>
           </w:hyperlink>
         </w:p>
@@ -428,7 +448,7 @@
               </w:rPr>
               <w:t>TKG3 RAM Locations</w:t>
               <w:tab/>
-              <w:t>7</w:t>
+              <w:t>8</w:t>
             </w:r>
           </w:hyperlink>
         </w:p>
@@ -448,7 +468,7 @@
               </w:rPr>
               <w:t>TKG4 RAM Locations</w:t>
               <w:tab/>
-              <w:t>7</w:t>
+              <w:t>8</w:t>
             </w:r>
           </w:hyperlink>
         </w:p>
@@ -468,7 +488,7 @@
               </w:rPr>
               <w:t>ROM Checksums</w:t>
               <w:tab/>
-              <w:t>7</w:t>
+              <w:t>8</w:t>
             </w:r>
           </w:hyperlink>
         </w:p>
@@ -488,7 +508,7 @@
               </w:rPr>
               <w:t>Test ROM Integrity Test</w:t>
               <w:tab/>
-              <w:t>7</w:t>
+              <w:t>8</w:t>
             </w:r>
           </w:hyperlink>
         </w:p>
@@ -508,7 +528,7 @@
               </w:rPr>
               <w:t>ROM Locations</w:t>
               <w:tab/>
-              <w:t>8</w:t>
+              <w:t>9</w:t>
             </w:r>
           </w:hyperlink>
         </w:p>
@@ -528,7 +548,7 @@
               </w:rPr>
               <w:t>ROM Checksum Table</w:t>
               <w:tab/>
-              <w:t>8</w:t>
+              <w:t>9</w:t>
             </w:r>
           </w:hyperlink>
         </w:p>
@@ -548,7 +568,7 @@
               </w:rPr>
               <w:t>DMA Test</w:t>
               <w:tab/>
-              <w:t>8</w:t>
+              <w:t>9</w:t>
             </w:r>
           </w:hyperlink>
         </w:p>
@@ -568,7 +588,7 @@
               </w:rPr>
               <w:t>NMI Test</w:t>
               <w:tab/>
-              <w:t>9</w:t>
+              <w:t>10</w:t>
             </w:r>
           </w:hyperlink>
         </w:p>
@@ -588,7 +608,7 @@
               </w:rPr>
               <w:t>Audio Tests</w:t>
               <w:tab/>
-              <w:t>9</w:t>
+              <w:t>10</w:t>
             </w:r>
           </w:hyperlink>
         </w:p>
@@ -608,7 +628,7 @@
               </w:rPr>
               <w:t>Transition to Runtime</w:t>
               <w:tab/>
-              <w:t>9</w:t>
+              <w:t>10</w:t>
             </w:r>
           </w:hyperlink>
         </w:p>
@@ -628,7 +648,7 @@
               </w:rPr>
               <w:t>Chapter 3: Runtime Tests</w:t>
               <w:tab/>
-              <w:t>10</w:t>
+              <w:t>11</w:t>
             </w:r>
           </w:hyperlink>
         </w:p>
@@ -648,7 +668,7 @@
               </w:rPr>
               <w:t>Controls Test</w:t>
               <w:tab/>
-              <w:t>10</w:t>
+              <w:t>11</w:t>
             </w:r>
           </w:hyperlink>
         </w:p>
@@ -668,7 +688,7 @@
               </w:rPr>
               <w:t>DIP Switch Test</w:t>
               <w:tab/>
-              <w:t>10</w:t>
+              <w:t>11</w:t>
             </w:r>
           </w:hyperlink>
         </w:p>
@@ -688,7 +708,7 @@
               </w:rPr>
               <w:t>Palette Test</w:t>
               <w:tab/>
-              <w:t>11</w:t>
+              <w:t>12</w:t>
             </w:r>
           </w:hyperlink>
         </w:p>
@@ -708,7 +728,7 @@
               </w:rPr>
               <w:t>Screen Invert</w:t>
               <w:tab/>
-              <w:t>11</w:t>
+              <w:t>12</w:t>
             </w:r>
           </w:hyperlink>
         </w:p>
@@ -728,7 +748,7 @@
               </w:rPr>
               <w:t>Monitor Test</w:t>
               <w:tab/>
-              <w:t>11</w:t>
+              <w:t>12</w:t>
             </w:r>
           </w:hyperlink>
         </w:p>
@@ -748,7 +768,7 @@
               </w:rPr>
               <w:t>Pattern 0 – Checker Board</w:t>
               <w:tab/>
-              <w:t>12</w:t>
+              <w:t>13</w:t>
             </w:r>
           </w:hyperlink>
         </w:p>
@@ -768,7 +788,7 @@
               </w:rPr>
               <w:t>Pattern 1 – Grid</w:t>
               <w:tab/>
-              <w:t>12</w:t>
+              <w:t>13</w:t>
             </w:r>
           </w:hyperlink>
         </w:p>
@@ -788,7 +808,7 @@
               </w:rPr>
               <w:t>Pattern 2 – Block</w:t>
               <w:tab/>
-              <w:t>12</w:t>
+              <w:t>13</w:t>
             </w:r>
           </w:hyperlink>
         </w:p>
@@ -808,7 +828,7 @@
               </w:rPr>
               <w:t>Sound Test</w:t>
               <w:tab/>
-              <w:t>13</w:t>
+              <w:t>14</w:t>
             </w:r>
           </w:hyperlink>
         </w:p>
@@ -828,7 +848,7 @@
               </w:rPr>
               <w:t>Music Test</w:t>
               <w:tab/>
-              <w:t>13</w:t>
+              <w:t>14</w:t>
             </w:r>
           </w:hyperlink>
         </w:p>
@@ -848,7 +868,7 @@
               </w:rPr>
               <w:t>Background Test</w:t>
               <w:tab/>
-              <w:t>14</w:t>
+              <w:t>15</w:t>
             </w:r>
           </w:hyperlink>
         </w:p>
@@ -868,7 +888,7 @@
               </w:rPr>
               <w:t>Sprite Test</w:t>
               <w:tab/>
-              <w:t>14</w:t>
+              <w:t>16</w:t>
             </w:r>
           </w:hyperlink>
         </w:p>
@@ -888,7 +908,7 @@
               </w:rPr>
               <w:t>Reset</w:t>
               <w:tab/>
-              <w:t>14</w:t>
+              <w:t>16</w:t>
             </w:r>
           </w:hyperlink>
         </w:p>
@@ -908,7 +928,7 @@
               </w:rPr>
               <w:t>Chapter 4: Test Architectures</w:t>
               <w:tab/>
-              <w:t>15</w:t>
+              <w:t>17</w:t>
             </w:r>
           </w:hyperlink>
         </w:p>
@@ -928,7 +948,7 @@
               </w:rPr>
               <w:t>Appendix A: Abbreviations</w:t>
               <w:tab/>
-              <w:t>16</w:t>
+              <w:t>18</w:t>
             </w:r>
           </w:hyperlink>
         </w:p>
@@ -948,7 +968,7 @@
               </w:rPr>
               <w:t>Appendix B: ICs mentioned</w:t>
               <w:tab/>
-              <w:t>17</w:t>
+              <w:t>19</w:t>
             </w:r>
           </w:hyperlink>
           <w:r>
@@ -1478,6 +1498,8 @@
         <w:ind w:hanging="0" w:start="0"/>
         <w:rPr/>
       </w:pPr>
+      <w:bookmarkStart w:id="5" w:name="__RefHeading___Toc4994_4272816106"/>
+      <w:bookmarkEnd w:id="5"/>
       <w:r>
         <w:rPr/>
         <w:t>Limitations</w:t>
@@ -1523,8 +1545,8 @@
         <w:jc w:val="start"/>
         <w:rPr/>
       </w:pPr>
-      <w:bookmarkStart w:id="5" w:name="__RefHeading___Toc215_1351480008"/>
-      <w:bookmarkEnd w:id="5"/>
+      <w:bookmarkStart w:id="6" w:name="__RefHeading___Toc215_1351480008"/>
+      <w:bookmarkEnd w:id="6"/>
       <w:r>
         <w:rPr/>
         <w:t>Chapter 2: Startup Tests</w:t>
@@ -1542,8 +1564,8 @@
         <w:jc w:val="start"/>
         <w:rPr/>
       </w:pPr>
-      <w:bookmarkStart w:id="6" w:name="__RefHeading___Toc217_1351480008"/>
-      <w:bookmarkEnd w:id="6"/>
+      <w:bookmarkStart w:id="7" w:name="__RefHeading___Toc217_1351480008"/>
+      <w:bookmarkEnd w:id="7"/>
       <w:r>
         <w:rPr/>
         <w:t>RAM Tests</w:t>
@@ -1593,8 +1615,8 @@
         <w:jc w:val="start"/>
         <w:rPr/>
       </w:pPr>
-      <w:bookmarkStart w:id="7" w:name="__RefHeading___Toc808_1351480008"/>
-      <w:bookmarkEnd w:id="7"/>
+      <w:bookmarkStart w:id="8" w:name="__RefHeading___Toc808_1351480008"/>
+      <w:bookmarkEnd w:id="8"/>
       <w:r>
         <w:rPr/>
         <w:t>RAM IC Tests</w:t>
@@ -1629,8 +1651,8 @@
         <w:jc w:val="start"/>
         <w:rPr/>
       </w:pPr>
-      <w:bookmarkStart w:id="8" w:name="__RefHeading___Toc810_1351480008"/>
-      <w:bookmarkEnd w:id="8"/>
+      <w:bookmarkStart w:id="9" w:name="__RefHeading___Toc810_1351480008"/>
+      <w:bookmarkEnd w:id="9"/>
       <w:r>
         <w:rPr/>
         <w:t>RAM Bank Test</w:t>
@@ -1668,8 +1690,8 @@
         </w:numPr>
         <w:rPr/>
       </w:pPr>
-      <w:bookmarkStart w:id="9" w:name="__RefHeading___Toc3936_33709793"/>
-      <w:bookmarkEnd w:id="9"/>
+      <w:bookmarkStart w:id="10" w:name="__RefHeading___Toc3936_33709793"/>
+      <w:bookmarkEnd w:id="10"/>
       <w:r>
         <w:rPr/>
         <w:t>Brief Explanation of RAM Functionality</w:t>
@@ -1757,8 +1779,8 @@
         <w:ind w:hanging="0" w:start="0"/>
         <w:rPr/>
       </w:pPr>
-      <w:bookmarkStart w:id="10" w:name="__RefHeading___Toc3938_33709793"/>
-      <w:bookmarkEnd w:id="10"/>
+      <w:bookmarkStart w:id="11" w:name="__RefHeading___Toc3938_33709793"/>
+      <w:bookmarkEnd w:id="11"/>
       <w:r>
         <w:rPr/>
         <w:t>RAM Failure Tones</w:t>
@@ -2329,8 +2351,8 @@
         <w:jc w:val="start"/>
         <w:rPr/>
       </w:pPr>
-      <w:bookmarkStart w:id="11" w:name="__RefHeading___Toc812_1351480008"/>
-      <w:bookmarkEnd w:id="11"/>
+      <w:bookmarkStart w:id="12" w:name="__RefHeading___Toc812_1351480008"/>
+      <w:bookmarkEnd w:id="12"/>
       <w:r>
         <w:rPr/>
         <w:t>TRS2 and TKG2 RAM Locations</w:t>
@@ -3408,8 +3430,8 @@
         <w:jc w:val="start"/>
         <w:rPr/>
       </w:pPr>
-      <w:bookmarkStart w:id="12" w:name="__RefHeading___Toc814_1351480008"/>
-      <w:bookmarkEnd w:id="12"/>
+      <w:bookmarkStart w:id="13" w:name="__RefHeading___Toc814_1351480008"/>
+      <w:bookmarkEnd w:id="13"/>
       <w:r>
         <w:rPr/>
         <w:t>TKG3 RAM Locations</w:t>
@@ -4492,8 +4514,8 @@
         <w:jc w:val="start"/>
         <w:rPr/>
       </w:pPr>
-      <w:bookmarkStart w:id="13" w:name="__RefHeading___Toc816_1351480008"/>
-      <w:bookmarkEnd w:id="13"/>
+      <w:bookmarkStart w:id="14" w:name="__RefHeading___Toc816_1351480008"/>
+      <w:bookmarkEnd w:id="14"/>
       <w:r>
         <w:rPr/>
         <w:t>TKG4 RAM Locations</w:t>
@@ -5560,8 +5582,8 @@
         <w:jc w:val="start"/>
         <w:rPr/>
       </w:pPr>
-      <w:bookmarkStart w:id="14" w:name="__RefHeading___Toc219_1351480008"/>
-      <w:bookmarkEnd w:id="14"/>
+      <w:bookmarkStart w:id="15" w:name="__RefHeading___Toc219_1351480008"/>
+      <w:bookmarkEnd w:id="15"/>
       <w:r>
         <w:rPr/>
         <w:t>ROM Checksums</w:t>
@@ -5591,8 +5613,8 @@
         <w:jc w:val="start"/>
         <w:rPr/>
       </w:pPr>
-      <w:bookmarkStart w:id="15" w:name="__RefHeading___Toc820_1351480008"/>
-      <w:bookmarkEnd w:id="15"/>
+      <w:bookmarkStart w:id="16" w:name="__RefHeading___Toc820_1351480008"/>
+      <w:bookmarkEnd w:id="16"/>
       <w:r>
         <w:rPr/>
         <w:t>Test ROM Integrity Test</w:t>
@@ -5672,8 +5694,8 @@
         <w:ind w:hanging="0" w:start="0"/>
         <w:rPr/>
       </w:pPr>
-      <w:bookmarkStart w:id="16" w:name="__RefHeading___Toc1548_1351480008"/>
-      <w:bookmarkEnd w:id="16"/>
+      <w:bookmarkStart w:id="17" w:name="__RefHeading___Toc1548_1351480008"/>
+      <w:bookmarkEnd w:id="17"/>
       <w:r>
         <w:rPr/>
         <w:t>ROM Locations</w:t>
@@ -6380,8 +6402,8 @@
         <w:jc w:val="start"/>
         <w:rPr/>
       </w:pPr>
-      <w:bookmarkStart w:id="17" w:name="__RefHeading___Toc822_1351480008"/>
-      <w:bookmarkEnd w:id="17"/>
+      <w:bookmarkStart w:id="18" w:name="__RefHeading___Toc822_1351480008"/>
+      <w:bookmarkEnd w:id="18"/>
       <w:r>
         <w:rPr/>
         <w:t>ROM Checksum Table</w:t>
@@ -7235,8 +7257,8 @@
         <w:jc w:val="start"/>
         <w:rPr/>
       </w:pPr>
-      <w:bookmarkStart w:id="18" w:name="__RefHeading___Toc221_1351480008"/>
-      <w:bookmarkEnd w:id="18"/>
+      <w:bookmarkStart w:id="19" w:name="__RefHeading___Toc221_1351480008"/>
+      <w:bookmarkEnd w:id="19"/>
       <w:r>
         <w:rPr/>
         <w:t>DMA Test</w:t>
@@ -7293,8 +7315,8 @@
         <w:jc w:val="start"/>
         <w:rPr/>
       </w:pPr>
-      <w:bookmarkStart w:id="19" w:name="__RefHeading___Toc223_1351480008"/>
-      <w:bookmarkEnd w:id="19"/>
+      <w:bookmarkStart w:id="20" w:name="__RefHeading___Toc223_1351480008"/>
+      <w:bookmarkEnd w:id="20"/>
       <w:r>
         <w:rPr/>
         <w:t>NMI Test</w:t>
@@ -7338,8 +7360,8 @@
         <w:jc w:val="start"/>
         <w:rPr/>
       </w:pPr>
-      <w:bookmarkStart w:id="20" w:name="__RefHeading___Toc225_1351480008"/>
-      <w:bookmarkEnd w:id="20"/>
+      <w:bookmarkStart w:id="21" w:name="__RefHeading___Toc225_1351480008"/>
+      <w:bookmarkEnd w:id="21"/>
       <w:r>
         <w:rPr/>
         <w:t>Audio Tests</w:t>
@@ -7429,8 +7451,8 @@
         <w:jc w:val="start"/>
         <w:rPr/>
       </w:pPr>
-      <w:bookmarkStart w:id="21" w:name="__RefHeading___Toc824_1351480008"/>
-      <w:bookmarkEnd w:id="21"/>
+      <w:bookmarkStart w:id="22" w:name="__RefHeading___Toc824_1351480008"/>
+      <w:bookmarkEnd w:id="22"/>
       <w:r>
         <w:rPr/>
         <w:t>Transition to Runtime</w:t>
@@ -7520,8 +7542,8 @@
         <w:jc w:val="start"/>
         <w:rPr/>
       </w:pPr>
-      <w:bookmarkStart w:id="22" w:name="__RefHeading___Toc231_1351480008"/>
-      <w:bookmarkEnd w:id="22"/>
+      <w:bookmarkStart w:id="23" w:name="__RefHeading___Toc231_1351480008"/>
+      <w:bookmarkEnd w:id="23"/>
       <w:r>
         <w:rPr/>
         <w:t>Chapter 3: Runtime Tests</w:t>
@@ -7539,8 +7561,8 @@
         <w:jc w:val="start"/>
         <w:rPr/>
       </w:pPr>
-      <w:bookmarkStart w:id="23" w:name="__RefHeading___Toc826_1351480008"/>
-      <w:bookmarkEnd w:id="23"/>
+      <w:bookmarkStart w:id="24" w:name="__RefHeading___Toc826_1351480008"/>
+      <w:bookmarkEnd w:id="24"/>
       <w:r>
         <w:rPr/>
         <w:t>Controls Test</w:t>
@@ -7629,8 +7651,8 @@
         <w:jc w:val="start"/>
         <w:rPr/>
       </w:pPr>
-      <w:bookmarkStart w:id="24" w:name="__RefHeading___Toc828_1351480008"/>
-      <w:bookmarkEnd w:id="24"/>
+      <w:bookmarkStart w:id="25" w:name="__RefHeading___Toc828_1351480008"/>
+      <w:bookmarkEnd w:id="25"/>
       <w:r>
         <w:rPr/>
         <w:t>DIP Switch Test</w:t>
@@ -7765,8 +7787,8 @@
         <w:jc w:val="start"/>
         <w:rPr/>
       </w:pPr>
-      <w:bookmarkStart w:id="25" w:name="__RefHeading___Toc830_1351480008"/>
-      <w:bookmarkEnd w:id="25"/>
+      <w:bookmarkStart w:id="26" w:name="__RefHeading___Toc830_1351480008"/>
+      <w:bookmarkEnd w:id="26"/>
       <w:r>
         <w:rPr/>
         <w:t>Palette Test</w:t>
@@ -7797,8 +7819,8 @@
         <w:jc w:val="start"/>
         <w:rPr/>
       </w:pPr>
-      <w:bookmarkStart w:id="26" w:name="__RefHeading___Toc832_1351480008"/>
-      <w:bookmarkEnd w:id="26"/>
+      <w:bookmarkStart w:id="27" w:name="__RefHeading___Toc832_1351480008"/>
+      <w:bookmarkEnd w:id="27"/>
       <w:r>
         <w:rPr/>
         <w:t>Screen Invert</w:t>
@@ -8111,8 +8133,8 @@
         <w:jc w:val="start"/>
         <w:rPr/>
       </w:pPr>
-      <w:bookmarkStart w:id="27" w:name="__RefHeading___Toc834_1351480008"/>
-      <w:bookmarkEnd w:id="27"/>
+      <w:bookmarkStart w:id="28" w:name="__RefHeading___Toc834_1351480008"/>
+      <w:bookmarkEnd w:id="28"/>
       <w:r>
         <w:rPr/>
         <w:t>Monitor Test</w:t>
@@ -8141,8 +8163,8 @@
         <w:ind w:hanging="0" w:start="0"/>
         <w:rPr/>
       </w:pPr>
-      <w:bookmarkStart w:id="28" w:name="__RefHeading___Toc1244_4272816106"/>
-      <w:bookmarkEnd w:id="28"/>
+      <w:bookmarkStart w:id="29" w:name="__RefHeading___Toc1244_4272816106"/>
+      <w:bookmarkEnd w:id="29"/>
       <w:r>
         <w:rPr/>
         <w:drawing>
@@ -8262,8 +8284,8 @@
         <w:ind w:hanging="0" w:start="0"/>
         <w:rPr/>
       </w:pPr>
-      <w:bookmarkStart w:id="29" w:name="__RefHeading___Toc1246_4272816106"/>
-      <w:bookmarkEnd w:id="29"/>
+      <w:bookmarkStart w:id="30" w:name="__RefHeading___Toc1246_4272816106"/>
+      <w:bookmarkEnd w:id="30"/>
       <w:r>
         <w:rPr/>
         <w:drawing>
@@ -8349,8 +8371,8 @@
       <w:r>
         <w:rPr/>
       </w:r>
-      <w:bookmarkStart w:id="30" w:name="__RefHeading___Toc1248_4272816106"/>
-      <w:bookmarkEnd w:id="30"/>
+      <w:bookmarkStart w:id="31" w:name="__RefHeading___Toc1248_4272816106"/>
+      <w:bookmarkEnd w:id="31"/>
     </w:p>
     <w:p>
       <w:pPr>
@@ -8362,8 +8384,8 @@
         <w:ind w:hanging="0" w:start="0"/>
         <w:rPr/>
       </w:pPr>
-      <w:bookmarkStart w:id="31" w:name="__RefHeading___Toc1250_4272816106"/>
-      <w:bookmarkEnd w:id="31"/>
+      <w:bookmarkStart w:id="32" w:name="__RefHeading___Toc1250_4272816106"/>
+      <w:bookmarkEnd w:id="32"/>
       <w:r>
         <w:rPr/>
         <w:t>Pattern 2 – Block</w:t>
@@ -9005,8 +9027,8 @@
         <w:jc w:val="start"/>
         <w:rPr/>
       </w:pPr>
-      <w:bookmarkStart w:id="32" w:name="__RefHeading___Toc836_1351480008"/>
-      <w:bookmarkEnd w:id="32"/>
+      <w:bookmarkStart w:id="33" w:name="__RefHeading___Toc836_1351480008"/>
+      <w:bookmarkEnd w:id="33"/>
       <w:r>
         <w:rPr/>
         <w:t>Sound Test</w:t>
@@ -9784,8 +9806,8 @@
         <w:jc w:val="start"/>
         <w:rPr/>
       </w:pPr>
-      <w:bookmarkStart w:id="33" w:name="__RefHeading___Toc838_1351480008"/>
-      <w:bookmarkEnd w:id="33"/>
+      <w:bookmarkStart w:id="34" w:name="__RefHeading___Toc838_1351480008"/>
+      <w:bookmarkEnd w:id="34"/>
       <w:r>
         <w:rPr/>
         <w:t>Music Test</w:t>
@@ -10608,8 +10630,8 @@
         <w:jc w:val="start"/>
         <w:rPr/>
       </w:pPr>
-      <w:bookmarkStart w:id="34" w:name="__RefHeading___Toc840_1351480008"/>
-      <w:bookmarkEnd w:id="34"/>
+      <w:bookmarkStart w:id="35" w:name="__RefHeading___Toc840_1351480008"/>
+      <w:bookmarkEnd w:id="35"/>
       <w:r>
         <w:rPr/>
         <w:drawing>
@@ -10734,8 +10756,8 @@
         <w:jc w:val="start"/>
         <w:rPr/>
       </w:pPr>
-      <w:bookmarkStart w:id="35" w:name="__RefHeading___Toc842_1351480008"/>
-      <w:bookmarkEnd w:id="35"/>
+      <w:bookmarkStart w:id="36" w:name="__RefHeading___Toc842_1351480008"/>
+      <w:bookmarkEnd w:id="36"/>
       <w:r>
         <w:rPr/>
         <w:drawing>
@@ -10832,8 +10854,8 @@
         <w:jc w:val="start"/>
         <w:rPr/>
       </w:pPr>
-      <w:bookmarkStart w:id="36" w:name="__RefHeading___Toc844_1351480008"/>
-      <w:bookmarkEnd w:id="36"/>
+      <w:bookmarkStart w:id="37" w:name="__RefHeading___Toc844_1351480008"/>
+      <w:bookmarkEnd w:id="37"/>
       <w:r>
         <w:rPr/>
         <w:t>Reset</w:t>
@@ -10886,8 +10908,8 @@
         <w:jc w:val="start"/>
         <w:rPr/>
       </w:pPr>
-      <w:bookmarkStart w:id="37" w:name="__RefHeading___Toc233_1351480008"/>
-      <w:bookmarkEnd w:id="37"/>
+      <w:bookmarkStart w:id="38" w:name="__RefHeading___Toc233_1351480008"/>
+      <w:bookmarkEnd w:id="38"/>
       <w:r>
         <w:rPr/>
         <w:t>Chapter 4: Test Architectures</w:t>
@@ -10924,8 +10946,8 @@
         <w:ind w:hanging="0" w:start="0"/>
         <w:rPr/>
       </w:pPr>
-      <w:bookmarkStart w:id="38" w:name="__RefHeading___Toc915_2335499624"/>
-      <w:bookmarkEnd w:id="38"/>
+      <w:bookmarkStart w:id="39" w:name="__RefHeading___Toc915_2335499624"/>
+      <w:bookmarkEnd w:id="39"/>
       <w:r>
         <w:rPr/>
         <w:t>Appendix A: Abbreviations</w:t>
@@ -11238,8 +11260,8 @@
         <w:ind w:hanging="0" w:start="0"/>
         <w:rPr/>
       </w:pPr>
-      <w:bookmarkStart w:id="39" w:name="__RefHeading___Toc915_2335499624_Copy_1"/>
-      <w:bookmarkEnd w:id="39"/>
+      <w:bookmarkStart w:id="40" w:name="__RefHeading___Toc915_2335499624_Copy_1"/>
+      <w:bookmarkEnd w:id="40"/>
       <w:r>
         <w:rPr/>
         <w:t>Appendix B: ICs mentioned</w:t>
@@ -11728,7 +11750,7 @@
       <w:tab/>
       <w:tab/>
     </w:r>
-    <w:bookmarkStart w:id="40" w:name="PageNumWizard_FOOTER_Default_Page_Style3"/>
+    <w:bookmarkStart w:id="41" w:name="PageNumWizard_FOOTER_Default_Page_Style3"/>
     <w:r>
       <w:rPr/>
       <w:fldChar w:fldCharType="begin"/>
@@ -11749,7 +11771,7 @@
       <w:rPr/>
       <w:fldChar w:fldCharType="end"/>
     </w:r>
-    <w:bookmarkEnd w:id="40"/>
+    <w:bookmarkEnd w:id="41"/>
   </w:p>
 </w:ftr>
 </file>

</xml_diff>